<commit_message>
updated documentation for sprint 4
</commit_message>
<xml_diff>
--- a/doc/Business Case.docx
+++ b/doc/Business Case.docx
@@ -2490,28 +2490,22 @@
     <w:p>
       <w:pPr>
         <w:ind w:left="360"/>
-        <w:rPr>
-          <w:color w:val="008000"/>
-        </w:rPr>
-      </w:pPr>
-      <w:r>
-        <w:rPr>
-          <w:color w:val="008000"/>
-        </w:rPr>
-        <w:t xml:space="preserve">This section should provide general information on the issues surrounding the business problem and the proposed project or initiative created to address it.  Usually, this section is completed last after all other sections of the business case have been written.  This is because the executive summary is exactly that, a summary of the detail that is provided in subsequent sections of the document. </w:t>
-      </w:r>
+      </w:pPr>
     </w:p>
     <w:p>
       <w:pPr>
         <w:ind w:left="360"/>
       </w:pPr>
-    </w:p>
-    <w:p>
-      <w:pPr>
-        <w:ind w:left="360"/>
-      </w:pPr>
-      <w:r>
-        <w:t>This business case outlines how the Web Platform (WP) Project will address current business concerns, the benefits of the project, and recommendations and justification of the project.  The business case also discusses detailed project goals, performance measures, assumptions, constraints, and alternative options.</w:t>
+      <w:r>
+        <w:t xml:space="preserve">This business case outlines how the Data Warehouse (DW) project will transfer real-time stock information from a Data Collection team to an </w:t>
+      </w:r>
+      <w:proofErr w:type="spellStart"/>
+      <w:r>
+        <w:t>XGBoost</w:t>
+      </w:r>
+      <w:proofErr w:type="spellEnd"/>
+      <w:r>
+        <w:t xml:space="preserve"> system, designed to predict future stock values. The business case also discusses project goals, performance statistics, assumptions, constraints, and alternative options.</w:t>
       </w:r>
     </w:p>
     <w:p>
@@ -2628,11 +2622,11 @@
         <w:ind w:left="810"/>
       </w:pPr>
       <w:r>
-        <w:t xml:space="preserve">Moving to a centralized web-based administrative platform will enable Smith Consulting to manage its employee payroll systems and administrative functions in a seamless and consolidated manner.  This technology migration will reduce overhead </w:t>
+        <w:t xml:space="preserve">Moving to a centralized web-based administrative platform will enable Smith Consulting to manage its employee payroll systems and administrative functions in a seamless and consolidated manner.  This technology migration will reduce overhead costs associated with the large workforce currently required to manage these tasks.  De-centralized employees will have more autonomy to manage their payroll elections, training, reporting, and various other administrative tasks.  The company will also benefit from more timely and accurate financial reporting as a result of our regional managers’ ability to enter and continuously update their financial metrics.  This real </w:t>
       </w:r>
       <w:r>
         <w:lastRenderedPageBreak/>
-        <w:t>costs associated with the large workforce currently required to manage these tasks.  De-centralized employees will have more autonomy to manage their payroll elections, training, reporting, and various other administrative tasks.  The company will also benefit from more timely and accurate financial reporting as a result of our regional managers’ ability to enter and continuously update their financial metrics.  This real time access reduces errors, improves cycle time, and is readily available to any authorized user.</w:t>
+        <w:t>time access reduces errors, improves cycle time, and is readily available to any authorized user.</w:t>
       </w:r>
     </w:p>
     <w:p>
@@ -2787,8 +2781,11 @@
         <w:ind w:left="810"/>
       </w:pPr>
       <w:r>
+        <w:t xml:space="preserve">The migration of payroll and other administrative functions from the legacy mainframe system to the web-based platform will result in greater efficiency with regards to company resources and business processes.  The WP Project is also aligned with corporate strategy and objectives since it uses technology to improve the way we do business.  While other alternatives and the status quo were analyzed, the WP Project was selected for proposal in this business case because it provides the best opportunity </w:t>
+      </w:r>
+      <w:r>
         <w:lastRenderedPageBreak/>
-        <w:t>The migration of payroll and other administrative functions from the legacy mainframe system to the web-based platform will result in greater efficiency with regards to company resources and business processes.  The WP Project is also aligned with corporate strategy and objectives since it uses technology to improve the way we do business.  While other alternatives and the status quo were analyzed, the WP Project was selected for proposal in this business case because it provides the best opportunity to realize benefits in an expedited manner while also allowing for the greatest improvement in efficiency and cost reduction.  Other alternatives assumed greater risk, provided less benefits, were too difficult to define, or were not suitably aligned with current corporate strategy and/or objectives.</w:t>
+        <w:t>to realize benefits in an expedited manner while also allowing for the greatest improvement in efficiency and cost reduction.  Other alternatives assumed greater risk, provided less benefits, were too difficult to define, or were not suitably aligned with current corporate strategy and/or objectives.</w:t>
       </w:r>
     </w:p>
     <w:p>
@@ -3257,19 +3254,7 @@
               <w:rPr>
                 <w:rFonts w:asciiTheme="minorHAnsi" w:hAnsiTheme="minorHAnsi"/>
               </w:rPr>
-              <w:t xml:space="preserve">Creates and completes project </w:t>
-            </w:r>
-            <w:r>
-              <w:rPr>
-                <w:rFonts w:asciiTheme="minorHAnsi" w:hAnsiTheme="minorHAnsi"/>
-              </w:rPr>
-              <w:t>requirements and</w:t>
-            </w:r>
-            <w:r>
-              <w:rPr>
-                <w:rFonts w:asciiTheme="minorHAnsi" w:hAnsiTheme="minorHAnsi"/>
-              </w:rPr>
-              <w:t xml:space="preserve"> fulfills the project features.</w:t>
+              <w:t>Creates and completes project requirements and fulfills the project features.</w:t>
             </w:r>
           </w:p>
         </w:tc>
@@ -3334,19 +3319,7 @@
               <w:rPr>
                 <w:rFonts w:asciiTheme="minorHAnsi" w:hAnsiTheme="minorHAnsi"/>
               </w:rPr>
-              <w:t xml:space="preserve">Creates and completes project </w:t>
-            </w:r>
-            <w:r>
-              <w:rPr>
-                <w:rFonts w:asciiTheme="minorHAnsi" w:hAnsiTheme="minorHAnsi"/>
-              </w:rPr>
-              <w:t>requirements and</w:t>
-            </w:r>
-            <w:r>
-              <w:rPr>
-                <w:rFonts w:asciiTheme="minorHAnsi" w:hAnsiTheme="minorHAnsi"/>
-              </w:rPr>
-              <w:t xml:space="preserve"> fulfills the project features.</w:t>
+              <w:t>Creates and completes project requirements and fulfills the project features.</w:t>
             </w:r>
           </w:p>
         </w:tc>
@@ -3440,7 +3413,6 @@
           <w:sz w:val="24"/>
           <w:szCs w:val="24"/>
         </w:rPr>
-        <w:lastRenderedPageBreak/>
         <w:t>Pro</w:t>
       </w:r>
       <w:bookmarkEnd w:id="6"/>
@@ -3478,7 +3450,11 @@
         <w:ind w:left="810"/>
       </w:pPr>
       <w:r>
-        <w:t>Since its inception, Smith Consulting has relied upon a mainframe system to manage payroll and other administrative employee functions.  As the number of employees grows, so does the burden placed upon headquarters to effectively manage the company’s administration at acceptable levels.  In the last two years Smith Consulting has hired 5 employees into overhead positions to help manage and run the day to day administration operations.  These positions provide little or no return on investment as they are not billable positions and only maintain the status quo; they do nothing to improve the management of the company’s administration.  Additionally, employees must currently call their regional managers to enter their work hours and raise any concerns regarding payroll and administrative tasks.  This places a large burden on managers who much balance these requirements with their day to day billable tasks.</w:t>
+        <w:t xml:space="preserve">Since its inception, Smith Consulting has relied upon a mainframe system to manage payroll and other administrative employee functions.  As the number of employees </w:t>
+      </w:r>
+      <w:r>
+        <w:lastRenderedPageBreak/>
+        <w:t>grows, so does the burden placed upon headquarters to effectively manage the company’s administration at acceptable levels.  In the last two years Smith Consulting has hired 5 employees into overhead positions to help manage and run the day to day administration operations.  These positions provide little or no return on investment as they are not billable positions and only maintain the status quo; they do nothing to improve the management of the company’s administration.  Additionally, employees must currently call their regional managers to enter their work hours and raise any concerns regarding payroll and administrative tasks.  This places a large burden on managers who much balance these requirements with their day to day billable tasks.</w:t>
       </w:r>
     </w:p>
     <w:p>
@@ -3572,23 +3548,20 @@
         <w:ind w:left="810"/>
       </w:pPr>
       <w:r>
-        <w:t xml:space="preserve">Roles and Responsibilities: in addition to the WP Project allowing greater autonomy to employees and less burden on managers, the manpower required to appropriately staff human resources and payroll departments will be reduced.  While we greatly </w:t>
-      </w:r>
+        <w:t>Roles and Responsibilities: in addition to the WP Project allowing greater autonomy to employees and less burden on managers, the manpower required to appropriately staff human resources and payroll departments will be reduced.  While we greatly value our employees, the reduction of non-billable overhead positions will directly reflect in our bottom line and provide an immediate return on our investment.  The new platform will be managed by the IT group and we do not anticipate any changes to IT staffing requirements.</w:t>
+      </w:r>
+    </w:p>
+    <w:p>
+      <w:pPr>
+        <w:ind w:left="810"/>
+      </w:pPr>
+    </w:p>
+    <w:p>
+      <w:pPr>
+        <w:ind w:left="810"/>
+      </w:pPr>
       <w:r>
         <w:lastRenderedPageBreak/>
-        <w:t>value our employees, the reduction of non-billable overhead positions will directly reflect in our bottom line and provide an immediate return on our investment.  The new platform will be managed by the IT group and we do not anticipate any changes to IT staffing requirements.</w:t>
-      </w:r>
-    </w:p>
-    <w:p>
-      <w:pPr>
-        <w:ind w:left="810"/>
-      </w:pPr>
-    </w:p>
-    <w:p>
-      <w:pPr>
-        <w:ind w:left="810"/>
-      </w:pPr>
-      <w:r>
         <w:t>Hardware/Software:  in addition to the software and licensing for the project, Smith Consulting will be required to purchase additional servers to accommodate the platform and its anticipated growth for the next 10 years.</w:t>
       </w:r>
     </w:p>
@@ -3756,29 +3729,26 @@
         <w:rPr>
           <w:color w:val="008000"/>
         </w:rPr>
-        <w:t xml:space="preserve">This section describes high-level information about the project to include a description, goals and objectives, performance criteria, assumptions, constraints, and milestones.  This section consolidates all project-specific information into one chapter and allows for an easy </w:t>
-      </w:r>
-      <w:r>
-        <w:rPr>
-          <w:color w:val="008000"/>
-        </w:rPr>
+        <w:t>This section describes high-level information about the project to include a description, goals and objectives, performance criteria, assumptions, constraints, and milestones.  This section consolidates all project-specific information into one chapter and allows for an easy understanding of the project since the baseline business problem, impacts, and recommendations have already been established.</w:t>
+      </w:r>
+    </w:p>
+    <w:p>
+      <w:pPr>
+        <w:rPr>
+          <w:color w:val="0033CC"/>
+        </w:rPr>
+      </w:pPr>
+    </w:p>
+    <w:p>
+      <w:pPr>
+        <w:ind w:left="360"/>
+      </w:pPr>
+      <w:r>
+        <w:t xml:space="preserve">The WP Project overview provides detail for how this project will address Smith Consulting’s business problem.  The overview consists of a project description, goals and objectives for the WP Project, project performance criteria, project assumptions, constraints, and major </w:t>
+      </w:r>
+      <w:r>
         <w:lastRenderedPageBreak/>
-        <w:t>understanding of the project since the baseline business problem, impacts, and recommendations have already been established.</w:t>
-      </w:r>
-    </w:p>
-    <w:p>
-      <w:pPr>
-        <w:rPr>
-          <w:color w:val="0033CC"/>
-        </w:rPr>
-      </w:pPr>
-    </w:p>
-    <w:p>
-      <w:pPr>
-        <w:ind w:left="360"/>
-      </w:pPr>
-      <w:r>
-        <w:t>The WP Project overview provides detail for how this project will address Smith Consulting’s business problem.  The overview consists of a project description, goals and objectives for the WP Project, project performance criteria, project assumptions, constraints, and major milestones.  As the project is approved and moves forward, each of these components will be expanded to include a greater level of detail in working toward the project plan.</w:t>
+        <w:t>milestones.  As the project is approved and moves forward, each of these components will be expanded to include a greater level of detail in working toward the project plan.</w:t>
       </w:r>
     </w:p>
     <w:p>
@@ -4107,6 +4077,7 @@
               <w:rPr>
                 <w:rFonts w:asciiTheme="minorHAnsi" w:hAnsiTheme="minorHAnsi"/>
               </w:rPr>
+              <w:lastRenderedPageBreak/>
               <w:t>Improve staff efficiency</w:t>
             </w:r>
           </w:p>
@@ -4653,7 +4624,6 @@
         <w:ind w:left="1080" w:hanging="270"/>
       </w:pPr>
       <w:r>
-        <w:lastRenderedPageBreak/>
         <w:t>All staff and employees will be trained accordingly in their respective data entry, timesheet, and reporting tasks on the new web-based system</w:t>
       </w:r>
     </w:p>
@@ -4678,6 +4648,7 @@
         <w:ind w:left="1080" w:hanging="270"/>
       </w:pPr>
       <w:r>
+        <w:lastRenderedPageBreak/>
         <w:t>Funding is available for purchasing hardware/software for web-based system</w:t>
       </w:r>
     </w:p>
@@ -4943,7 +4914,6 @@
                 <w:bCs/>
                 <w:sz w:val="16"/>
               </w:rPr>
-              <w:lastRenderedPageBreak/>
               <w:t xml:space="preserve">Milestones/Deliverables  </w:t>
             </w:r>
           </w:p>
@@ -5086,6 +5056,7 @@
               <w:rPr>
                 <w:rFonts w:asciiTheme="minorHAnsi" w:hAnsiTheme="minorHAnsi"/>
               </w:rPr>
+              <w:lastRenderedPageBreak/>
               <w:t>Project Kickoff</w:t>
             </w:r>
           </w:p>
@@ -5797,14 +5768,14 @@
         <w:rPr>
           <w:color w:val="008000"/>
         </w:rPr>
-        <w:t xml:space="preserve">Many consider this one of the most important parts of a business case as it is often the costs or savings a project yields which win final approval to go forward.  It is important to </w:t>
+        <w:t xml:space="preserve">Many consider this one of the most important parts of a business case as it is often the costs or savings a project yields which win final approval to go forward.  It is important to quantify the financial benefits of the project as much as possible in the business case.  This is usually done in the form of a cost benefit analysis.  The purpose of this is to illustrate the </w:t>
       </w:r>
       <w:r>
         <w:rPr>
           <w:color w:val="008000"/>
         </w:rPr>
         <w:lastRenderedPageBreak/>
-        <w:t>quantify the financial benefits of the project as much as possible in the business case.  This is usually done in the form of a cost benefit analysis.  The purpose of this is to illustrate the costs of the project and compare them with the benefits and savings to determine if the project is worth pursuing.</w:t>
+        <w:t>costs of the project and compare them with the benefits and savings to determine if the project is worth pursuing.</w:t>
       </w:r>
     </w:p>
     <w:p>

</xml_diff>

<commit_message>
Update business case and add vision document
</commit_message>
<xml_diff>
--- a/doc/Business Case.docx
+++ b/doc/Business Case.docx
@@ -11,131 +11,6 @@
           <w:smallCaps/>
         </w:rPr>
       </w:pPr>
-    </w:p>
-    <w:p>
-      <w:pPr>
-        <w:jc w:val="center"/>
-        <w:rPr>
-          <w:rFonts w:eastAsia="Times New Roman" w:cs="Times New Roman"/>
-          <w:b/>
-          <w:smallCaps/>
-          <w:sz w:val="36"/>
-          <w:szCs w:val="36"/>
-        </w:rPr>
-      </w:pPr>
-      <w:r>
-        <w:rPr>
-          <w:rFonts w:eastAsia="Times New Roman" w:cs="Times New Roman"/>
-          <w:b/>
-          <w:smallCaps/>
-          <w:sz w:val="36"/>
-          <w:szCs w:val="36"/>
-        </w:rPr>
-        <w:t>Business Case</w:t>
-      </w:r>
-      <w:r>
-        <w:rPr>
-          <w:rFonts w:eastAsia="Times New Roman" w:cs="Times New Roman"/>
-          <w:b/>
-          <w:smallCaps/>
-          <w:sz w:val="36"/>
-          <w:szCs w:val="36"/>
-        </w:rPr>
-        <w:t xml:space="preserve"> Template</w:t>
-      </w:r>
-    </w:p>
-    <w:p>
-      <w:pPr>
-        <w:jc w:val="center"/>
-        <w:rPr>
-          <w:rFonts w:eastAsia="Times New Roman" w:cs="Times New Roman"/>
-        </w:rPr>
-      </w:pPr>
-      <w:r>
-        <w:rPr>
-          <w:rFonts w:eastAsia="Times New Roman" w:cs="Times New Roman"/>
-        </w:rPr>
-        <w:t xml:space="preserve">This </w:t>
-      </w:r>
-      <w:r>
-        <w:rPr>
-          <w:rFonts w:eastAsia="Times New Roman" w:cs="Times New Roman"/>
-        </w:rPr>
-        <w:t>Business Case</w:t>
-      </w:r>
-      <w:r>
-        <w:rPr>
-          <w:rFonts w:eastAsia="Times New Roman" w:cs="Times New Roman"/>
-        </w:rPr>
-        <w:t xml:space="preserve"> Template is free for you to copy and use on your project </w:t>
-      </w:r>
-    </w:p>
-    <w:p>
-      <w:pPr>
-        <w:jc w:val="center"/>
-        <w:rPr>
-          <w:rFonts w:eastAsia="Times New Roman" w:cs="Times New Roman"/>
-        </w:rPr>
-      </w:pPr>
-      <w:r>
-        <w:rPr>
-          <w:rFonts w:eastAsia="Times New Roman" w:cs="Times New Roman"/>
-        </w:rPr>
-        <w:t>and within your organization. We hope that you find this template useful and</w:t>
-      </w:r>
-    </w:p>
-    <w:p>
-      <w:pPr>
-        <w:jc w:val="center"/>
-        <w:rPr>
-          <w:rFonts w:eastAsia="Times New Roman" w:cs="Times New Roman"/>
-        </w:rPr>
-      </w:pPr>
-      <w:proofErr w:type="gramStart"/>
-      <w:r>
-        <w:rPr>
-          <w:rFonts w:eastAsia="Times New Roman" w:cs="Times New Roman"/>
-        </w:rPr>
-        <w:t>welcome</w:t>
-      </w:r>
-      <w:proofErr w:type="gramEnd"/>
-      <w:r>
-        <w:rPr>
-          <w:rFonts w:eastAsia="Times New Roman" w:cs="Times New Roman"/>
-        </w:rPr>
-        <w:t xml:space="preserve"> your comments. Public distribution of this document is only permitted</w:t>
-      </w:r>
-    </w:p>
-    <w:p>
-      <w:pPr>
-        <w:jc w:val="center"/>
-        <w:rPr>
-          <w:rFonts w:eastAsia="Times New Roman" w:cs="Times New Roman"/>
-        </w:rPr>
-      </w:pPr>
-      <w:r>
-        <w:rPr>
-          <w:rFonts w:eastAsia="Times New Roman" w:cs="Times New Roman"/>
-        </w:rPr>
-        <w:t>from the Project Management Docs official website at:</w:t>
-      </w:r>
-    </w:p>
-    <w:p>
-      <w:pPr>
-        <w:jc w:val="center"/>
-        <w:rPr>
-          <w:rFonts w:eastAsia="Times New Roman" w:cs="Times New Roman"/>
-        </w:rPr>
-      </w:pPr>
-      <w:hyperlink r:id="rId7" w:history="1">
-        <w:r>
-          <w:rPr>
-            <w:rStyle w:val="Hyperlink"/>
-            <w:rFonts w:eastAsia="Times New Roman" w:cs="Times New Roman"/>
-          </w:rPr>
-          <w:t>ProjectManagementDocs.com</w:t>
-        </w:r>
-      </w:hyperlink>
     </w:p>
     <w:p>
       <w:pPr>
@@ -341,15 +216,16 @@
       <w:pPr>
         <w:pStyle w:val="TOC1"/>
         <w:tabs>
-          <w:tab w:val="left" w:pos="660"/>
+          <w:tab w:val="left" w:pos="480"/>
           <w:tab w:val="right" w:leader="dot" w:pos="9350"/>
         </w:tabs>
         <w:rPr>
-          <w:rFonts w:asciiTheme="minorHAnsi" w:eastAsia="SimSun" w:hAnsiTheme="minorHAnsi"/>
+          <w:rFonts w:asciiTheme="minorHAnsi" w:eastAsiaTheme="minorEastAsia" w:hAnsiTheme="minorHAnsi" w:cstheme="minorBidi"/>
           <w:noProof/>
-          <w:sz w:val="22"/>
-          <w:szCs w:val="22"/>
-          <w:lang w:eastAsia="zh-CN"/>
+          <w:kern w:val="2"/>
+          <w:szCs w:val="24"/>
+          <w:lang w:val="en-CA" w:eastAsia="en-CA"/>
+          <w14:ligatures w14:val="standardContextual"/>
         </w:rPr>
       </w:pPr>
       <w:r>
@@ -370,11 +246,10 @@
         </w:rPr>
         <w:fldChar w:fldCharType="separate"/>
       </w:r>
-      <w:hyperlink w:anchor="_Toc332112078" w:history="1">
+      <w:hyperlink w:anchor="_Toc224909757" w:history="1">
         <w:r>
           <w:rPr>
             <w:rStyle w:val="Hyperlink"/>
-            <w:rFonts w:asciiTheme="minorHAnsi" w:hAnsiTheme="minorHAnsi"/>
             <w:smallCaps/>
             <w:noProof/>
           </w:rPr>
@@ -382,18 +257,18 @@
         </w:r>
         <w:r>
           <w:rPr>
-            <w:rFonts w:asciiTheme="minorHAnsi" w:eastAsia="SimSun" w:hAnsiTheme="minorHAnsi"/>
-            <w:noProof/>
-            <w:sz w:val="22"/>
-            <w:szCs w:val="22"/>
-            <w:lang w:eastAsia="zh-CN"/>
+            <w:rFonts w:asciiTheme="minorHAnsi" w:eastAsiaTheme="minorEastAsia" w:hAnsiTheme="minorHAnsi" w:cstheme="minorBidi"/>
+            <w:noProof/>
+            <w:kern w:val="2"/>
+            <w:szCs w:val="24"/>
+            <w:lang w:val="en-CA" w:eastAsia="en-CA"/>
+            <w14:ligatures w14:val="standardContextual"/>
           </w:rPr>
           <w:tab/>
         </w:r>
         <w:r>
           <w:rPr>
             <w:rStyle w:val="Hyperlink"/>
-            <w:rFonts w:asciiTheme="minorHAnsi" w:hAnsiTheme="minorHAnsi"/>
             <w:smallCaps/>
             <w:noProof/>
           </w:rPr>
@@ -401,7 +276,6 @@
         </w:r>
         <w:r>
           <w:rPr>
-            <w:rFonts w:asciiTheme="minorHAnsi" w:hAnsiTheme="minorHAnsi"/>
             <w:noProof/>
             <w:webHidden/>
           </w:rPr>
@@ -409,7 +283,6 @@
         </w:r>
         <w:r>
           <w:rPr>
-            <w:rFonts w:asciiTheme="minorHAnsi" w:hAnsiTheme="minorHAnsi"/>
             <w:noProof/>
             <w:webHidden/>
           </w:rPr>
@@ -417,22 +290,19 @@
         </w:r>
         <w:r>
           <w:rPr>
-            <w:rFonts w:asciiTheme="minorHAnsi" w:hAnsiTheme="minorHAnsi"/>
-            <w:noProof/>
-            <w:webHidden/>
-          </w:rPr>
-          <w:instrText xml:space="preserve"> PAGEREF _Toc332112078 \h </w:instrText>
-        </w:r>
-        <w:r>
-          <w:rPr>
-            <w:rFonts w:asciiTheme="minorHAnsi" w:hAnsiTheme="minorHAnsi"/>
-            <w:noProof/>
-            <w:webHidden/>
-          </w:rPr>
-        </w:r>
-        <w:r>
-          <w:rPr>
-            <w:rFonts w:asciiTheme="minorHAnsi" w:hAnsiTheme="minorHAnsi"/>
+            <w:noProof/>
+            <w:webHidden/>
+          </w:rPr>
+          <w:instrText xml:space="preserve"> PAGEREF _Toc224909757 \h </w:instrText>
+        </w:r>
+        <w:r>
+          <w:rPr>
+            <w:noProof/>
+            <w:webHidden/>
+          </w:rPr>
+        </w:r>
+        <w:r>
+          <w:rPr>
             <w:noProof/>
             <w:webHidden/>
           </w:rPr>
@@ -440,7 +310,6 @@
         </w:r>
         <w:r>
           <w:rPr>
-            <w:rFonts w:asciiTheme="minorHAnsi" w:hAnsiTheme="minorHAnsi"/>
             <w:noProof/>
             <w:webHidden/>
           </w:rPr>
@@ -448,7 +317,6 @@
         </w:r>
         <w:r>
           <w:rPr>
-            <w:rFonts w:asciiTheme="minorHAnsi" w:hAnsiTheme="minorHAnsi"/>
             <w:noProof/>
             <w:webHidden/>
           </w:rPr>
@@ -460,47 +328,48 @@
       <w:pPr>
         <w:pStyle w:val="TOC2"/>
         <w:tabs>
-          <w:tab w:val="left" w:pos="880"/>
+          <w:tab w:val="left" w:pos="960"/>
           <w:tab w:val="right" w:leader="dot" w:pos="9350"/>
         </w:tabs>
         <w:rPr>
-          <w:rFonts w:asciiTheme="minorHAnsi" w:eastAsia="SimSun" w:hAnsiTheme="minorHAnsi"/>
+          <w:rFonts w:asciiTheme="minorHAnsi" w:eastAsiaTheme="minorEastAsia" w:hAnsiTheme="minorHAnsi" w:cstheme="minorBidi"/>
           <w:noProof/>
-          <w:sz w:val="22"/>
-          <w:szCs w:val="22"/>
-          <w:lang w:eastAsia="zh-CN"/>
-        </w:rPr>
-      </w:pPr>
-      <w:hyperlink w:anchor="_Toc332112079" w:history="1">
+          <w:kern w:val="2"/>
+          <w:sz w:val="24"/>
+          <w:szCs w:val="24"/>
+          <w:lang w:val="en-CA" w:eastAsia="en-CA"/>
+          <w14:ligatures w14:val="standardContextual"/>
+        </w:rPr>
+      </w:pPr>
+      <w:hyperlink w:anchor="_Toc224909758" w:history="1">
         <w:r>
           <w:rPr>
             <w:rStyle w:val="Hyperlink"/>
-            <w:rFonts w:asciiTheme="minorHAnsi" w:hAnsiTheme="minorHAnsi"/>
             <w:noProof/>
           </w:rPr>
           <w:t>1.1.</w:t>
         </w:r>
         <w:r>
           <w:rPr>
-            <w:rFonts w:asciiTheme="minorHAnsi" w:eastAsia="SimSun" w:hAnsiTheme="minorHAnsi"/>
-            <w:noProof/>
-            <w:sz w:val="22"/>
-            <w:szCs w:val="22"/>
-            <w:lang w:eastAsia="zh-CN"/>
+            <w:rFonts w:asciiTheme="minorHAnsi" w:eastAsiaTheme="minorEastAsia" w:hAnsiTheme="minorHAnsi" w:cstheme="minorBidi"/>
+            <w:noProof/>
+            <w:kern w:val="2"/>
+            <w:sz w:val="24"/>
+            <w:szCs w:val="24"/>
+            <w:lang w:val="en-CA" w:eastAsia="en-CA"/>
+            <w14:ligatures w14:val="standardContextual"/>
           </w:rPr>
           <w:tab/>
         </w:r>
         <w:r>
           <w:rPr>
             <w:rStyle w:val="Hyperlink"/>
-            <w:rFonts w:asciiTheme="minorHAnsi" w:hAnsiTheme="minorHAnsi"/>
             <w:noProof/>
           </w:rPr>
           <w:t>Issue</w:t>
         </w:r>
         <w:r>
           <w:rPr>
-            <w:rFonts w:asciiTheme="minorHAnsi" w:hAnsiTheme="minorHAnsi"/>
             <w:noProof/>
             <w:webHidden/>
           </w:rPr>
@@ -508,7 +377,6 @@
         </w:r>
         <w:r>
           <w:rPr>
-            <w:rFonts w:asciiTheme="minorHAnsi" w:hAnsiTheme="minorHAnsi"/>
             <w:noProof/>
             <w:webHidden/>
           </w:rPr>
@@ -516,22 +384,19 @@
         </w:r>
         <w:r>
           <w:rPr>
-            <w:rFonts w:asciiTheme="minorHAnsi" w:hAnsiTheme="minorHAnsi"/>
-            <w:noProof/>
-            <w:webHidden/>
-          </w:rPr>
-          <w:instrText xml:space="preserve"> PAGEREF _Toc332112079 \h </w:instrText>
-        </w:r>
-        <w:r>
-          <w:rPr>
-            <w:rFonts w:asciiTheme="minorHAnsi" w:hAnsiTheme="minorHAnsi"/>
-            <w:noProof/>
-            <w:webHidden/>
-          </w:rPr>
-        </w:r>
-        <w:r>
-          <w:rPr>
-            <w:rFonts w:asciiTheme="minorHAnsi" w:hAnsiTheme="minorHAnsi"/>
+            <w:noProof/>
+            <w:webHidden/>
+          </w:rPr>
+          <w:instrText xml:space="preserve"> PAGEREF _Toc224909758 \h </w:instrText>
+        </w:r>
+        <w:r>
+          <w:rPr>
+            <w:noProof/>
+            <w:webHidden/>
+          </w:rPr>
+        </w:r>
+        <w:r>
+          <w:rPr>
             <w:noProof/>
             <w:webHidden/>
           </w:rPr>
@@ -539,7 +404,6 @@
         </w:r>
         <w:r>
           <w:rPr>
-            <w:rFonts w:asciiTheme="minorHAnsi" w:hAnsiTheme="minorHAnsi"/>
             <w:noProof/>
             <w:webHidden/>
           </w:rPr>
@@ -547,7 +411,6 @@
         </w:r>
         <w:r>
           <w:rPr>
-            <w:rFonts w:asciiTheme="minorHAnsi" w:hAnsiTheme="minorHAnsi"/>
             <w:noProof/>
             <w:webHidden/>
           </w:rPr>
@@ -559,47 +422,48 @@
       <w:pPr>
         <w:pStyle w:val="TOC2"/>
         <w:tabs>
-          <w:tab w:val="left" w:pos="880"/>
+          <w:tab w:val="left" w:pos="960"/>
           <w:tab w:val="right" w:leader="dot" w:pos="9350"/>
         </w:tabs>
         <w:rPr>
-          <w:rFonts w:asciiTheme="minorHAnsi" w:eastAsia="SimSun" w:hAnsiTheme="minorHAnsi"/>
+          <w:rFonts w:asciiTheme="minorHAnsi" w:eastAsiaTheme="minorEastAsia" w:hAnsiTheme="minorHAnsi" w:cstheme="minorBidi"/>
           <w:noProof/>
-          <w:sz w:val="22"/>
-          <w:szCs w:val="22"/>
-          <w:lang w:eastAsia="zh-CN"/>
-        </w:rPr>
-      </w:pPr>
-      <w:hyperlink w:anchor="_Toc332112080" w:history="1">
+          <w:kern w:val="2"/>
+          <w:sz w:val="24"/>
+          <w:szCs w:val="24"/>
+          <w:lang w:val="en-CA" w:eastAsia="en-CA"/>
+          <w14:ligatures w14:val="standardContextual"/>
+        </w:rPr>
+      </w:pPr>
+      <w:hyperlink w:anchor="_Toc224909759" w:history="1">
         <w:r>
           <w:rPr>
             <w:rStyle w:val="Hyperlink"/>
-            <w:rFonts w:asciiTheme="minorHAnsi" w:hAnsiTheme="minorHAnsi"/>
             <w:noProof/>
           </w:rPr>
           <w:t>1.2.</w:t>
         </w:r>
         <w:r>
           <w:rPr>
-            <w:rFonts w:asciiTheme="minorHAnsi" w:eastAsia="SimSun" w:hAnsiTheme="minorHAnsi"/>
-            <w:noProof/>
-            <w:sz w:val="22"/>
-            <w:szCs w:val="22"/>
-            <w:lang w:eastAsia="zh-CN"/>
+            <w:rFonts w:asciiTheme="minorHAnsi" w:eastAsiaTheme="minorEastAsia" w:hAnsiTheme="minorHAnsi" w:cstheme="minorBidi"/>
+            <w:noProof/>
+            <w:kern w:val="2"/>
+            <w:sz w:val="24"/>
+            <w:szCs w:val="24"/>
+            <w:lang w:val="en-CA" w:eastAsia="en-CA"/>
+            <w14:ligatures w14:val="standardContextual"/>
           </w:rPr>
           <w:tab/>
         </w:r>
         <w:r>
           <w:rPr>
             <w:rStyle w:val="Hyperlink"/>
-            <w:rFonts w:asciiTheme="minorHAnsi" w:hAnsiTheme="minorHAnsi"/>
             <w:noProof/>
           </w:rPr>
           <w:t>Anticipated Outcomes</w:t>
         </w:r>
         <w:r>
           <w:rPr>
-            <w:rFonts w:asciiTheme="minorHAnsi" w:hAnsiTheme="minorHAnsi"/>
             <w:noProof/>
             <w:webHidden/>
           </w:rPr>
@@ -607,7 +471,6 @@
         </w:r>
         <w:r>
           <w:rPr>
-            <w:rFonts w:asciiTheme="minorHAnsi" w:hAnsiTheme="minorHAnsi"/>
             <w:noProof/>
             <w:webHidden/>
           </w:rPr>
@@ -615,22 +478,19 @@
         </w:r>
         <w:r>
           <w:rPr>
-            <w:rFonts w:asciiTheme="minorHAnsi" w:hAnsiTheme="minorHAnsi"/>
-            <w:noProof/>
-            <w:webHidden/>
-          </w:rPr>
-          <w:instrText xml:space="preserve"> PAGEREF _Toc332112080 \h </w:instrText>
-        </w:r>
-        <w:r>
-          <w:rPr>
-            <w:rFonts w:asciiTheme="minorHAnsi" w:hAnsiTheme="minorHAnsi"/>
-            <w:noProof/>
-            <w:webHidden/>
-          </w:rPr>
-        </w:r>
-        <w:r>
-          <w:rPr>
-            <w:rFonts w:asciiTheme="minorHAnsi" w:hAnsiTheme="minorHAnsi"/>
+            <w:noProof/>
+            <w:webHidden/>
+          </w:rPr>
+          <w:instrText xml:space="preserve"> PAGEREF _Toc224909759 \h </w:instrText>
+        </w:r>
+        <w:r>
+          <w:rPr>
+            <w:noProof/>
+            <w:webHidden/>
+          </w:rPr>
+        </w:r>
+        <w:r>
+          <w:rPr>
             <w:noProof/>
             <w:webHidden/>
           </w:rPr>
@@ -638,7 +498,6 @@
         </w:r>
         <w:r>
           <w:rPr>
-            <w:rFonts w:asciiTheme="minorHAnsi" w:hAnsiTheme="minorHAnsi"/>
             <w:noProof/>
             <w:webHidden/>
           </w:rPr>
@@ -646,7 +505,6 @@
         </w:r>
         <w:r>
           <w:rPr>
-            <w:rFonts w:asciiTheme="minorHAnsi" w:hAnsiTheme="minorHAnsi"/>
             <w:noProof/>
             <w:webHidden/>
           </w:rPr>
@@ -658,47 +516,48 @@
       <w:pPr>
         <w:pStyle w:val="TOC2"/>
         <w:tabs>
-          <w:tab w:val="left" w:pos="880"/>
+          <w:tab w:val="left" w:pos="960"/>
           <w:tab w:val="right" w:leader="dot" w:pos="9350"/>
         </w:tabs>
         <w:rPr>
-          <w:rFonts w:asciiTheme="minorHAnsi" w:eastAsia="SimSun" w:hAnsiTheme="minorHAnsi"/>
+          <w:rFonts w:asciiTheme="minorHAnsi" w:eastAsiaTheme="minorEastAsia" w:hAnsiTheme="minorHAnsi" w:cstheme="minorBidi"/>
           <w:noProof/>
-          <w:sz w:val="22"/>
-          <w:szCs w:val="22"/>
-          <w:lang w:eastAsia="zh-CN"/>
-        </w:rPr>
-      </w:pPr>
-      <w:hyperlink w:anchor="_Toc332112081" w:history="1">
+          <w:kern w:val="2"/>
+          <w:sz w:val="24"/>
+          <w:szCs w:val="24"/>
+          <w:lang w:val="en-CA" w:eastAsia="en-CA"/>
+          <w14:ligatures w14:val="standardContextual"/>
+        </w:rPr>
+      </w:pPr>
+      <w:hyperlink w:anchor="_Toc224909760" w:history="1">
         <w:r>
           <w:rPr>
             <w:rStyle w:val="Hyperlink"/>
-            <w:rFonts w:asciiTheme="minorHAnsi" w:hAnsiTheme="minorHAnsi"/>
             <w:noProof/>
           </w:rPr>
           <w:t>1.3.</w:t>
         </w:r>
         <w:r>
           <w:rPr>
-            <w:rFonts w:asciiTheme="minorHAnsi" w:eastAsia="SimSun" w:hAnsiTheme="minorHAnsi"/>
-            <w:noProof/>
-            <w:sz w:val="22"/>
-            <w:szCs w:val="22"/>
-            <w:lang w:eastAsia="zh-CN"/>
+            <w:rFonts w:asciiTheme="minorHAnsi" w:eastAsiaTheme="minorEastAsia" w:hAnsiTheme="minorHAnsi" w:cstheme="minorBidi"/>
+            <w:noProof/>
+            <w:kern w:val="2"/>
+            <w:sz w:val="24"/>
+            <w:szCs w:val="24"/>
+            <w:lang w:val="en-CA" w:eastAsia="en-CA"/>
+            <w14:ligatures w14:val="standardContextual"/>
           </w:rPr>
           <w:tab/>
         </w:r>
         <w:r>
           <w:rPr>
             <w:rStyle w:val="Hyperlink"/>
-            <w:rFonts w:asciiTheme="minorHAnsi" w:hAnsiTheme="minorHAnsi"/>
-            <w:noProof/>
-          </w:rPr>
-          <w:t>Recommendation</w:t>
-        </w:r>
-        <w:r>
-          <w:rPr>
-            <w:rFonts w:asciiTheme="minorHAnsi" w:hAnsiTheme="minorHAnsi"/>
+            <w:noProof/>
+          </w:rPr>
+          <w:t>Justification</w:t>
+        </w:r>
+        <w:r>
+          <w:rPr>
             <w:noProof/>
             <w:webHidden/>
           </w:rPr>
@@ -706,7 +565,6 @@
         </w:r>
         <w:r>
           <w:rPr>
-            <w:rFonts w:asciiTheme="minorHAnsi" w:hAnsiTheme="minorHAnsi"/>
             <w:noProof/>
             <w:webHidden/>
           </w:rPr>
@@ -714,22 +572,19 @@
         </w:r>
         <w:r>
           <w:rPr>
-            <w:rFonts w:asciiTheme="minorHAnsi" w:hAnsiTheme="minorHAnsi"/>
-            <w:noProof/>
-            <w:webHidden/>
-          </w:rPr>
-          <w:instrText xml:space="preserve"> PAGEREF _Toc332112081 \h </w:instrText>
-        </w:r>
-        <w:r>
-          <w:rPr>
-            <w:rFonts w:asciiTheme="minorHAnsi" w:hAnsiTheme="minorHAnsi"/>
-            <w:noProof/>
-            <w:webHidden/>
-          </w:rPr>
-        </w:r>
-        <w:r>
-          <w:rPr>
-            <w:rFonts w:asciiTheme="minorHAnsi" w:hAnsiTheme="minorHAnsi"/>
+            <w:noProof/>
+            <w:webHidden/>
+          </w:rPr>
+          <w:instrText xml:space="preserve"> PAGEREF _Toc224909760 \h </w:instrText>
+        </w:r>
+        <w:r>
+          <w:rPr>
+            <w:noProof/>
+            <w:webHidden/>
+          </w:rPr>
+        </w:r>
+        <w:r>
+          <w:rPr>
             <w:noProof/>
             <w:webHidden/>
           </w:rPr>
@@ -737,7 +592,194 @@
         </w:r>
         <w:r>
           <w:rPr>
-            <w:rFonts w:asciiTheme="minorHAnsi" w:hAnsiTheme="minorHAnsi"/>
+            <w:noProof/>
+            <w:webHidden/>
+          </w:rPr>
+          <w:t>3</w:t>
+        </w:r>
+        <w:r>
+          <w:rPr>
+            <w:noProof/>
+            <w:webHidden/>
+          </w:rPr>
+          <w:fldChar w:fldCharType="end"/>
+        </w:r>
+      </w:hyperlink>
+    </w:p>
+    <w:p>
+      <w:pPr>
+        <w:pStyle w:val="TOC1"/>
+        <w:tabs>
+          <w:tab w:val="left" w:pos="480"/>
+          <w:tab w:val="right" w:leader="dot" w:pos="9350"/>
+        </w:tabs>
+        <w:rPr>
+          <w:rFonts w:asciiTheme="minorHAnsi" w:eastAsiaTheme="minorEastAsia" w:hAnsiTheme="minorHAnsi" w:cstheme="minorBidi"/>
+          <w:noProof/>
+          <w:kern w:val="2"/>
+          <w:szCs w:val="24"/>
+          <w:lang w:val="en-CA" w:eastAsia="en-CA"/>
+          <w14:ligatures w14:val="standardContextual"/>
+        </w:rPr>
+      </w:pPr>
+      <w:hyperlink w:anchor="_Toc224909761" w:history="1">
+        <w:r>
+          <w:rPr>
+            <w:rStyle w:val="Hyperlink"/>
+            <w:smallCaps/>
+            <w:noProof/>
+          </w:rPr>
+          <w:t>2.</w:t>
+        </w:r>
+        <w:r>
+          <w:rPr>
+            <w:rFonts w:asciiTheme="minorHAnsi" w:eastAsiaTheme="minorEastAsia" w:hAnsiTheme="minorHAnsi" w:cstheme="minorBidi"/>
+            <w:noProof/>
+            <w:kern w:val="2"/>
+            <w:szCs w:val="24"/>
+            <w:lang w:val="en-CA" w:eastAsia="en-CA"/>
+            <w14:ligatures w14:val="standardContextual"/>
+          </w:rPr>
+          <w:tab/>
+        </w:r>
+        <w:r>
+          <w:rPr>
+            <w:rStyle w:val="Hyperlink"/>
+            <w:smallCaps/>
+            <w:noProof/>
+          </w:rPr>
+          <w:t>Business Case Analysis Team</w:t>
+        </w:r>
+        <w:r>
+          <w:rPr>
+            <w:noProof/>
+            <w:webHidden/>
+          </w:rPr>
+          <w:tab/>
+        </w:r>
+        <w:r>
+          <w:rPr>
+            <w:noProof/>
+            <w:webHidden/>
+          </w:rPr>
+          <w:fldChar w:fldCharType="begin"/>
+        </w:r>
+        <w:r>
+          <w:rPr>
+            <w:noProof/>
+            <w:webHidden/>
+          </w:rPr>
+          <w:instrText xml:space="preserve"> PAGEREF _Toc224909761 \h </w:instrText>
+        </w:r>
+        <w:r>
+          <w:rPr>
+            <w:noProof/>
+            <w:webHidden/>
+          </w:rPr>
+        </w:r>
+        <w:r>
+          <w:rPr>
+            <w:noProof/>
+            <w:webHidden/>
+          </w:rPr>
+          <w:fldChar w:fldCharType="separate"/>
+        </w:r>
+        <w:r>
+          <w:rPr>
+            <w:noProof/>
+            <w:webHidden/>
+          </w:rPr>
+          <w:t>3</w:t>
+        </w:r>
+        <w:r>
+          <w:rPr>
+            <w:noProof/>
+            <w:webHidden/>
+          </w:rPr>
+          <w:fldChar w:fldCharType="end"/>
+        </w:r>
+      </w:hyperlink>
+    </w:p>
+    <w:p>
+      <w:pPr>
+        <w:pStyle w:val="TOC1"/>
+        <w:tabs>
+          <w:tab w:val="left" w:pos="480"/>
+          <w:tab w:val="right" w:leader="dot" w:pos="9350"/>
+        </w:tabs>
+        <w:rPr>
+          <w:rFonts w:asciiTheme="minorHAnsi" w:eastAsiaTheme="minorEastAsia" w:hAnsiTheme="minorHAnsi" w:cstheme="minorBidi"/>
+          <w:noProof/>
+          <w:kern w:val="2"/>
+          <w:szCs w:val="24"/>
+          <w:lang w:val="en-CA" w:eastAsia="en-CA"/>
+          <w14:ligatures w14:val="standardContextual"/>
+        </w:rPr>
+      </w:pPr>
+      <w:hyperlink w:anchor="_Toc224909762" w:history="1">
+        <w:r>
+          <w:rPr>
+            <w:rStyle w:val="Hyperlink"/>
+            <w:smallCaps/>
+            <w:noProof/>
+          </w:rPr>
+          <w:t>3.</w:t>
+        </w:r>
+        <w:r>
+          <w:rPr>
+            <w:rFonts w:asciiTheme="minorHAnsi" w:eastAsiaTheme="minorEastAsia" w:hAnsiTheme="minorHAnsi" w:cstheme="minorBidi"/>
+            <w:noProof/>
+            <w:kern w:val="2"/>
+            <w:szCs w:val="24"/>
+            <w:lang w:val="en-CA" w:eastAsia="en-CA"/>
+            <w14:ligatures w14:val="standardContextual"/>
+          </w:rPr>
+          <w:tab/>
+        </w:r>
+        <w:r>
+          <w:rPr>
+            <w:rStyle w:val="Hyperlink"/>
+            <w:smallCaps/>
+            <w:noProof/>
+          </w:rPr>
+          <w:t>Project Overview</w:t>
+        </w:r>
+        <w:r>
+          <w:rPr>
+            <w:noProof/>
+            <w:webHidden/>
+          </w:rPr>
+          <w:tab/>
+        </w:r>
+        <w:r>
+          <w:rPr>
+            <w:noProof/>
+            <w:webHidden/>
+          </w:rPr>
+          <w:fldChar w:fldCharType="begin"/>
+        </w:r>
+        <w:r>
+          <w:rPr>
+            <w:noProof/>
+            <w:webHidden/>
+          </w:rPr>
+          <w:instrText xml:space="preserve"> PAGEREF _Toc224909762 \h </w:instrText>
+        </w:r>
+        <w:r>
+          <w:rPr>
+            <w:noProof/>
+            <w:webHidden/>
+          </w:rPr>
+        </w:r>
+        <w:r>
+          <w:rPr>
+            <w:noProof/>
+            <w:webHidden/>
+          </w:rPr>
+          <w:fldChar w:fldCharType="separate"/>
+        </w:r>
+        <w:r>
+          <w:rPr>
             <w:noProof/>
             <w:webHidden/>
           </w:rPr>
@@ -745,7 +787,6 @@
         </w:r>
         <w:r>
           <w:rPr>
-            <w:rFonts w:asciiTheme="minorHAnsi" w:hAnsiTheme="minorHAnsi"/>
             <w:noProof/>
             <w:webHidden/>
           </w:rPr>
@@ -757,47 +798,48 @@
       <w:pPr>
         <w:pStyle w:val="TOC2"/>
         <w:tabs>
-          <w:tab w:val="left" w:pos="880"/>
+          <w:tab w:val="left" w:pos="960"/>
           <w:tab w:val="right" w:leader="dot" w:pos="9350"/>
         </w:tabs>
         <w:rPr>
-          <w:rFonts w:asciiTheme="minorHAnsi" w:eastAsia="SimSun" w:hAnsiTheme="minorHAnsi"/>
+          <w:rFonts w:asciiTheme="minorHAnsi" w:eastAsiaTheme="minorEastAsia" w:hAnsiTheme="minorHAnsi" w:cstheme="minorBidi"/>
           <w:noProof/>
-          <w:sz w:val="22"/>
-          <w:szCs w:val="22"/>
-          <w:lang w:eastAsia="zh-CN"/>
-        </w:rPr>
-      </w:pPr>
-      <w:hyperlink w:anchor="_Toc332112082" w:history="1">
+          <w:kern w:val="2"/>
+          <w:sz w:val="24"/>
+          <w:szCs w:val="24"/>
+          <w:lang w:val="en-CA" w:eastAsia="en-CA"/>
+          <w14:ligatures w14:val="standardContextual"/>
+        </w:rPr>
+      </w:pPr>
+      <w:hyperlink w:anchor="_Toc224909763" w:history="1">
         <w:r>
           <w:rPr>
             <w:rStyle w:val="Hyperlink"/>
-            <w:rFonts w:asciiTheme="minorHAnsi" w:hAnsiTheme="minorHAnsi"/>
-            <w:noProof/>
-          </w:rPr>
-          <w:t>1.4.</w:t>
-        </w:r>
-        <w:r>
-          <w:rPr>
-            <w:rFonts w:asciiTheme="minorHAnsi" w:eastAsia="SimSun" w:hAnsiTheme="minorHAnsi"/>
-            <w:noProof/>
-            <w:sz w:val="22"/>
-            <w:szCs w:val="22"/>
-            <w:lang w:eastAsia="zh-CN"/>
+            <w:noProof/>
+          </w:rPr>
+          <w:t>3.1.</w:t>
+        </w:r>
+        <w:r>
+          <w:rPr>
+            <w:rFonts w:asciiTheme="minorHAnsi" w:eastAsiaTheme="minorEastAsia" w:hAnsiTheme="minorHAnsi" w:cstheme="minorBidi"/>
+            <w:noProof/>
+            <w:kern w:val="2"/>
+            <w:sz w:val="24"/>
+            <w:szCs w:val="24"/>
+            <w:lang w:val="en-CA" w:eastAsia="en-CA"/>
+            <w14:ligatures w14:val="standardContextual"/>
           </w:rPr>
           <w:tab/>
         </w:r>
         <w:r>
           <w:rPr>
             <w:rStyle w:val="Hyperlink"/>
-            <w:rFonts w:asciiTheme="minorHAnsi" w:hAnsiTheme="minorHAnsi"/>
-            <w:noProof/>
-          </w:rPr>
-          <w:t>Justification</w:t>
-        </w:r>
-        <w:r>
-          <w:rPr>
-            <w:rFonts w:asciiTheme="minorHAnsi" w:hAnsiTheme="minorHAnsi"/>
+            <w:noProof/>
+          </w:rPr>
+          <w:t>Project Description</w:t>
+        </w:r>
+        <w:r>
+          <w:rPr>
             <w:noProof/>
             <w:webHidden/>
           </w:rPr>
@@ -805,7 +847,6 @@
         </w:r>
         <w:r>
           <w:rPr>
-            <w:rFonts w:asciiTheme="minorHAnsi" w:hAnsiTheme="minorHAnsi"/>
             <w:noProof/>
             <w:webHidden/>
           </w:rPr>
@@ -813,22 +854,19 @@
         </w:r>
         <w:r>
           <w:rPr>
-            <w:rFonts w:asciiTheme="minorHAnsi" w:hAnsiTheme="minorHAnsi"/>
-            <w:noProof/>
-            <w:webHidden/>
-          </w:rPr>
-          <w:instrText xml:space="preserve"> PAGEREF _Toc332112082 \h </w:instrText>
-        </w:r>
-        <w:r>
-          <w:rPr>
-            <w:rFonts w:asciiTheme="minorHAnsi" w:hAnsiTheme="minorHAnsi"/>
-            <w:noProof/>
-            <w:webHidden/>
-          </w:rPr>
-        </w:r>
-        <w:r>
-          <w:rPr>
-            <w:rFonts w:asciiTheme="minorHAnsi" w:hAnsiTheme="minorHAnsi"/>
+            <w:noProof/>
+            <w:webHidden/>
+          </w:rPr>
+          <w:instrText xml:space="preserve"> PAGEREF _Toc224909763 \h </w:instrText>
+        </w:r>
+        <w:r>
+          <w:rPr>
+            <w:noProof/>
+            <w:webHidden/>
+          </w:rPr>
+        </w:r>
+        <w:r>
+          <w:rPr>
             <w:noProof/>
             <w:webHidden/>
           </w:rPr>
@@ -836,7 +874,6 @@
         </w:r>
         <w:r>
           <w:rPr>
-            <w:rFonts w:asciiTheme="minorHAnsi" w:hAnsiTheme="minorHAnsi"/>
             <w:noProof/>
             <w:webHidden/>
           </w:rPr>
@@ -844,7 +881,6 @@
         </w:r>
         <w:r>
           <w:rPr>
-            <w:rFonts w:asciiTheme="minorHAnsi" w:hAnsiTheme="minorHAnsi"/>
             <w:noProof/>
             <w:webHidden/>
           </w:rPr>
@@ -854,51 +890,238 @@
     </w:p>
     <w:p>
       <w:pPr>
+        <w:pStyle w:val="TOC2"/>
+        <w:tabs>
+          <w:tab w:val="left" w:pos="960"/>
+          <w:tab w:val="right" w:leader="dot" w:pos="9350"/>
+        </w:tabs>
+        <w:rPr>
+          <w:rFonts w:asciiTheme="minorHAnsi" w:eastAsiaTheme="minorEastAsia" w:hAnsiTheme="minorHAnsi" w:cstheme="minorBidi"/>
+          <w:noProof/>
+          <w:kern w:val="2"/>
+          <w:sz w:val="24"/>
+          <w:szCs w:val="24"/>
+          <w:lang w:val="en-CA" w:eastAsia="en-CA"/>
+          <w14:ligatures w14:val="standardContextual"/>
+        </w:rPr>
+      </w:pPr>
+      <w:hyperlink w:anchor="_Toc224909764" w:history="1">
+        <w:r>
+          <w:rPr>
+            <w:rStyle w:val="Hyperlink"/>
+            <w:noProof/>
+          </w:rPr>
+          <w:t>3.2.</w:t>
+        </w:r>
+        <w:r>
+          <w:rPr>
+            <w:rFonts w:asciiTheme="minorHAnsi" w:eastAsiaTheme="minorEastAsia" w:hAnsiTheme="minorHAnsi" w:cstheme="minorBidi"/>
+            <w:noProof/>
+            <w:kern w:val="2"/>
+            <w:sz w:val="24"/>
+            <w:szCs w:val="24"/>
+            <w:lang w:val="en-CA" w:eastAsia="en-CA"/>
+            <w14:ligatures w14:val="standardContextual"/>
+          </w:rPr>
+          <w:tab/>
+        </w:r>
+        <w:r>
+          <w:rPr>
+            <w:rStyle w:val="Hyperlink"/>
+            <w:noProof/>
+          </w:rPr>
+          <w:t>Goals and Objectives</w:t>
+        </w:r>
+        <w:r>
+          <w:rPr>
+            <w:noProof/>
+            <w:webHidden/>
+          </w:rPr>
+          <w:tab/>
+        </w:r>
+        <w:r>
+          <w:rPr>
+            <w:noProof/>
+            <w:webHidden/>
+          </w:rPr>
+          <w:fldChar w:fldCharType="begin"/>
+        </w:r>
+        <w:r>
+          <w:rPr>
+            <w:noProof/>
+            <w:webHidden/>
+          </w:rPr>
+          <w:instrText xml:space="preserve"> PAGEREF _Toc224909764 \h </w:instrText>
+        </w:r>
+        <w:r>
+          <w:rPr>
+            <w:noProof/>
+            <w:webHidden/>
+          </w:rPr>
+        </w:r>
+        <w:r>
+          <w:rPr>
+            <w:noProof/>
+            <w:webHidden/>
+          </w:rPr>
+          <w:fldChar w:fldCharType="separate"/>
+        </w:r>
+        <w:r>
+          <w:rPr>
+            <w:noProof/>
+            <w:webHidden/>
+          </w:rPr>
+          <w:t>4</w:t>
+        </w:r>
+        <w:r>
+          <w:rPr>
+            <w:noProof/>
+            <w:webHidden/>
+          </w:rPr>
+          <w:fldChar w:fldCharType="end"/>
+        </w:r>
+      </w:hyperlink>
+    </w:p>
+    <w:p>
+      <w:pPr>
+        <w:pStyle w:val="TOC2"/>
+        <w:tabs>
+          <w:tab w:val="left" w:pos="960"/>
+          <w:tab w:val="right" w:leader="dot" w:pos="9350"/>
+        </w:tabs>
+        <w:rPr>
+          <w:rFonts w:asciiTheme="minorHAnsi" w:eastAsiaTheme="minorEastAsia" w:hAnsiTheme="minorHAnsi" w:cstheme="minorBidi"/>
+          <w:noProof/>
+          <w:kern w:val="2"/>
+          <w:sz w:val="24"/>
+          <w:szCs w:val="24"/>
+          <w:lang w:val="en-CA" w:eastAsia="en-CA"/>
+          <w14:ligatures w14:val="standardContextual"/>
+        </w:rPr>
+      </w:pPr>
+      <w:hyperlink w:anchor="_Toc224909765" w:history="1">
+        <w:r>
+          <w:rPr>
+            <w:rStyle w:val="Hyperlink"/>
+            <w:noProof/>
+          </w:rPr>
+          <w:t>3.3.</w:t>
+        </w:r>
+        <w:r>
+          <w:rPr>
+            <w:rFonts w:asciiTheme="minorHAnsi" w:eastAsiaTheme="minorEastAsia" w:hAnsiTheme="minorHAnsi" w:cstheme="minorBidi"/>
+            <w:noProof/>
+            <w:kern w:val="2"/>
+            <w:sz w:val="24"/>
+            <w:szCs w:val="24"/>
+            <w:lang w:val="en-CA" w:eastAsia="en-CA"/>
+            <w14:ligatures w14:val="standardContextual"/>
+          </w:rPr>
+          <w:tab/>
+        </w:r>
+        <w:r>
+          <w:rPr>
+            <w:rStyle w:val="Hyperlink"/>
+            <w:noProof/>
+          </w:rPr>
+          <w:t>Project Assumptions</w:t>
+        </w:r>
+        <w:r>
+          <w:rPr>
+            <w:noProof/>
+            <w:webHidden/>
+          </w:rPr>
+          <w:tab/>
+        </w:r>
+        <w:r>
+          <w:rPr>
+            <w:noProof/>
+            <w:webHidden/>
+          </w:rPr>
+          <w:fldChar w:fldCharType="begin"/>
+        </w:r>
+        <w:r>
+          <w:rPr>
+            <w:noProof/>
+            <w:webHidden/>
+          </w:rPr>
+          <w:instrText xml:space="preserve"> PAGEREF _Toc224909765 \h </w:instrText>
+        </w:r>
+        <w:r>
+          <w:rPr>
+            <w:noProof/>
+            <w:webHidden/>
+          </w:rPr>
+        </w:r>
+        <w:r>
+          <w:rPr>
+            <w:noProof/>
+            <w:webHidden/>
+          </w:rPr>
+          <w:fldChar w:fldCharType="separate"/>
+        </w:r>
+        <w:r>
+          <w:rPr>
+            <w:noProof/>
+            <w:webHidden/>
+          </w:rPr>
+          <w:t>4</w:t>
+        </w:r>
+        <w:r>
+          <w:rPr>
+            <w:noProof/>
+            <w:webHidden/>
+          </w:rPr>
+          <w:fldChar w:fldCharType="end"/>
+        </w:r>
+      </w:hyperlink>
+    </w:p>
+    <w:p>
+      <w:pPr>
         <w:pStyle w:val="TOC1"/>
         <w:tabs>
-          <w:tab w:val="left" w:pos="660"/>
+          <w:tab w:val="left" w:pos="480"/>
           <w:tab w:val="right" w:leader="dot" w:pos="9350"/>
         </w:tabs>
         <w:rPr>
-          <w:rFonts w:asciiTheme="minorHAnsi" w:eastAsia="SimSun" w:hAnsiTheme="minorHAnsi"/>
+          <w:rFonts w:asciiTheme="minorHAnsi" w:eastAsiaTheme="minorEastAsia" w:hAnsiTheme="minorHAnsi" w:cstheme="minorBidi"/>
           <w:noProof/>
-          <w:sz w:val="22"/>
-          <w:szCs w:val="22"/>
-          <w:lang w:eastAsia="zh-CN"/>
-        </w:rPr>
-      </w:pPr>
-      <w:hyperlink w:anchor="_Toc332112083" w:history="1">
+          <w:kern w:val="2"/>
+          <w:szCs w:val="24"/>
+          <w:lang w:val="en-CA" w:eastAsia="en-CA"/>
+          <w14:ligatures w14:val="standardContextual"/>
+        </w:rPr>
+      </w:pPr>
+      <w:hyperlink w:anchor="_Toc224909766" w:history="1">
         <w:r>
           <w:rPr>
             <w:rStyle w:val="Hyperlink"/>
-            <w:rFonts w:asciiTheme="minorHAnsi" w:hAnsiTheme="minorHAnsi"/>
             <w:smallCaps/>
             <w:noProof/>
           </w:rPr>
-          <w:t>2.</w:t>
-        </w:r>
-        <w:r>
-          <w:rPr>
-            <w:rFonts w:asciiTheme="minorHAnsi" w:eastAsia="SimSun" w:hAnsiTheme="minorHAnsi"/>
-            <w:noProof/>
-            <w:sz w:val="22"/>
-            <w:szCs w:val="22"/>
-            <w:lang w:eastAsia="zh-CN"/>
+          <w:t>4.</w:t>
+        </w:r>
+        <w:r>
+          <w:rPr>
+            <w:rFonts w:asciiTheme="minorHAnsi" w:eastAsiaTheme="minorEastAsia" w:hAnsiTheme="minorHAnsi" w:cstheme="minorBidi"/>
+            <w:noProof/>
+            <w:kern w:val="2"/>
+            <w:szCs w:val="24"/>
+            <w:lang w:val="en-CA" w:eastAsia="en-CA"/>
+            <w14:ligatures w14:val="standardContextual"/>
           </w:rPr>
           <w:tab/>
         </w:r>
         <w:r>
           <w:rPr>
             <w:rStyle w:val="Hyperlink"/>
-            <w:rFonts w:asciiTheme="minorHAnsi" w:hAnsiTheme="minorHAnsi"/>
             <w:smallCaps/>
             <w:noProof/>
           </w:rPr>
-          <w:t>Business Case Analysis Team</w:t>
-        </w:r>
-        <w:r>
-          <w:rPr>
-            <w:rFonts w:asciiTheme="minorHAnsi" w:hAnsiTheme="minorHAnsi"/>
+          <w:t>Strategic Alignment</w:t>
+        </w:r>
+        <w:r>
+          <w:rPr>
             <w:noProof/>
             <w:webHidden/>
           </w:rPr>
@@ -906,7 +1129,6 @@
         </w:r>
         <w:r>
           <w:rPr>
-            <w:rFonts w:asciiTheme="minorHAnsi" w:hAnsiTheme="minorHAnsi"/>
             <w:noProof/>
             <w:webHidden/>
           </w:rPr>
@@ -914,22 +1136,19 @@
         </w:r>
         <w:r>
           <w:rPr>
-            <w:rFonts w:asciiTheme="minorHAnsi" w:hAnsiTheme="minorHAnsi"/>
-            <w:noProof/>
-            <w:webHidden/>
-          </w:rPr>
-          <w:instrText xml:space="preserve"> PAGEREF _Toc332112083 \h </w:instrText>
-        </w:r>
-        <w:r>
-          <w:rPr>
-            <w:rFonts w:asciiTheme="minorHAnsi" w:hAnsiTheme="minorHAnsi"/>
-            <w:noProof/>
-            <w:webHidden/>
-          </w:rPr>
-        </w:r>
-        <w:r>
-          <w:rPr>
-            <w:rFonts w:asciiTheme="minorHAnsi" w:hAnsiTheme="minorHAnsi"/>
+            <w:noProof/>
+            <w:webHidden/>
+          </w:rPr>
+          <w:instrText xml:space="preserve"> PAGEREF _Toc224909766 \h </w:instrText>
+        </w:r>
+        <w:r>
+          <w:rPr>
+            <w:noProof/>
+            <w:webHidden/>
+          </w:rPr>
+        </w:r>
+        <w:r>
+          <w:rPr>
             <w:noProof/>
             <w:webHidden/>
           </w:rPr>
@@ -937,7 +1156,6 @@
         </w:r>
         <w:r>
           <w:rPr>
-            <w:rFonts w:asciiTheme="minorHAnsi" w:hAnsiTheme="minorHAnsi"/>
             <w:noProof/>
             <w:webHidden/>
           </w:rPr>
@@ -945,7 +1163,6 @@
         </w:r>
         <w:r>
           <w:rPr>
-            <w:rFonts w:asciiTheme="minorHAnsi" w:hAnsiTheme="minorHAnsi"/>
             <w:noProof/>
             <w:webHidden/>
           </w:rPr>
@@ -957,49 +1174,48 @@
       <w:pPr>
         <w:pStyle w:val="TOC1"/>
         <w:tabs>
-          <w:tab w:val="left" w:pos="660"/>
+          <w:tab w:val="left" w:pos="480"/>
           <w:tab w:val="right" w:leader="dot" w:pos="9350"/>
         </w:tabs>
         <w:rPr>
-          <w:rFonts w:asciiTheme="minorHAnsi" w:eastAsia="SimSun" w:hAnsiTheme="minorHAnsi"/>
+          <w:rFonts w:asciiTheme="minorHAnsi" w:eastAsiaTheme="minorEastAsia" w:hAnsiTheme="minorHAnsi" w:cstheme="minorBidi"/>
           <w:noProof/>
-          <w:sz w:val="22"/>
-          <w:szCs w:val="22"/>
-          <w:lang w:eastAsia="zh-CN"/>
-        </w:rPr>
-      </w:pPr>
-      <w:hyperlink w:anchor="_Toc332112084" w:history="1">
+          <w:kern w:val="2"/>
+          <w:szCs w:val="24"/>
+          <w:lang w:val="en-CA" w:eastAsia="en-CA"/>
+          <w14:ligatures w14:val="standardContextual"/>
+        </w:rPr>
+      </w:pPr>
+      <w:hyperlink w:anchor="_Toc224909767" w:history="1">
         <w:r>
           <w:rPr>
             <w:rStyle w:val="Hyperlink"/>
-            <w:rFonts w:asciiTheme="minorHAnsi" w:hAnsiTheme="minorHAnsi"/>
             <w:smallCaps/>
             <w:noProof/>
           </w:rPr>
-          <w:t>3.</w:t>
-        </w:r>
-        <w:r>
-          <w:rPr>
-            <w:rFonts w:asciiTheme="minorHAnsi" w:eastAsia="SimSun" w:hAnsiTheme="minorHAnsi"/>
-            <w:noProof/>
-            <w:sz w:val="22"/>
-            <w:szCs w:val="22"/>
-            <w:lang w:eastAsia="zh-CN"/>
+          <w:t>5.</w:t>
+        </w:r>
+        <w:r>
+          <w:rPr>
+            <w:rFonts w:asciiTheme="minorHAnsi" w:eastAsiaTheme="minorEastAsia" w:hAnsiTheme="minorHAnsi" w:cstheme="minorBidi"/>
+            <w:noProof/>
+            <w:kern w:val="2"/>
+            <w:szCs w:val="24"/>
+            <w:lang w:val="en-CA" w:eastAsia="en-CA"/>
+            <w14:ligatures w14:val="standardContextual"/>
           </w:rPr>
           <w:tab/>
         </w:r>
         <w:r>
           <w:rPr>
             <w:rStyle w:val="Hyperlink"/>
-            <w:rFonts w:asciiTheme="minorHAnsi" w:hAnsiTheme="minorHAnsi"/>
             <w:smallCaps/>
             <w:noProof/>
           </w:rPr>
-          <w:t>Problem Definition</w:t>
-        </w:r>
-        <w:r>
-          <w:rPr>
-            <w:rFonts w:asciiTheme="minorHAnsi" w:hAnsiTheme="minorHAnsi"/>
+          <w:t>Cost Benefit Analysis / Alternatives Analysis</w:t>
+        </w:r>
+        <w:r>
+          <w:rPr>
             <w:noProof/>
             <w:webHidden/>
           </w:rPr>
@@ -1007,7 +1223,6 @@
         </w:r>
         <w:r>
           <w:rPr>
-            <w:rFonts w:asciiTheme="minorHAnsi" w:hAnsiTheme="minorHAnsi"/>
             <w:noProof/>
             <w:webHidden/>
           </w:rPr>
@@ -1015,22 +1230,19 @@
         </w:r>
         <w:r>
           <w:rPr>
-            <w:rFonts w:asciiTheme="minorHAnsi" w:hAnsiTheme="minorHAnsi"/>
-            <w:noProof/>
-            <w:webHidden/>
-          </w:rPr>
-          <w:instrText xml:space="preserve"> PAGEREF _Toc332112084 \h </w:instrText>
-        </w:r>
-        <w:r>
-          <w:rPr>
-            <w:rFonts w:asciiTheme="minorHAnsi" w:hAnsiTheme="minorHAnsi"/>
-            <w:noProof/>
-            <w:webHidden/>
-          </w:rPr>
-        </w:r>
-        <w:r>
-          <w:rPr>
-            <w:rFonts w:asciiTheme="minorHAnsi" w:hAnsiTheme="minorHAnsi"/>
+            <w:noProof/>
+            <w:webHidden/>
+          </w:rPr>
+          <w:instrText xml:space="preserve"> PAGEREF _Toc224909767 \h </w:instrText>
+        </w:r>
+        <w:r>
+          <w:rPr>
+            <w:noProof/>
+            <w:webHidden/>
+          </w:rPr>
+        </w:r>
+        <w:r>
+          <w:rPr>
             <w:noProof/>
             <w:webHidden/>
           </w:rPr>
@@ -1038,7 +1250,6 @@
         </w:r>
         <w:r>
           <w:rPr>
-            <w:rFonts w:asciiTheme="minorHAnsi" w:hAnsiTheme="minorHAnsi"/>
             <w:noProof/>
             <w:webHidden/>
           </w:rPr>
@@ -1046,1403 +1257,6 @@
         </w:r>
         <w:r>
           <w:rPr>
-            <w:rFonts w:asciiTheme="minorHAnsi" w:hAnsiTheme="minorHAnsi"/>
-            <w:noProof/>
-            <w:webHidden/>
-          </w:rPr>
-          <w:fldChar w:fldCharType="end"/>
-        </w:r>
-      </w:hyperlink>
-    </w:p>
-    <w:p>
-      <w:pPr>
-        <w:pStyle w:val="TOC2"/>
-        <w:tabs>
-          <w:tab w:val="left" w:pos="880"/>
-          <w:tab w:val="right" w:leader="dot" w:pos="9350"/>
-        </w:tabs>
-        <w:rPr>
-          <w:rFonts w:asciiTheme="minorHAnsi" w:eastAsia="SimSun" w:hAnsiTheme="minorHAnsi"/>
-          <w:noProof/>
-          <w:sz w:val="22"/>
-          <w:szCs w:val="22"/>
-          <w:lang w:eastAsia="zh-CN"/>
-        </w:rPr>
-      </w:pPr>
-      <w:hyperlink w:anchor="_Toc332112085" w:history="1">
-        <w:r>
-          <w:rPr>
-            <w:rStyle w:val="Hyperlink"/>
-            <w:rFonts w:asciiTheme="minorHAnsi" w:hAnsiTheme="minorHAnsi"/>
-            <w:noProof/>
-          </w:rPr>
-          <w:t>3.1.</w:t>
-        </w:r>
-        <w:r>
-          <w:rPr>
-            <w:rFonts w:asciiTheme="minorHAnsi" w:eastAsia="SimSun" w:hAnsiTheme="minorHAnsi"/>
-            <w:noProof/>
-            <w:sz w:val="22"/>
-            <w:szCs w:val="22"/>
-            <w:lang w:eastAsia="zh-CN"/>
-          </w:rPr>
-          <w:tab/>
-        </w:r>
-        <w:r>
-          <w:rPr>
-            <w:rStyle w:val="Hyperlink"/>
-            <w:rFonts w:asciiTheme="minorHAnsi" w:hAnsiTheme="minorHAnsi"/>
-            <w:noProof/>
-          </w:rPr>
-          <w:t>Problem Statement</w:t>
-        </w:r>
-        <w:r>
-          <w:rPr>
-            <w:rFonts w:asciiTheme="minorHAnsi" w:hAnsiTheme="minorHAnsi"/>
-            <w:noProof/>
-            <w:webHidden/>
-          </w:rPr>
-          <w:tab/>
-        </w:r>
-        <w:r>
-          <w:rPr>
-            <w:rFonts w:asciiTheme="minorHAnsi" w:hAnsiTheme="minorHAnsi"/>
-            <w:noProof/>
-            <w:webHidden/>
-          </w:rPr>
-          <w:fldChar w:fldCharType="begin"/>
-        </w:r>
-        <w:r>
-          <w:rPr>
-            <w:rFonts w:asciiTheme="minorHAnsi" w:hAnsiTheme="minorHAnsi"/>
-            <w:noProof/>
-            <w:webHidden/>
-          </w:rPr>
-          <w:instrText xml:space="preserve"> PAGEREF _Toc332112085 \h </w:instrText>
-        </w:r>
-        <w:r>
-          <w:rPr>
-            <w:rFonts w:asciiTheme="minorHAnsi" w:hAnsiTheme="minorHAnsi"/>
-            <w:noProof/>
-            <w:webHidden/>
-          </w:rPr>
-        </w:r>
-        <w:r>
-          <w:rPr>
-            <w:rFonts w:asciiTheme="minorHAnsi" w:hAnsiTheme="minorHAnsi"/>
-            <w:noProof/>
-            <w:webHidden/>
-          </w:rPr>
-          <w:fldChar w:fldCharType="separate"/>
-        </w:r>
-        <w:r>
-          <w:rPr>
-            <w:rFonts w:asciiTheme="minorHAnsi" w:hAnsiTheme="minorHAnsi"/>
-            <w:noProof/>
-            <w:webHidden/>
-          </w:rPr>
-          <w:t>6</w:t>
-        </w:r>
-        <w:r>
-          <w:rPr>
-            <w:rFonts w:asciiTheme="minorHAnsi" w:hAnsiTheme="minorHAnsi"/>
-            <w:noProof/>
-            <w:webHidden/>
-          </w:rPr>
-          <w:fldChar w:fldCharType="end"/>
-        </w:r>
-      </w:hyperlink>
-    </w:p>
-    <w:p>
-      <w:pPr>
-        <w:pStyle w:val="TOC2"/>
-        <w:tabs>
-          <w:tab w:val="left" w:pos="880"/>
-          <w:tab w:val="right" w:leader="dot" w:pos="9350"/>
-        </w:tabs>
-        <w:rPr>
-          <w:rFonts w:asciiTheme="minorHAnsi" w:eastAsia="SimSun" w:hAnsiTheme="minorHAnsi"/>
-          <w:noProof/>
-          <w:sz w:val="22"/>
-          <w:szCs w:val="22"/>
-          <w:lang w:eastAsia="zh-CN"/>
-        </w:rPr>
-      </w:pPr>
-      <w:hyperlink w:anchor="_Toc332112086" w:history="1">
-        <w:r>
-          <w:rPr>
-            <w:rStyle w:val="Hyperlink"/>
-            <w:rFonts w:asciiTheme="minorHAnsi" w:hAnsiTheme="minorHAnsi"/>
-            <w:noProof/>
-          </w:rPr>
-          <w:t>3.2.</w:t>
-        </w:r>
-        <w:r>
-          <w:rPr>
-            <w:rFonts w:asciiTheme="minorHAnsi" w:eastAsia="SimSun" w:hAnsiTheme="minorHAnsi"/>
-            <w:noProof/>
-            <w:sz w:val="22"/>
-            <w:szCs w:val="22"/>
-            <w:lang w:eastAsia="zh-CN"/>
-          </w:rPr>
-          <w:tab/>
-        </w:r>
-        <w:r>
-          <w:rPr>
-            <w:rStyle w:val="Hyperlink"/>
-            <w:rFonts w:asciiTheme="minorHAnsi" w:hAnsiTheme="minorHAnsi"/>
-            <w:noProof/>
-          </w:rPr>
-          <w:t>Organizational Impact</w:t>
-        </w:r>
-        <w:r>
-          <w:rPr>
-            <w:rFonts w:asciiTheme="minorHAnsi" w:hAnsiTheme="minorHAnsi"/>
-            <w:noProof/>
-            <w:webHidden/>
-          </w:rPr>
-          <w:tab/>
-        </w:r>
-        <w:r>
-          <w:rPr>
-            <w:rFonts w:asciiTheme="minorHAnsi" w:hAnsiTheme="minorHAnsi"/>
-            <w:noProof/>
-            <w:webHidden/>
-          </w:rPr>
-          <w:fldChar w:fldCharType="begin"/>
-        </w:r>
-        <w:r>
-          <w:rPr>
-            <w:rFonts w:asciiTheme="minorHAnsi" w:hAnsiTheme="minorHAnsi"/>
-            <w:noProof/>
-            <w:webHidden/>
-          </w:rPr>
-          <w:instrText xml:space="preserve"> PAGEREF _Toc332112086 \h </w:instrText>
-        </w:r>
-        <w:r>
-          <w:rPr>
-            <w:rFonts w:asciiTheme="minorHAnsi" w:hAnsiTheme="minorHAnsi"/>
-            <w:noProof/>
-            <w:webHidden/>
-          </w:rPr>
-        </w:r>
-        <w:r>
-          <w:rPr>
-            <w:rFonts w:asciiTheme="minorHAnsi" w:hAnsiTheme="minorHAnsi"/>
-            <w:noProof/>
-            <w:webHidden/>
-          </w:rPr>
-          <w:fldChar w:fldCharType="separate"/>
-        </w:r>
-        <w:r>
-          <w:rPr>
-            <w:rFonts w:asciiTheme="minorHAnsi" w:hAnsiTheme="minorHAnsi"/>
-            <w:noProof/>
-            <w:webHidden/>
-          </w:rPr>
-          <w:t>6</w:t>
-        </w:r>
-        <w:r>
-          <w:rPr>
-            <w:rFonts w:asciiTheme="minorHAnsi" w:hAnsiTheme="minorHAnsi"/>
-            <w:noProof/>
-            <w:webHidden/>
-          </w:rPr>
-          <w:fldChar w:fldCharType="end"/>
-        </w:r>
-      </w:hyperlink>
-    </w:p>
-    <w:p>
-      <w:pPr>
-        <w:pStyle w:val="TOC2"/>
-        <w:tabs>
-          <w:tab w:val="left" w:pos="880"/>
-          <w:tab w:val="right" w:leader="dot" w:pos="9350"/>
-        </w:tabs>
-        <w:rPr>
-          <w:rFonts w:asciiTheme="minorHAnsi" w:eastAsia="SimSun" w:hAnsiTheme="minorHAnsi"/>
-          <w:noProof/>
-          <w:sz w:val="22"/>
-          <w:szCs w:val="22"/>
-          <w:lang w:eastAsia="zh-CN"/>
-        </w:rPr>
-      </w:pPr>
-      <w:hyperlink w:anchor="_Toc332112087" w:history="1">
-        <w:r>
-          <w:rPr>
-            <w:rStyle w:val="Hyperlink"/>
-            <w:rFonts w:asciiTheme="minorHAnsi" w:hAnsiTheme="minorHAnsi"/>
-            <w:noProof/>
-          </w:rPr>
-          <w:t>3.3.</w:t>
-        </w:r>
-        <w:r>
-          <w:rPr>
-            <w:rFonts w:asciiTheme="minorHAnsi" w:eastAsia="SimSun" w:hAnsiTheme="minorHAnsi"/>
-            <w:noProof/>
-            <w:sz w:val="22"/>
-            <w:szCs w:val="22"/>
-            <w:lang w:eastAsia="zh-CN"/>
-          </w:rPr>
-          <w:tab/>
-        </w:r>
-        <w:r>
-          <w:rPr>
-            <w:rStyle w:val="Hyperlink"/>
-            <w:rFonts w:asciiTheme="minorHAnsi" w:hAnsiTheme="minorHAnsi"/>
-            <w:noProof/>
-          </w:rPr>
-          <w:t>Technology Migration</w:t>
-        </w:r>
-        <w:r>
-          <w:rPr>
-            <w:rFonts w:asciiTheme="minorHAnsi" w:hAnsiTheme="minorHAnsi"/>
-            <w:noProof/>
-            <w:webHidden/>
-          </w:rPr>
-          <w:tab/>
-        </w:r>
-        <w:r>
-          <w:rPr>
-            <w:rFonts w:asciiTheme="minorHAnsi" w:hAnsiTheme="minorHAnsi"/>
-            <w:noProof/>
-            <w:webHidden/>
-          </w:rPr>
-          <w:fldChar w:fldCharType="begin"/>
-        </w:r>
-        <w:r>
-          <w:rPr>
-            <w:rFonts w:asciiTheme="minorHAnsi" w:hAnsiTheme="minorHAnsi"/>
-            <w:noProof/>
-            <w:webHidden/>
-          </w:rPr>
-          <w:instrText xml:space="preserve"> PAGEREF _Toc332112087 \h </w:instrText>
-        </w:r>
-        <w:r>
-          <w:rPr>
-            <w:rFonts w:asciiTheme="minorHAnsi" w:hAnsiTheme="minorHAnsi"/>
-            <w:noProof/>
-            <w:webHidden/>
-          </w:rPr>
-        </w:r>
-        <w:r>
-          <w:rPr>
-            <w:rFonts w:asciiTheme="minorHAnsi" w:hAnsiTheme="minorHAnsi"/>
-            <w:noProof/>
-            <w:webHidden/>
-          </w:rPr>
-          <w:fldChar w:fldCharType="separate"/>
-        </w:r>
-        <w:r>
-          <w:rPr>
-            <w:rFonts w:asciiTheme="minorHAnsi" w:hAnsiTheme="minorHAnsi"/>
-            <w:noProof/>
-            <w:webHidden/>
-          </w:rPr>
-          <w:t>7</w:t>
-        </w:r>
-        <w:r>
-          <w:rPr>
-            <w:rFonts w:asciiTheme="minorHAnsi" w:hAnsiTheme="minorHAnsi"/>
-            <w:noProof/>
-            <w:webHidden/>
-          </w:rPr>
-          <w:fldChar w:fldCharType="end"/>
-        </w:r>
-      </w:hyperlink>
-    </w:p>
-    <w:p>
-      <w:pPr>
-        <w:pStyle w:val="TOC1"/>
-        <w:tabs>
-          <w:tab w:val="left" w:pos="660"/>
-          <w:tab w:val="right" w:leader="dot" w:pos="9350"/>
-        </w:tabs>
-        <w:rPr>
-          <w:rFonts w:asciiTheme="minorHAnsi" w:eastAsia="SimSun" w:hAnsiTheme="minorHAnsi"/>
-          <w:noProof/>
-          <w:sz w:val="22"/>
-          <w:szCs w:val="22"/>
-          <w:lang w:eastAsia="zh-CN"/>
-        </w:rPr>
-      </w:pPr>
-      <w:hyperlink w:anchor="_Toc332112088" w:history="1">
-        <w:r>
-          <w:rPr>
-            <w:rStyle w:val="Hyperlink"/>
-            <w:rFonts w:asciiTheme="minorHAnsi" w:hAnsiTheme="minorHAnsi"/>
-            <w:smallCaps/>
-            <w:noProof/>
-          </w:rPr>
-          <w:t>4.</w:t>
-        </w:r>
-        <w:r>
-          <w:rPr>
-            <w:rFonts w:asciiTheme="minorHAnsi" w:eastAsia="SimSun" w:hAnsiTheme="minorHAnsi"/>
-            <w:noProof/>
-            <w:sz w:val="22"/>
-            <w:szCs w:val="22"/>
-            <w:lang w:eastAsia="zh-CN"/>
-          </w:rPr>
-          <w:tab/>
-        </w:r>
-        <w:r>
-          <w:rPr>
-            <w:rStyle w:val="Hyperlink"/>
-            <w:rFonts w:asciiTheme="minorHAnsi" w:hAnsiTheme="minorHAnsi"/>
-            <w:smallCaps/>
-            <w:noProof/>
-          </w:rPr>
-          <w:t>Project Overview</w:t>
-        </w:r>
-        <w:r>
-          <w:rPr>
-            <w:rFonts w:asciiTheme="minorHAnsi" w:hAnsiTheme="minorHAnsi"/>
-            <w:noProof/>
-            <w:webHidden/>
-          </w:rPr>
-          <w:tab/>
-        </w:r>
-        <w:r>
-          <w:rPr>
-            <w:rFonts w:asciiTheme="minorHAnsi" w:hAnsiTheme="minorHAnsi"/>
-            <w:noProof/>
-            <w:webHidden/>
-          </w:rPr>
-          <w:fldChar w:fldCharType="begin"/>
-        </w:r>
-        <w:r>
-          <w:rPr>
-            <w:rFonts w:asciiTheme="minorHAnsi" w:hAnsiTheme="minorHAnsi"/>
-            <w:noProof/>
-            <w:webHidden/>
-          </w:rPr>
-          <w:instrText xml:space="preserve"> PAGEREF _Toc332112088 \h </w:instrText>
-        </w:r>
-        <w:r>
-          <w:rPr>
-            <w:rFonts w:asciiTheme="minorHAnsi" w:hAnsiTheme="minorHAnsi"/>
-            <w:noProof/>
-            <w:webHidden/>
-          </w:rPr>
-        </w:r>
-        <w:r>
-          <w:rPr>
-            <w:rFonts w:asciiTheme="minorHAnsi" w:hAnsiTheme="minorHAnsi"/>
-            <w:noProof/>
-            <w:webHidden/>
-          </w:rPr>
-          <w:fldChar w:fldCharType="separate"/>
-        </w:r>
-        <w:r>
-          <w:rPr>
-            <w:rFonts w:asciiTheme="minorHAnsi" w:hAnsiTheme="minorHAnsi"/>
-            <w:noProof/>
-            <w:webHidden/>
-          </w:rPr>
-          <w:t>7</w:t>
-        </w:r>
-        <w:r>
-          <w:rPr>
-            <w:rFonts w:asciiTheme="minorHAnsi" w:hAnsiTheme="minorHAnsi"/>
-            <w:noProof/>
-            <w:webHidden/>
-          </w:rPr>
-          <w:fldChar w:fldCharType="end"/>
-        </w:r>
-      </w:hyperlink>
-    </w:p>
-    <w:p>
-      <w:pPr>
-        <w:pStyle w:val="TOC2"/>
-        <w:tabs>
-          <w:tab w:val="left" w:pos="880"/>
-          <w:tab w:val="right" w:leader="dot" w:pos="9350"/>
-        </w:tabs>
-        <w:rPr>
-          <w:rFonts w:asciiTheme="minorHAnsi" w:eastAsia="SimSun" w:hAnsiTheme="minorHAnsi"/>
-          <w:noProof/>
-          <w:sz w:val="22"/>
-          <w:szCs w:val="22"/>
-          <w:lang w:eastAsia="zh-CN"/>
-        </w:rPr>
-      </w:pPr>
-      <w:hyperlink w:anchor="_Toc332112089" w:history="1">
-        <w:r>
-          <w:rPr>
-            <w:rStyle w:val="Hyperlink"/>
-            <w:rFonts w:asciiTheme="minorHAnsi" w:hAnsiTheme="minorHAnsi"/>
-            <w:noProof/>
-          </w:rPr>
-          <w:t>4.1.</w:t>
-        </w:r>
-        <w:r>
-          <w:rPr>
-            <w:rFonts w:asciiTheme="minorHAnsi" w:eastAsia="SimSun" w:hAnsiTheme="minorHAnsi"/>
-            <w:noProof/>
-            <w:sz w:val="22"/>
-            <w:szCs w:val="22"/>
-            <w:lang w:eastAsia="zh-CN"/>
-          </w:rPr>
-          <w:tab/>
-        </w:r>
-        <w:r>
-          <w:rPr>
-            <w:rStyle w:val="Hyperlink"/>
-            <w:rFonts w:asciiTheme="minorHAnsi" w:hAnsiTheme="minorHAnsi"/>
-            <w:noProof/>
-          </w:rPr>
-          <w:t>Project Description</w:t>
-        </w:r>
-        <w:r>
-          <w:rPr>
-            <w:rFonts w:asciiTheme="minorHAnsi" w:hAnsiTheme="minorHAnsi"/>
-            <w:noProof/>
-            <w:webHidden/>
-          </w:rPr>
-          <w:tab/>
-        </w:r>
-        <w:r>
-          <w:rPr>
-            <w:rFonts w:asciiTheme="minorHAnsi" w:hAnsiTheme="minorHAnsi"/>
-            <w:noProof/>
-            <w:webHidden/>
-          </w:rPr>
-          <w:fldChar w:fldCharType="begin"/>
-        </w:r>
-        <w:r>
-          <w:rPr>
-            <w:rFonts w:asciiTheme="minorHAnsi" w:hAnsiTheme="minorHAnsi"/>
-            <w:noProof/>
-            <w:webHidden/>
-          </w:rPr>
-          <w:instrText xml:space="preserve"> PAGEREF _Toc332112089 \h </w:instrText>
-        </w:r>
-        <w:r>
-          <w:rPr>
-            <w:rFonts w:asciiTheme="minorHAnsi" w:hAnsiTheme="minorHAnsi"/>
-            <w:noProof/>
-            <w:webHidden/>
-          </w:rPr>
-        </w:r>
-        <w:r>
-          <w:rPr>
-            <w:rFonts w:asciiTheme="minorHAnsi" w:hAnsiTheme="minorHAnsi"/>
-            <w:noProof/>
-            <w:webHidden/>
-          </w:rPr>
-          <w:fldChar w:fldCharType="separate"/>
-        </w:r>
-        <w:r>
-          <w:rPr>
-            <w:rFonts w:asciiTheme="minorHAnsi" w:hAnsiTheme="minorHAnsi"/>
-            <w:noProof/>
-            <w:webHidden/>
-          </w:rPr>
-          <w:t>8</w:t>
-        </w:r>
-        <w:r>
-          <w:rPr>
-            <w:rFonts w:asciiTheme="minorHAnsi" w:hAnsiTheme="minorHAnsi"/>
-            <w:noProof/>
-            <w:webHidden/>
-          </w:rPr>
-          <w:fldChar w:fldCharType="end"/>
-        </w:r>
-      </w:hyperlink>
-    </w:p>
-    <w:p>
-      <w:pPr>
-        <w:pStyle w:val="TOC2"/>
-        <w:tabs>
-          <w:tab w:val="left" w:pos="880"/>
-          <w:tab w:val="right" w:leader="dot" w:pos="9350"/>
-        </w:tabs>
-        <w:rPr>
-          <w:rFonts w:asciiTheme="minorHAnsi" w:eastAsia="SimSun" w:hAnsiTheme="minorHAnsi"/>
-          <w:noProof/>
-          <w:sz w:val="22"/>
-          <w:szCs w:val="22"/>
-          <w:lang w:eastAsia="zh-CN"/>
-        </w:rPr>
-      </w:pPr>
-      <w:hyperlink w:anchor="_Toc332112090" w:history="1">
-        <w:r>
-          <w:rPr>
-            <w:rStyle w:val="Hyperlink"/>
-            <w:rFonts w:asciiTheme="minorHAnsi" w:hAnsiTheme="minorHAnsi"/>
-            <w:noProof/>
-          </w:rPr>
-          <w:t>4.2.</w:t>
-        </w:r>
-        <w:r>
-          <w:rPr>
-            <w:rFonts w:asciiTheme="minorHAnsi" w:eastAsia="SimSun" w:hAnsiTheme="minorHAnsi"/>
-            <w:noProof/>
-            <w:sz w:val="22"/>
-            <w:szCs w:val="22"/>
-            <w:lang w:eastAsia="zh-CN"/>
-          </w:rPr>
-          <w:tab/>
-        </w:r>
-        <w:r>
-          <w:rPr>
-            <w:rStyle w:val="Hyperlink"/>
-            <w:rFonts w:asciiTheme="minorHAnsi" w:hAnsiTheme="minorHAnsi"/>
-            <w:noProof/>
-          </w:rPr>
-          <w:t>Goals and Objectives</w:t>
-        </w:r>
-        <w:r>
-          <w:rPr>
-            <w:rFonts w:asciiTheme="minorHAnsi" w:hAnsiTheme="minorHAnsi"/>
-            <w:noProof/>
-            <w:webHidden/>
-          </w:rPr>
-          <w:tab/>
-        </w:r>
-        <w:r>
-          <w:rPr>
-            <w:rFonts w:asciiTheme="minorHAnsi" w:hAnsiTheme="minorHAnsi"/>
-            <w:noProof/>
-            <w:webHidden/>
-          </w:rPr>
-          <w:fldChar w:fldCharType="begin"/>
-        </w:r>
-        <w:r>
-          <w:rPr>
-            <w:rFonts w:asciiTheme="minorHAnsi" w:hAnsiTheme="minorHAnsi"/>
-            <w:noProof/>
-            <w:webHidden/>
-          </w:rPr>
-          <w:instrText xml:space="preserve"> PAGEREF _Toc332112090 \h </w:instrText>
-        </w:r>
-        <w:r>
-          <w:rPr>
-            <w:rFonts w:asciiTheme="minorHAnsi" w:hAnsiTheme="minorHAnsi"/>
-            <w:noProof/>
-            <w:webHidden/>
-          </w:rPr>
-        </w:r>
-        <w:r>
-          <w:rPr>
-            <w:rFonts w:asciiTheme="minorHAnsi" w:hAnsiTheme="minorHAnsi"/>
-            <w:noProof/>
-            <w:webHidden/>
-          </w:rPr>
-          <w:fldChar w:fldCharType="separate"/>
-        </w:r>
-        <w:r>
-          <w:rPr>
-            <w:rFonts w:asciiTheme="minorHAnsi" w:hAnsiTheme="minorHAnsi"/>
-            <w:noProof/>
-            <w:webHidden/>
-          </w:rPr>
-          <w:t>8</w:t>
-        </w:r>
-        <w:r>
-          <w:rPr>
-            <w:rFonts w:asciiTheme="minorHAnsi" w:hAnsiTheme="minorHAnsi"/>
-            <w:noProof/>
-            <w:webHidden/>
-          </w:rPr>
-          <w:fldChar w:fldCharType="end"/>
-        </w:r>
-      </w:hyperlink>
-    </w:p>
-    <w:p>
-      <w:pPr>
-        <w:pStyle w:val="TOC2"/>
-        <w:tabs>
-          <w:tab w:val="left" w:pos="880"/>
-          <w:tab w:val="right" w:leader="dot" w:pos="9350"/>
-        </w:tabs>
-        <w:rPr>
-          <w:rFonts w:asciiTheme="minorHAnsi" w:eastAsia="SimSun" w:hAnsiTheme="minorHAnsi"/>
-          <w:noProof/>
-          <w:sz w:val="22"/>
-          <w:szCs w:val="22"/>
-          <w:lang w:eastAsia="zh-CN"/>
-        </w:rPr>
-      </w:pPr>
-      <w:hyperlink w:anchor="_Toc332112091" w:history="1">
-        <w:r>
-          <w:rPr>
-            <w:rStyle w:val="Hyperlink"/>
-            <w:rFonts w:asciiTheme="minorHAnsi" w:hAnsiTheme="minorHAnsi"/>
-            <w:noProof/>
-          </w:rPr>
-          <w:t>4.3.</w:t>
-        </w:r>
-        <w:r>
-          <w:rPr>
-            <w:rFonts w:asciiTheme="minorHAnsi" w:eastAsia="SimSun" w:hAnsiTheme="minorHAnsi"/>
-            <w:noProof/>
-            <w:sz w:val="22"/>
-            <w:szCs w:val="22"/>
-            <w:lang w:eastAsia="zh-CN"/>
-          </w:rPr>
-          <w:tab/>
-        </w:r>
-        <w:r>
-          <w:rPr>
-            <w:rStyle w:val="Hyperlink"/>
-            <w:rFonts w:asciiTheme="minorHAnsi" w:hAnsiTheme="minorHAnsi"/>
-            <w:noProof/>
-          </w:rPr>
-          <w:t>Project Performance</w:t>
-        </w:r>
-        <w:r>
-          <w:rPr>
-            <w:rFonts w:asciiTheme="minorHAnsi" w:hAnsiTheme="minorHAnsi"/>
-            <w:noProof/>
-            <w:webHidden/>
-          </w:rPr>
-          <w:tab/>
-        </w:r>
-        <w:r>
-          <w:rPr>
-            <w:rFonts w:asciiTheme="minorHAnsi" w:hAnsiTheme="minorHAnsi"/>
-            <w:noProof/>
-            <w:webHidden/>
-          </w:rPr>
-          <w:fldChar w:fldCharType="begin"/>
-        </w:r>
-        <w:r>
-          <w:rPr>
-            <w:rFonts w:asciiTheme="minorHAnsi" w:hAnsiTheme="minorHAnsi"/>
-            <w:noProof/>
-            <w:webHidden/>
-          </w:rPr>
-          <w:instrText xml:space="preserve"> PAGEREF _Toc332112091 \h </w:instrText>
-        </w:r>
-        <w:r>
-          <w:rPr>
-            <w:rFonts w:asciiTheme="minorHAnsi" w:hAnsiTheme="minorHAnsi"/>
-            <w:noProof/>
-            <w:webHidden/>
-          </w:rPr>
-        </w:r>
-        <w:r>
-          <w:rPr>
-            <w:rFonts w:asciiTheme="minorHAnsi" w:hAnsiTheme="minorHAnsi"/>
-            <w:noProof/>
-            <w:webHidden/>
-          </w:rPr>
-          <w:fldChar w:fldCharType="separate"/>
-        </w:r>
-        <w:r>
-          <w:rPr>
-            <w:rFonts w:asciiTheme="minorHAnsi" w:hAnsiTheme="minorHAnsi"/>
-            <w:noProof/>
-            <w:webHidden/>
-          </w:rPr>
-          <w:t>9</w:t>
-        </w:r>
-        <w:r>
-          <w:rPr>
-            <w:rFonts w:asciiTheme="minorHAnsi" w:hAnsiTheme="minorHAnsi"/>
-            <w:noProof/>
-            <w:webHidden/>
-          </w:rPr>
-          <w:fldChar w:fldCharType="end"/>
-        </w:r>
-      </w:hyperlink>
-    </w:p>
-    <w:p>
-      <w:pPr>
-        <w:pStyle w:val="TOC2"/>
-        <w:tabs>
-          <w:tab w:val="left" w:pos="880"/>
-          <w:tab w:val="right" w:leader="dot" w:pos="9350"/>
-        </w:tabs>
-        <w:rPr>
-          <w:rFonts w:asciiTheme="minorHAnsi" w:eastAsia="SimSun" w:hAnsiTheme="minorHAnsi"/>
-          <w:noProof/>
-          <w:sz w:val="22"/>
-          <w:szCs w:val="22"/>
-          <w:lang w:eastAsia="zh-CN"/>
-        </w:rPr>
-      </w:pPr>
-      <w:hyperlink w:anchor="_Toc332112092" w:history="1">
-        <w:r>
-          <w:rPr>
-            <w:rStyle w:val="Hyperlink"/>
-            <w:rFonts w:asciiTheme="minorHAnsi" w:hAnsiTheme="minorHAnsi"/>
-            <w:noProof/>
-          </w:rPr>
-          <w:t>4.4.</w:t>
-        </w:r>
-        <w:r>
-          <w:rPr>
-            <w:rFonts w:asciiTheme="minorHAnsi" w:eastAsia="SimSun" w:hAnsiTheme="minorHAnsi"/>
-            <w:noProof/>
-            <w:sz w:val="22"/>
-            <w:szCs w:val="22"/>
-            <w:lang w:eastAsia="zh-CN"/>
-          </w:rPr>
-          <w:tab/>
-        </w:r>
-        <w:r>
-          <w:rPr>
-            <w:rStyle w:val="Hyperlink"/>
-            <w:rFonts w:asciiTheme="minorHAnsi" w:hAnsiTheme="minorHAnsi"/>
-            <w:noProof/>
-          </w:rPr>
-          <w:t>Project Assumptions</w:t>
-        </w:r>
-        <w:r>
-          <w:rPr>
-            <w:rFonts w:asciiTheme="minorHAnsi" w:hAnsiTheme="minorHAnsi"/>
-            <w:noProof/>
-            <w:webHidden/>
-          </w:rPr>
-          <w:tab/>
-        </w:r>
-        <w:r>
-          <w:rPr>
-            <w:rFonts w:asciiTheme="minorHAnsi" w:hAnsiTheme="minorHAnsi"/>
-            <w:noProof/>
-            <w:webHidden/>
-          </w:rPr>
-          <w:fldChar w:fldCharType="begin"/>
-        </w:r>
-        <w:r>
-          <w:rPr>
-            <w:rFonts w:asciiTheme="minorHAnsi" w:hAnsiTheme="minorHAnsi"/>
-            <w:noProof/>
-            <w:webHidden/>
-          </w:rPr>
-          <w:instrText xml:space="preserve"> PAGEREF _Toc332112092 \h </w:instrText>
-        </w:r>
-        <w:r>
-          <w:rPr>
-            <w:rFonts w:asciiTheme="minorHAnsi" w:hAnsiTheme="minorHAnsi"/>
-            <w:noProof/>
-            <w:webHidden/>
-          </w:rPr>
-        </w:r>
-        <w:r>
-          <w:rPr>
-            <w:rFonts w:asciiTheme="minorHAnsi" w:hAnsiTheme="minorHAnsi"/>
-            <w:noProof/>
-            <w:webHidden/>
-          </w:rPr>
-          <w:fldChar w:fldCharType="separate"/>
-        </w:r>
-        <w:r>
-          <w:rPr>
-            <w:rFonts w:asciiTheme="minorHAnsi" w:hAnsiTheme="minorHAnsi"/>
-            <w:noProof/>
-            <w:webHidden/>
-          </w:rPr>
-          <w:t>9</w:t>
-        </w:r>
-        <w:r>
-          <w:rPr>
-            <w:rFonts w:asciiTheme="minorHAnsi" w:hAnsiTheme="minorHAnsi"/>
-            <w:noProof/>
-            <w:webHidden/>
-          </w:rPr>
-          <w:fldChar w:fldCharType="end"/>
-        </w:r>
-      </w:hyperlink>
-    </w:p>
-    <w:p>
-      <w:pPr>
-        <w:pStyle w:val="TOC2"/>
-        <w:tabs>
-          <w:tab w:val="left" w:pos="880"/>
-          <w:tab w:val="right" w:leader="dot" w:pos="9350"/>
-        </w:tabs>
-        <w:rPr>
-          <w:rFonts w:asciiTheme="minorHAnsi" w:eastAsia="SimSun" w:hAnsiTheme="minorHAnsi"/>
-          <w:noProof/>
-          <w:sz w:val="22"/>
-          <w:szCs w:val="22"/>
-          <w:lang w:eastAsia="zh-CN"/>
-        </w:rPr>
-      </w:pPr>
-      <w:hyperlink w:anchor="_Toc332112093" w:history="1">
-        <w:r>
-          <w:rPr>
-            <w:rStyle w:val="Hyperlink"/>
-            <w:rFonts w:asciiTheme="minorHAnsi" w:hAnsiTheme="minorHAnsi"/>
-            <w:noProof/>
-          </w:rPr>
-          <w:t>4.5.</w:t>
-        </w:r>
-        <w:r>
-          <w:rPr>
-            <w:rFonts w:asciiTheme="minorHAnsi" w:eastAsia="SimSun" w:hAnsiTheme="minorHAnsi"/>
-            <w:noProof/>
-            <w:sz w:val="22"/>
-            <w:szCs w:val="22"/>
-            <w:lang w:eastAsia="zh-CN"/>
-          </w:rPr>
-          <w:tab/>
-        </w:r>
-        <w:r>
-          <w:rPr>
-            <w:rStyle w:val="Hyperlink"/>
-            <w:rFonts w:asciiTheme="minorHAnsi" w:hAnsiTheme="minorHAnsi"/>
-            <w:noProof/>
-          </w:rPr>
-          <w:t>Project Constraints</w:t>
-        </w:r>
-        <w:r>
-          <w:rPr>
-            <w:rFonts w:asciiTheme="minorHAnsi" w:hAnsiTheme="minorHAnsi"/>
-            <w:noProof/>
-            <w:webHidden/>
-          </w:rPr>
-          <w:tab/>
-        </w:r>
-        <w:r>
-          <w:rPr>
-            <w:rFonts w:asciiTheme="minorHAnsi" w:hAnsiTheme="minorHAnsi"/>
-            <w:noProof/>
-            <w:webHidden/>
-          </w:rPr>
-          <w:fldChar w:fldCharType="begin"/>
-        </w:r>
-        <w:r>
-          <w:rPr>
-            <w:rFonts w:asciiTheme="minorHAnsi" w:hAnsiTheme="minorHAnsi"/>
-            <w:noProof/>
-            <w:webHidden/>
-          </w:rPr>
-          <w:instrText xml:space="preserve"> PAGEREF _Toc332112093 \h </w:instrText>
-        </w:r>
-        <w:r>
-          <w:rPr>
-            <w:rFonts w:asciiTheme="minorHAnsi" w:hAnsiTheme="minorHAnsi"/>
-            <w:noProof/>
-            <w:webHidden/>
-          </w:rPr>
-        </w:r>
-        <w:r>
-          <w:rPr>
-            <w:rFonts w:asciiTheme="minorHAnsi" w:hAnsiTheme="minorHAnsi"/>
-            <w:noProof/>
-            <w:webHidden/>
-          </w:rPr>
-          <w:fldChar w:fldCharType="separate"/>
-        </w:r>
-        <w:r>
-          <w:rPr>
-            <w:rFonts w:asciiTheme="minorHAnsi" w:hAnsiTheme="minorHAnsi"/>
-            <w:noProof/>
-            <w:webHidden/>
-          </w:rPr>
-          <w:t>10</w:t>
-        </w:r>
-        <w:r>
-          <w:rPr>
-            <w:rFonts w:asciiTheme="minorHAnsi" w:hAnsiTheme="minorHAnsi"/>
-            <w:noProof/>
-            <w:webHidden/>
-          </w:rPr>
-          <w:fldChar w:fldCharType="end"/>
-        </w:r>
-      </w:hyperlink>
-    </w:p>
-    <w:p>
-      <w:pPr>
-        <w:pStyle w:val="TOC2"/>
-        <w:tabs>
-          <w:tab w:val="left" w:pos="880"/>
-          <w:tab w:val="right" w:leader="dot" w:pos="9350"/>
-        </w:tabs>
-        <w:rPr>
-          <w:rFonts w:asciiTheme="minorHAnsi" w:eastAsia="SimSun" w:hAnsiTheme="minorHAnsi"/>
-          <w:noProof/>
-          <w:sz w:val="22"/>
-          <w:szCs w:val="22"/>
-          <w:lang w:eastAsia="zh-CN"/>
-        </w:rPr>
-      </w:pPr>
-      <w:hyperlink w:anchor="_Toc332112094" w:history="1">
-        <w:r>
-          <w:rPr>
-            <w:rStyle w:val="Hyperlink"/>
-            <w:rFonts w:asciiTheme="minorHAnsi" w:hAnsiTheme="minorHAnsi"/>
-            <w:noProof/>
-          </w:rPr>
-          <w:t>4.6.</w:t>
-        </w:r>
-        <w:r>
-          <w:rPr>
-            <w:rFonts w:asciiTheme="minorHAnsi" w:eastAsia="SimSun" w:hAnsiTheme="minorHAnsi"/>
-            <w:noProof/>
-            <w:sz w:val="22"/>
-            <w:szCs w:val="22"/>
-            <w:lang w:eastAsia="zh-CN"/>
-          </w:rPr>
-          <w:tab/>
-        </w:r>
-        <w:r>
-          <w:rPr>
-            <w:rStyle w:val="Hyperlink"/>
-            <w:rFonts w:asciiTheme="minorHAnsi" w:hAnsiTheme="minorHAnsi"/>
-            <w:noProof/>
-          </w:rPr>
-          <w:t>Major Project Milestones</w:t>
-        </w:r>
-        <w:r>
-          <w:rPr>
-            <w:rFonts w:asciiTheme="minorHAnsi" w:hAnsiTheme="minorHAnsi"/>
-            <w:noProof/>
-            <w:webHidden/>
-          </w:rPr>
-          <w:tab/>
-        </w:r>
-        <w:r>
-          <w:rPr>
-            <w:rFonts w:asciiTheme="minorHAnsi" w:hAnsiTheme="minorHAnsi"/>
-            <w:noProof/>
-            <w:webHidden/>
-          </w:rPr>
-          <w:fldChar w:fldCharType="begin"/>
-        </w:r>
-        <w:r>
-          <w:rPr>
-            <w:rFonts w:asciiTheme="minorHAnsi" w:hAnsiTheme="minorHAnsi"/>
-            <w:noProof/>
-            <w:webHidden/>
-          </w:rPr>
-          <w:instrText xml:space="preserve"> PAGEREF _Toc332112094 \h </w:instrText>
-        </w:r>
-        <w:r>
-          <w:rPr>
-            <w:rFonts w:asciiTheme="minorHAnsi" w:hAnsiTheme="minorHAnsi"/>
-            <w:noProof/>
-            <w:webHidden/>
-          </w:rPr>
-        </w:r>
-        <w:r>
-          <w:rPr>
-            <w:rFonts w:asciiTheme="minorHAnsi" w:hAnsiTheme="minorHAnsi"/>
-            <w:noProof/>
-            <w:webHidden/>
-          </w:rPr>
-          <w:fldChar w:fldCharType="separate"/>
-        </w:r>
-        <w:r>
-          <w:rPr>
-            <w:rFonts w:asciiTheme="minorHAnsi" w:hAnsiTheme="minorHAnsi"/>
-            <w:noProof/>
-            <w:webHidden/>
-          </w:rPr>
-          <w:t>10</w:t>
-        </w:r>
-        <w:r>
-          <w:rPr>
-            <w:rFonts w:asciiTheme="minorHAnsi" w:hAnsiTheme="minorHAnsi"/>
-            <w:noProof/>
-            <w:webHidden/>
-          </w:rPr>
-          <w:fldChar w:fldCharType="end"/>
-        </w:r>
-      </w:hyperlink>
-    </w:p>
-    <w:p>
-      <w:pPr>
-        <w:pStyle w:val="TOC1"/>
-        <w:tabs>
-          <w:tab w:val="left" w:pos="660"/>
-          <w:tab w:val="right" w:leader="dot" w:pos="9350"/>
-        </w:tabs>
-        <w:rPr>
-          <w:rFonts w:asciiTheme="minorHAnsi" w:eastAsia="SimSun" w:hAnsiTheme="minorHAnsi"/>
-          <w:noProof/>
-          <w:sz w:val="22"/>
-          <w:szCs w:val="22"/>
-          <w:lang w:eastAsia="zh-CN"/>
-        </w:rPr>
-      </w:pPr>
-      <w:hyperlink w:anchor="_Toc332112095" w:history="1">
-        <w:r>
-          <w:rPr>
-            <w:rStyle w:val="Hyperlink"/>
-            <w:rFonts w:asciiTheme="minorHAnsi" w:hAnsiTheme="minorHAnsi"/>
-            <w:smallCaps/>
-            <w:noProof/>
-          </w:rPr>
-          <w:t>5.</w:t>
-        </w:r>
-        <w:r>
-          <w:rPr>
-            <w:rFonts w:asciiTheme="minorHAnsi" w:eastAsia="SimSun" w:hAnsiTheme="minorHAnsi"/>
-            <w:noProof/>
-            <w:sz w:val="22"/>
-            <w:szCs w:val="22"/>
-            <w:lang w:eastAsia="zh-CN"/>
-          </w:rPr>
-          <w:tab/>
-        </w:r>
-        <w:r>
-          <w:rPr>
-            <w:rStyle w:val="Hyperlink"/>
-            <w:rFonts w:asciiTheme="minorHAnsi" w:hAnsiTheme="minorHAnsi"/>
-            <w:smallCaps/>
-            <w:noProof/>
-          </w:rPr>
-          <w:t>Strategic Alignment</w:t>
-        </w:r>
-        <w:r>
-          <w:rPr>
-            <w:rFonts w:asciiTheme="minorHAnsi" w:hAnsiTheme="minorHAnsi"/>
-            <w:noProof/>
-            <w:webHidden/>
-          </w:rPr>
-          <w:tab/>
-        </w:r>
-        <w:r>
-          <w:rPr>
-            <w:rFonts w:asciiTheme="minorHAnsi" w:hAnsiTheme="minorHAnsi"/>
-            <w:noProof/>
-            <w:webHidden/>
-          </w:rPr>
-          <w:fldChar w:fldCharType="begin"/>
-        </w:r>
-        <w:r>
-          <w:rPr>
-            <w:rFonts w:asciiTheme="minorHAnsi" w:hAnsiTheme="minorHAnsi"/>
-            <w:noProof/>
-            <w:webHidden/>
-          </w:rPr>
-          <w:instrText xml:space="preserve"> PAGEREF _Toc332112095 \h </w:instrText>
-        </w:r>
-        <w:r>
-          <w:rPr>
-            <w:rFonts w:asciiTheme="minorHAnsi" w:hAnsiTheme="minorHAnsi"/>
-            <w:noProof/>
-            <w:webHidden/>
-          </w:rPr>
-        </w:r>
-        <w:r>
-          <w:rPr>
-            <w:rFonts w:asciiTheme="minorHAnsi" w:hAnsiTheme="minorHAnsi"/>
-            <w:noProof/>
-            <w:webHidden/>
-          </w:rPr>
-          <w:fldChar w:fldCharType="separate"/>
-        </w:r>
-        <w:r>
-          <w:rPr>
-            <w:rFonts w:asciiTheme="minorHAnsi" w:hAnsiTheme="minorHAnsi"/>
-            <w:noProof/>
-            <w:webHidden/>
-          </w:rPr>
-          <w:t>11</w:t>
-        </w:r>
-        <w:r>
-          <w:rPr>
-            <w:rFonts w:asciiTheme="minorHAnsi" w:hAnsiTheme="minorHAnsi"/>
-            <w:noProof/>
-            <w:webHidden/>
-          </w:rPr>
-          <w:fldChar w:fldCharType="end"/>
-        </w:r>
-      </w:hyperlink>
-    </w:p>
-    <w:p>
-      <w:pPr>
-        <w:pStyle w:val="TOC1"/>
-        <w:tabs>
-          <w:tab w:val="left" w:pos="660"/>
-          <w:tab w:val="right" w:leader="dot" w:pos="9350"/>
-        </w:tabs>
-        <w:rPr>
-          <w:rFonts w:asciiTheme="minorHAnsi" w:eastAsia="SimSun" w:hAnsiTheme="minorHAnsi"/>
-          <w:noProof/>
-          <w:sz w:val="22"/>
-          <w:szCs w:val="22"/>
-          <w:lang w:eastAsia="zh-CN"/>
-        </w:rPr>
-      </w:pPr>
-      <w:hyperlink w:anchor="_Toc332112096" w:history="1">
-        <w:r>
-          <w:rPr>
-            <w:rStyle w:val="Hyperlink"/>
-            <w:rFonts w:asciiTheme="minorHAnsi" w:hAnsiTheme="minorHAnsi"/>
-            <w:smallCaps/>
-            <w:noProof/>
-          </w:rPr>
-          <w:t>6.</w:t>
-        </w:r>
-        <w:r>
-          <w:rPr>
-            <w:rFonts w:asciiTheme="minorHAnsi" w:eastAsia="SimSun" w:hAnsiTheme="minorHAnsi"/>
-            <w:noProof/>
-            <w:sz w:val="22"/>
-            <w:szCs w:val="22"/>
-            <w:lang w:eastAsia="zh-CN"/>
-          </w:rPr>
-          <w:tab/>
-        </w:r>
-        <w:r>
-          <w:rPr>
-            <w:rStyle w:val="Hyperlink"/>
-            <w:rFonts w:asciiTheme="minorHAnsi" w:hAnsiTheme="minorHAnsi"/>
-            <w:smallCaps/>
-            <w:noProof/>
-          </w:rPr>
-          <w:t>Cost Benefit Analysis</w:t>
-        </w:r>
-        <w:r>
-          <w:rPr>
-            <w:rFonts w:asciiTheme="minorHAnsi" w:hAnsiTheme="minorHAnsi"/>
-            <w:noProof/>
-            <w:webHidden/>
-          </w:rPr>
-          <w:tab/>
-        </w:r>
-        <w:r>
-          <w:rPr>
-            <w:rFonts w:asciiTheme="minorHAnsi" w:hAnsiTheme="minorHAnsi"/>
-            <w:noProof/>
-            <w:webHidden/>
-          </w:rPr>
-          <w:fldChar w:fldCharType="begin"/>
-        </w:r>
-        <w:r>
-          <w:rPr>
-            <w:rFonts w:asciiTheme="minorHAnsi" w:hAnsiTheme="minorHAnsi"/>
-            <w:noProof/>
-            <w:webHidden/>
-          </w:rPr>
-          <w:instrText xml:space="preserve"> PAGEREF _Toc332112096 \h </w:instrText>
-        </w:r>
-        <w:r>
-          <w:rPr>
-            <w:rFonts w:asciiTheme="minorHAnsi" w:hAnsiTheme="minorHAnsi"/>
-            <w:noProof/>
-            <w:webHidden/>
-          </w:rPr>
-        </w:r>
-        <w:r>
-          <w:rPr>
-            <w:rFonts w:asciiTheme="minorHAnsi" w:hAnsiTheme="minorHAnsi"/>
-            <w:noProof/>
-            <w:webHidden/>
-          </w:rPr>
-          <w:fldChar w:fldCharType="separate"/>
-        </w:r>
-        <w:r>
-          <w:rPr>
-            <w:rFonts w:asciiTheme="minorHAnsi" w:hAnsiTheme="minorHAnsi"/>
-            <w:noProof/>
-            <w:webHidden/>
-          </w:rPr>
-          <w:t>11</w:t>
-        </w:r>
-        <w:r>
-          <w:rPr>
-            <w:rFonts w:asciiTheme="minorHAnsi" w:hAnsiTheme="minorHAnsi"/>
-            <w:noProof/>
-            <w:webHidden/>
-          </w:rPr>
-          <w:fldChar w:fldCharType="end"/>
-        </w:r>
-      </w:hyperlink>
-    </w:p>
-    <w:p>
-      <w:pPr>
-        <w:pStyle w:val="TOC1"/>
-        <w:tabs>
-          <w:tab w:val="left" w:pos="660"/>
-          <w:tab w:val="right" w:leader="dot" w:pos="9350"/>
-        </w:tabs>
-        <w:rPr>
-          <w:rFonts w:asciiTheme="minorHAnsi" w:eastAsia="SimSun" w:hAnsiTheme="minorHAnsi"/>
-          <w:noProof/>
-          <w:sz w:val="22"/>
-          <w:szCs w:val="22"/>
-          <w:lang w:eastAsia="zh-CN"/>
-        </w:rPr>
-      </w:pPr>
-      <w:hyperlink w:anchor="_Toc332112097" w:history="1">
-        <w:r>
-          <w:rPr>
-            <w:rStyle w:val="Hyperlink"/>
-            <w:rFonts w:asciiTheme="minorHAnsi" w:hAnsiTheme="minorHAnsi"/>
-            <w:smallCaps/>
-            <w:noProof/>
-          </w:rPr>
-          <w:t>7.</w:t>
-        </w:r>
-        <w:r>
-          <w:rPr>
-            <w:rFonts w:asciiTheme="minorHAnsi" w:eastAsia="SimSun" w:hAnsiTheme="minorHAnsi"/>
-            <w:noProof/>
-            <w:sz w:val="22"/>
-            <w:szCs w:val="22"/>
-            <w:lang w:eastAsia="zh-CN"/>
-          </w:rPr>
-          <w:tab/>
-        </w:r>
-        <w:r>
-          <w:rPr>
-            <w:rStyle w:val="Hyperlink"/>
-            <w:rFonts w:asciiTheme="minorHAnsi" w:hAnsiTheme="minorHAnsi"/>
-            <w:smallCaps/>
-            <w:noProof/>
-          </w:rPr>
-          <w:t>Alternatives Analysis</w:t>
-        </w:r>
-        <w:r>
-          <w:rPr>
-            <w:rFonts w:asciiTheme="minorHAnsi" w:hAnsiTheme="minorHAnsi"/>
-            <w:noProof/>
-            <w:webHidden/>
-          </w:rPr>
-          <w:tab/>
-        </w:r>
-        <w:r>
-          <w:rPr>
-            <w:rFonts w:asciiTheme="minorHAnsi" w:hAnsiTheme="minorHAnsi"/>
-            <w:noProof/>
-            <w:webHidden/>
-          </w:rPr>
-          <w:fldChar w:fldCharType="begin"/>
-        </w:r>
-        <w:r>
-          <w:rPr>
-            <w:rFonts w:asciiTheme="minorHAnsi" w:hAnsiTheme="minorHAnsi"/>
-            <w:noProof/>
-            <w:webHidden/>
-          </w:rPr>
-          <w:instrText xml:space="preserve"> PAGEREF _Toc332112097 \h </w:instrText>
-        </w:r>
-        <w:r>
-          <w:rPr>
-            <w:rFonts w:asciiTheme="minorHAnsi" w:hAnsiTheme="minorHAnsi"/>
-            <w:noProof/>
-            <w:webHidden/>
-          </w:rPr>
-        </w:r>
-        <w:r>
-          <w:rPr>
-            <w:rFonts w:asciiTheme="minorHAnsi" w:hAnsiTheme="minorHAnsi"/>
-            <w:noProof/>
-            <w:webHidden/>
-          </w:rPr>
-          <w:fldChar w:fldCharType="separate"/>
-        </w:r>
-        <w:r>
-          <w:rPr>
-            <w:rFonts w:asciiTheme="minorHAnsi" w:hAnsiTheme="minorHAnsi"/>
-            <w:noProof/>
-            <w:webHidden/>
-          </w:rPr>
-          <w:t>13</w:t>
-        </w:r>
-        <w:r>
-          <w:rPr>
-            <w:rFonts w:asciiTheme="minorHAnsi" w:hAnsiTheme="minorHAnsi"/>
-            <w:noProof/>
-            <w:webHidden/>
-          </w:rPr>
-          <w:fldChar w:fldCharType="end"/>
-        </w:r>
-      </w:hyperlink>
-    </w:p>
-    <w:p>
-      <w:pPr>
-        <w:pStyle w:val="TOC1"/>
-        <w:tabs>
-          <w:tab w:val="left" w:pos="660"/>
-          <w:tab w:val="right" w:leader="dot" w:pos="9350"/>
-        </w:tabs>
-        <w:rPr>
-          <w:rFonts w:asciiTheme="minorHAnsi" w:eastAsia="SimSun" w:hAnsiTheme="minorHAnsi"/>
-          <w:noProof/>
-          <w:sz w:val="22"/>
-          <w:szCs w:val="22"/>
-          <w:lang w:eastAsia="zh-CN"/>
-        </w:rPr>
-      </w:pPr>
-      <w:hyperlink w:anchor="_Toc332112098" w:history="1">
-        <w:r>
-          <w:rPr>
-            <w:rStyle w:val="Hyperlink"/>
-            <w:rFonts w:asciiTheme="minorHAnsi" w:hAnsiTheme="minorHAnsi"/>
-            <w:smallCaps/>
-            <w:noProof/>
-          </w:rPr>
-          <w:t>8.</w:t>
-        </w:r>
-        <w:r>
-          <w:rPr>
-            <w:rFonts w:asciiTheme="minorHAnsi" w:eastAsia="SimSun" w:hAnsiTheme="minorHAnsi"/>
-            <w:noProof/>
-            <w:sz w:val="22"/>
-            <w:szCs w:val="22"/>
-            <w:lang w:eastAsia="zh-CN"/>
-          </w:rPr>
-          <w:tab/>
-        </w:r>
-        <w:r>
-          <w:rPr>
-            <w:rStyle w:val="Hyperlink"/>
-            <w:rFonts w:asciiTheme="minorHAnsi" w:hAnsiTheme="minorHAnsi"/>
-            <w:smallCaps/>
-            <w:noProof/>
-          </w:rPr>
-          <w:t>Approvals</w:t>
-        </w:r>
-        <w:r>
-          <w:rPr>
-            <w:rFonts w:asciiTheme="minorHAnsi" w:hAnsiTheme="minorHAnsi"/>
-            <w:noProof/>
-            <w:webHidden/>
-          </w:rPr>
-          <w:tab/>
-        </w:r>
-        <w:r>
-          <w:rPr>
-            <w:rFonts w:asciiTheme="minorHAnsi" w:hAnsiTheme="minorHAnsi"/>
-            <w:noProof/>
-            <w:webHidden/>
-          </w:rPr>
-          <w:fldChar w:fldCharType="begin"/>
-        </w:r>
-        <w:r>
-          <w:rPr>
-            <w:rFonts w:asciiTheme="minorHAnsi" w:hAnsiTheme="minorHAnsi"/>
-            <w:noProof/>
-            <w:webHidden/>
-          </w:rPr>
-          <w:instrText xml:space="preserve"> PAGEREF _Toc332112098 \h </w:instrText>
-        </w:r>
-        <w:r>
-          <w:rPr>
-            <w:rFonts w:asciiTheme="minorHAnsi" w:hAnsiTheme="minorHAnsi"/>
-            <w:noProof/>
-            <w:webHidden/>
-          </w:rPr>
-        </w:r>
-        <w:r>
-          <w:rPr>
-            <w:rFonts w:asciiTheme="minorHAnsi" w:hAnsiTheme="minorHAnsi"/>
-            <w:noProof/>
-            <w:webHidden/>
-          </w:rPr>
-          <w:fldChar w:fldCharType="separate"/>
-        </w:r>
-        <w:r>
-          <w:rPr>
-            <w:rFonts w:asciiTheme="minorHAnsi" w:hAnsiTheme="minorHAnsi"/>
-            <w:noProof/>
-            <w:webHidden/>
-          </w:rPr>
-          <w:t>13</w:t>
-        </w:r>
-        <w:r>
-          <w:rPr>
-            <w:rFonts w:asciiTheme="minorHAnsi" w:hAnsiTheme="minorHAnsi"/>
             <w:noProof/>
             <w:webHidden/>
           </w:rPr>
@@ -2482,7 +1296,7 @@
         </w:rPr>
         <w:br w:type="page"/>
       </w:r>
-      <w:bookmarkStart w:id="0" w:name="_Toc332112078"/>
+      <w:bookmarkStart w:id="0" w:name="_Toc224909757"/>
       <w:r>
         <w:rPr>
           <w:rFonts w:asciiTheme="minorHAnsi" w:hAnsiTheme="minorHAnsi"/>
@@ -2535,7 +1349,7 @@
           <w:szCs w:val="24"/>
         </w:rPr>
       </w:pPr>
-      <w:bookmarkStart w:id="1" w:name="_Toc332112079"/>
+      <w:bookmarkStart w:id="1" w:name="_Toc224909758"/>
       <w:r>
         <w:rPr>
           <w:rFonts w:asciiTheme="minorHAnsi" w:hAnsiTheme="minorHAnsi"/>
@@ -2589,7 +1403,7 @@
           <w:szCs w:val="24"/>
         </w:rPr>
       </w:pPr>
-      <w:bookmarkStart w:id="2" w:name="_Toc332112080"/>
+      <w:bookmarkStart w:id="2" w:name="_Toc224909759"/>
       <w:r>
         <w:rPr>
           <w:rFonts w:asciiTheme="minorHAnsi" w:hAnsiTheme="minorHAnsi"/>
@@ -2631,7 +1445,7 @@
           <w:szCs w:val="24"/>
         </w:rPr>
       </w:pPr>
-      <w:bookmarkStart w:id="3" w:name="_Toc332112082"/>
+      <w:bookmarkStart w:id="3" w:name="_Toc224909760"/>
       <w:r>
         <w:rPr>
           <w:rFonts w:asciiTheme="minorHAnsi" w:hAnsiTheme="minorHAnsi"/>
@@ -2686,7 +1500,7 @@
           <w:szCs w:val="28"/>
         </w:rPr>
       </w:pPr>
-      <w:bookmarkStart w:id="4" w:name="_Toc332112083"/>
+      <w:bookmarkStart w:id="4" w:name="_Toc224909761"/>
       <w:r>
         <w:rPr>
           <w:rFonts w:asciiTheme="minorHAnsi" w:hAnsiTheme="minorHAnsi"/>
@@ -3026,6 +1840,71 @@
               <w:rPr>
                 <w:rFonts w:asciiTheme="minorHAnsi" w:hAnsiTheme="minorHAnsi"/>
               </w:rPr>
+              <w:t>Jackson Rosco</w:t>
+            </w:r>
+          </w:p>
+        </w:tc>
+      </w:tr>
+      <w:tr>
+        <w:trPr>
+          <w:cantSplit/>
+        </w:trPr>
+        <w:tc>
+          <w:tcPr>
+            <w:tcW w:w="2340" w:type="dxa"/>
+            <w:vAlign w:val="center"/>
+          </w:tcPr>
+          <w:p>
+            <w:pPr>
+              <w:pStyle w:val="TableText"/>
+              <w:rPr>
+                <w:rFonts w:asciiTheme="minorHAnsi" w:hAnsiTheme="minorHAnsi"/>
+              </w:rPr>
+            </w:pPr>
+            <w:r>
+              <w:rPr>
+                <w:rFonts w:asciiTheme="minorHAnsi" w:hAnsiTheme="minorHAnsi"/>
+              </w:rPr>
+              <w:t>Programmer</w:t>
+            </w:r>
+          </w:p>
+        </w:tc>
+        <w:tc>
+          <w:tcPr>
+            <w:tcW w:w="3420" w:type="dxa"/>
+            <w:vAlign w:val="center"/>
+          </w:tcPr>
+          <w:p>
+            <w:pPr>
+              <w:pStyle w:val="TableText"/>
+              <w:rPr>
+                <w:rFonts w:asciiTheme="minorHAnsi" w:hAnsiTheme="minorHAnsi"/>
+              </w:rPr>
+            </w:pPr>
+            <w:r>
+              <w:rPr>
+                <w:rFonts w:asciiTheme="minorHAnsi" w:hAnsiTheme="minorHAnsi"/>
+              </w:rPr>
+              <w:t>Completes project requirements</w:t>
+            </w:r>
+          </w:p>
+        </w:tc>
+        <w:tc>
+          <w:tcPr>
+            <w:tcW w:w="3060" w:type="dxa"/>
+            <w:vAlign w:val="center"/>
+          </w:tcPr>
+          <w:p>
+            <w:pPr>
+              <w:pStyle w:val="TableText"/>
+              <w:rPr>
+                <w:rFonts w:asciiTheme="minorHAnsi" w:hAnsiTheme="minorHAnsi"/>
+              </w:rPr>
+            </w:pPr>
+            <w:r>
+              <w:rPr>
+                <w:rFonts w:asciiTheme="minorHAnsi" w:hAnsiTheme="minorHAnsi"/>
+              </w:rPr>
               <w:t>Daemon Lewis</w:t>
             </w:r>
           </w:p>
@@ -3051,6 +1930,7 @@
               <w:rPr>
                 <w:rFonts w:asciiTheme="minorHAnsi" w:hAnsiTheme="minorHAnsi"/>
               </w:rPr>
+              <w:lastRenderedPageBreak/>
               <w:t>Programmer</w:t>
             </w:r>
           </w:p>
@@ -3114,7 +1994,7 @@
           <w:szCs w:val="28"/>
         </w:rPr>
       </w:pPr>
-      <w:bookmarkStart w:id="6" w:name="_Toc332112088"/>
+      <w:bookmarkStart w:id="6" w:name="_Toc224909762"/>
       <w:r>
         <w:rPr>
           <w:rFonts w:asciiTheme="minorHAnsi" w:hAnsiTheme="minorHAnsi"/>
@@ -3122,7 +2002,6 @@
           <w:sz w:val="28"/>
           <w:szCs w:val="28"/>
         </w:rPr>
-        <w:lastRenderedPageBreak/>
         <w:t>Project Overview</w:t>
       </w:r>
       <w:bookmarkEnd w:id="6"/>
@@ -3149,7 +2028,7 @@
         </w:rPr>
       </w:pPr>
       <w:bookmarkStart w:id="7" w:name="_Toc261333355"/>
-      <w:bookmarkStart w:id="8" w:name="_Toc332112089"/>
+      <w:bookmarkStart w:id="8" w:name="_Toc224909763"/>
       <w:r>
         <w:rPr>
           <w:rFonts w:asciiTheme="minorHAnsi" w:hAnsiTheme="minorHAnsi"/>
@@ -3204,7 +2083,7 @@
           <w:szCs w:val="24"/>
         </w:rPr>
       </w:pPr>
-      <w:bookmarkStart w:id="9" w:name="_Toc332112090"/>
+      <w:bookmarkStart w:id="9" w:name="_Toc224909764"/>
       <w:r>
         <w:rPr>
           <w:rFonts w:asciiTheme="minorHAnsi" w:hAnsiTheme="minorHAnsi"/>
@@ -3273,7 +2152,6 @@
           <w:szCs w:val="24"/>
         </w:rPr>
       </w:pPr>
-      <w:bookmarkStart w:id="10" w:name="_Toc332112092"/>
     </w:p>
     <w:p>
       <w:pPr>
@@ -3289,6 +2167,7 @@
           <w:szCs w:val="24"/>
         </w:rPr>
       </w:pPr>
+      <w:bookmarkStart w:id="10" w:name="_Toc224909765"/>
       <w:r>
         <w:rPr>
           <w:rFonts w:asciiTheme="minorHAnsi" w:hAnsiTheme="minorHAnsi"/>
@@ -3464,7 +2343,7 @@
           <w:szCs w:val="28"/>
         </w:rPr>
       </w:pPr>
-      <w:bookmarkStart w:id="11" w:name="_Toc332112095"/>
+      <w:bookmarkStart w:id="11" w:name="_Toc224909766"/>
       <w:r>
         <w:rPr>
           <w:rFonts w:asciiTheme="minorHAnsi" w:hAnsiTheme="minorHAnsi"/>
@@ -3472,7 +2351,6 @@
           <w:sz w:val="28"/>
           <w:szCs w:val="28"/>
         </w:rPr>
-        <w:lastRenderedPageBreak/>
         <w:t>Strategic Alignment</w:t>
       </w:r>
       <w:bookmarkEnd w:id="11"/>
@@ -3741,7 +2619,7 @@
           <w:szCs w:val="28"/>
         </w:rPr>
       </w:pPr>
-      <w:bookmarkStart w:id="12" w:name="_Toc332112096"/>
+      <w:bookmarkStart w:id="12" w:name="_Toc224909767"/>
       <w:r>
         <w:rPr>
           <w:rFonts w:asciiTheme="minorHAnsi" w:hAnsiTheme="minorHAnsi"/>
@@ -3751,7 +2629,6 @@
         </w:rPr>
         <w:t>Cost Benefit Analysis</w:t>
       </w:r>
-      <w:bookmarkEnd w:id="12"/>
       <w:r>
         <w:rPr>
           <w:rFonts w:asciiTheme="minorHAnsi" w:hAnsiTheme="minorHAnsi"/>
@@ -3761,6 +2638,7 @@
         </w:rPr>
         <w:t xml:space="preserve"> / Alternatives Analysis</w:t>
       </w:r>
+      <w:bookmarkEnd w:id="12"/>
     </w:p>
     <w:p>
       <w:pPr>
@@ -3800,8 +2678,8 @@
       </w:r>
     </w:p>
     <w:sectPr>
-      <w:headerReference w:type="default" r:id="rId8"/>
-      <w:footerReference w:type="default" r:id="rId9"/>
+      <w:headerReference w:type="default" r:id="rId7"/>
+      <w:footerReference w:type="default" r:id="rId8"/>
       <w:pgSz w:w="12240" w:h="15840"/>
       <w:pgMar w:top="2601" w:right="1440" w:bottom="1440" w:left="1440" w:header="720" w:footer="720" w:gutter="0"/>
       <w:cols w:space="720"/>
@@ -5893,6 +4771,7 @@
   <w:style w:type="character" w:default="1" w:styleId="DefaultParagraphFont">
     <w:name w:val="Default Paragraph Font"/>
     <w:uiPriority w:val="1"/>
+    <w:semiHidden/>
     <w:unhideWhenUsed/>
   </w:style>
   <w:style w:type="table" w:default="1" w:styleId="TableNormal">

</xml_diff>

<commit_message>
Add project report and update document cover pages
</commit_message>
<xml_diff>
--- a/doc/Business Case.docx
+++ b/doc/Business Case.docx
@@ -30,6 +30,7 @@
           <w:smallCaps/>
           <w:sz w:val="36"/>
           <w:szCs w:val="36"/>
+          <w:lang w:val="en-CA"/>
         </w:rPr>
       </w:pPr>
       <w:r>
@@ -38,9 +39,22 @@
           <w:smallCaps/>
           <w:sz w:val="36"/>
           <w:szCs w:val="36"/>
+          <w:lang w:val="en-CA"/>
         </w:rPr>
         <w:t>Business Case</w:t>
       </w:r>
+    </w:p>
+    <w:p>
+      <w:pPr>
+        <w:jc w:val="center"/>
+        <w:rPr>
+          <w:b/>
+          <w:smallCaps/>
+          <w:sz w:val="36"/>
+          <w:szCs w:val="36"/>
+          <w:lang w:val="en-CA"/>
+        </w:rPr>
+      </w:pPr>
     </w:p>
     <w:p>
       <w:pPr>
@@ -50,6 +64,7 @@
           <w:smallCaps/>
           <w:sz w:val="28"/>
           <w:szCs w:val="28"/>
+          <w:lang w:val="en-CA"/>
         </w:rPr>
       </w:pPr>
       <w:r>
@@ -58,6 +73,7 @@
           <w:smallCaps/>
           <w:sz w:val="28"/>
           <w:szCs w:val="28"/>
+          <w:lang w:val="en-CA"/>
         </w:rPr>
         <w:t>Data Warehousing Project</w:t>
       </w:r>
@@ -70,19 +86,19 @@
           <w:smallCaps/>
           <w:sz w:val="28"/>
           <w:szCs w:val="28"/>
-        </w:rPr>
-      </w:pPr>
-    </w:p>
-    <w:p>
-      <w:pPr>
-        <w:jc w:val="center"/>
+          <w:lang w:val="en-CA"/>
+        </w:rPr>
+      </w:pPr>
+      <w:r>
         <w:rPr>
           <w:b/>
           <w:smallCaps/>
           <w:sz w:val="28"/>
           <w:szCs w:val="28"/>
-        </w:rPr>
-      </w:pPr>
+          <w:lang w:val="en-CA"/>
+        </w:rPr>
+        <w:t>Data Warehousing Team</w:t>
+      </w:r>
     </w:p>
     <w:p>
       <w:pPr>
@@ -92,19 +108,30 @@
           <w:smallCaps/>
           <w:sz w:val="28"/>
           <w:szCs w:val="28"/>
-        </w:rPr>
-      </w:pPr>
-    </w:p>
-    <w:p>
-      <w:pPr>
-        <w:jc w:val="center"/>
+          <w:lang w:val="en-CA"/>
+        </w:rPr>
+      </w:pPr>
+      <w:r>
+        <w:rPr>
+          <w:b/>
+          <w:bCs/>
+          <w:smallCaps/>
+          <w:sz w:val="28"/>
+          <w:szCs w:val="28"/>
+          <w:lang w:val="en-CA"/>
+        </w:rPr>
+        <w:t>Organization:</w:t>
+      </w:r>
+      <w:r>
         <w:rPr>
           <w:b/>
           <w:smallCaps/>
           <w:sz w:val="28"/>
           <w:szCs w:val="28"/>
-        </w:rPr>
-      </w:pPr>
+          <w:lang w:val="en-CA"/>
+        </w:rPr>
+        <w:t xml:space="preserve"> Okanagan College</w:t>
+      </w:r>
     </w:p>
     <w:p>
       <w:pPr>
@@ -114,16 +141,29 @@
           <w:smallCaps/>
           <w:sz w:val="28"/>
           <w:szCs w:val="28"/>
-        </w:rPr>
-      </w:pPr>
+          <w:lang w:val="en-CA"/>
+        </w:rPr>
+      </w:pPr>
+      <w:r>
+        <w:rPr>
+          <w:b/>
+          <w:bCs/>
+          <w:smallCaps/>
+          <w:sz w:val="28"/>
+          <w:szCs w:val="28"/>
+          <w:lang w:val="en-CA"/>
+        </w:rPr>
+        <w:t>Course:</w:t>
+      </w:r>
       <w:r>
         <w:rPr>
           <w:b/>
           <w:smallCaps/>
           <w:sz w:val="28"/>
           <w:szCs w:val="28"/>
-        </w:rPr>
-        <w:t>Data Warehousing Team</w:t>
+          <w:lang w:val="en-CA"/>
+        </w:rPr>
+        <w:t xml:space="preserve"> COSC471</w:t>
       </w:r>
     </w:p>
     <w:p>
@@ -134,19 +174,30 @@
           <w:smallCaps/>
           <w:sz w:val="28"/>
           <w:szCs w:val="28"/>
-        </w:rPr>
-      </w:pPr>
-    </w:p>
-    <w:p>
-      <w:pPr>
-        <w:jc w:val="center"/>
+          <w:lang w:val="en-CA"/>
+        </w:rPr>
+      </w:pPr>
+      <w:r>
+        <w:rPr>
+          <w:b/>
+          <w:bCs/>
+          <w:smallCaps/>
+          <w:sz w:val="28"/>
+          <w:szCs w:val="28"/>
+          <w:lang w:val="en-CA"/>
+        </w:rPr>
+        <w:t>Team Members:</w:t>
+      </w:r>
+      <w:r>
         <w:rPr>
           <w:b/>
           <w:smallCaps/>
           <w:sz w:val="28"/>
           <w:szCs w:val="28"/>
-        </w:rPr>
-      </w:pPr>
+          <w:lang w:val="en-CA"/>
+        </w:rPr>
+        <w:t xml:space="preserve"> Alex Anthony, John Cortez, Daemon Lewis, Hayden Nikkel, Jackson Rosco</w:t>
+      </w:r>
     </w:p>
     <w:p>
       <w:pPr>
@@ -156,36 +207,74 @@
           <w:smallCaps/>
           <w:sz w:val="28"/>
           <w:szCs w:val="28"/>
-        </w:rPr>
-      </w:pPr>
+          <w:lang w:val="en-CA"/>
+        </w:rPr>
+      </w:pPr>
+      <w:r>
+        <w:rPr>
+          <w:b/>
+          <w:bCs/>
+          <w:smallCaps/>
+          <w:sz w:val="28"/>
+          <w:szCs w:val="28"/>
+          <w:lang w:val="en-CA"/>
+        </w:rPr>
+        <w:t>Year:</w:t>
+      </w:r>
       <w:r>
         <w:rPr>
           <w:b/>
           <w:smallCaps/>
           <w:sz w:val="28"/>
           <w:szCs w:val="28"/>
-        </w:rPr>
-        <w:t>February 11</w:t>
-      </w:r>
-      <w:r>
+          <w:lang w:val="en-CA"/>
+        </w:rPr>
+        <w:t xml:space="preserve"> 2026</w:t>
+      </w:r>
+    </w:p>
+    <w:p>
+      <w:pPr>
+        <w:jc w:val="center"/>
         <w:rPr>
           <w:b/>
           <w:smallCaps/>
           <w:sz w:val="28"/>
           <w:szCs w:val="28"/>
-          <w:vertAlign w:val="superscript"/>
-        </w:rPr>
-        <w:t>th</w:t>
-      </w:r>
-      <w:r>
+        </w:rPr>
+      </w:pPr>
+    </w:p>
+    <w:p>
+      <w:pPr>
+        <w:jc w:val="center"/>
         <w:rPr>
           <w:b/>
           <w:smallCaps/>
           <w:sz w:val="28"/>
           <w:szCs w:val="28"/>
         </w:rPr>
-        <w:t>, 2026</w:t>
-      </w:r>
+      </w:pPr>
+    </w:p>
+    <w:p>
+      <w:pPr>
+        <w:jc w:val="center"/>
+        <w:rPr>
+          <w:b/>
+          <w:smallCaps/>
+          <w:sz w:val="28"/>
+          <w:szCs w:val="28"/>
+        </w:rPr>
+      </w:pPr>
+    </w:p>
+    <w:p>
+      <w:pPr>
+        <w:jc w:val="center"/>
+        <w:rPr>
+          <w:b/>
+          <w:smallCaps/>
+          <w:sz w:val="28"/>
+          <w:szCs w:val="28"/>
+        </w:rPr>
+      </w:pPr>
     </w:p>
     <w:p>
       <w:r>
@@ -4771,7 +4860,6 @@
   <w:style w:type="character" w:default="1" w:styleId="DefaultParagraphFont">
     <w:name w:val="Default Paragraph Font"/>
     <w:uiPriority w:val="1"/>
-    <w:semiHidden/>
     <w:unhideWhenUsed/>
   </w:style>
   <w:style w:type="table" w:default="1" w:styleId="TableNormal">
@@ -4957,6 +5045,48 @@
       <w:ind w:left="720"/>
       <w:contextualSpacing/>
     </w:pPr>
+  </w:style>
+  <w:style w:type="paragraph" w:styleId="Subtitle">
+    <w:name w:val="Subtitle"/>
+    <w:basedOn w:val="Normal"/>
+    <w:next w:val="Normal"/>
+    <w:link w:val="SubtitleChar"/>
+    <w:uiPriority w:val="11"/>
+    <w:qFormat/>
+    <w:rsid w:val="00783930"/>
+    <w:pPr>
+      <w:numPr>
+        <w:ilvl w:val="1"/>
+      </w:numPr>
+      <w:spacing w:after="160" w:line="259" w:lineRule="auto"/>
+    </w:pPr>
+    <w:rPr>
+      <w:rFonts w:eastAsiaTheme="majorEastAsia" w:cstheme="majorBidi"/>
+      <w:color w:val="595959" w:themeColor="text1" w:themeTint="A6"/>
+      <w:spacing w:val="15"/>
+      <w:kern w:val="2"/>
+      <w:sz w:val="28"/>
+      <w:szCs w:val="28"/>
+      <w:lang w:val="en-CA"/>
+      <w14:ligatures w14:val="standardContextual"/>
+    </w:rPr>
+  </w:style>
+  <w:style w:type="character" w:customStyle="1" w:styleId="SubtitleChar">
+    <w:name w:val="Subtitle Char"/>
+    <w:basedOn w:val="DefaultParagraphFont"/>
+    <w:link w:val="Subtitle"/>
+    <w:uiPriority w:val="11"/>
+    <w:rsid w:val="00783930"/>
+    <w:rPr>
+      <w:rFonts w:eastAsiaTheme="majorEastAsia" w:cstheme="majorBidi"/>
+      <w:color w:val="595959" w:themeColor="text1" w:themeTint="A6"/>
+      <w:spacing w:val="15"/>
+      <w:kern w:val="2"/>
+      <w:sz w:val="28"/>
+      <w:szCs w:val="28"/>
+      <w:lang w:val="en-CA"/>
+      <w14:ligatures w14:val="standardContextual"/>
+    </w:rPr>
   </w:style>
 </w:styles>
 </file>

</xml_diff>

<commit_message>
added more documents to deliverables
</commit_message>
<xml_diff>
--- a/doc/Business Case.docx
+++ b/doc/Business Case.docx
@@ -281,1087 +281,1089 @@
         <w:br w:type="page"/>
       </w:r>
     </w:p>
-    <w:p/>
-    <w:p>
-      <w:pPr>
-        <w:rPr>
+    <w:sdt>
+      <w:sdtPr>
+        <w:id w:val="490983791"/>
+        <w:docPartObj>
+          <w:docPartGallery w:val="Table of Contents"/>
+          <w:docPartUnique/>
+        </w:docPartObj>
+      </w:sdtPr>
+      <w:sdtEndPr>
+        <w:rPr>
+          <w:rFonts w:asciiTheme="minorHAnsi" w:eastAsiaTheme="minorHAnsi" w:hAnsiTheme="minorHAnsi" w:cstheme="minorBidi"/>
           <w:b/>
-          <w:smallCaps/>
-          <w:sz w:val="28"/>
-          <w:szCs w:val="28"/>
-        </w:rPr>
-      </w:pPr>
-      <w:r>
-        <w:rPr>
-          <w:b/>
-          <w:smallCaps/>
-          <w:sz w:val="28"/>
-          <w:szCs w:val="28"/>
-        </w:rPr>
-        <w:t>Table of Contents</w:t>
-      </w:r>
-    </w:p>
-    <w:p>
-      <w:pPr>
-        <w:pStyle w:val="TOC1"/>
-        <w:tabs>
-          <w:tab w:val="left" w:pos="480"/>
-          <w:tab w:val="right" w:leader="dot" w:pos="9350"/>
-        </w:tabs>
-        <w:rPr>
-          <w:rFonts w:asciiTheme="minorHAnsi" w:eastAsiaTheme="minorEastAsia" w:hAnsiTheme="minorHAnsi" w:cstheme="minorBidi"/>
+          <w:bCs/>
           <w:noProof/>
-          <w:kern w:val="2"/>
-          <w:szCs w:val="24"/>
-          <w:lang w:val="en-CA" w:eastAsia="en-CA"/>
-          <w14:ligatures w14:val="standardContextual"/>
-        </w:rPr>
-      </w:pPr>
-      <w:r>
-        <w:rPr>
-          <w:rFonts w:asciiTheme="minorHAnsi" w:hAnsiTheme="minorHAnsi"/>
-        </w:rPr>
-        <w:fldChar w:fldCharType="begin"/>
-      </w:r>
-      <w:r>
-        <w:rPr>
-          <w:rFonts w:asciiTheme="minorHAnsi" w:hAnsiTheme="minorHAnsi"/>
-        </w:rPr>
-        <w:instrText xml:space="preserve"> TOC \o "1-3" \h \z \u </w:instrText>
-      </w:r>
-      <w:r>
-        <w:rPr>
-          <w:rFonts w:asciiTheme="minorHAnsi" w:hAnsiTheme="minorHAnsi"/>
-        </w:rPr>
-        <w:fldChar w:fldCharType="separate"/>
-      </w:r>
-      <w:hyperlink w:anchor="_Toc224909757" w:history="1">
-        <w:r>
-          <w:rPr>
-            <w:rStyle w:val="Hyperlink"/>
-            <w:smallCaps/>
-            <w:noProof/>
-          </w:rPr>
-          <w:t>1.</w:t>
-        </w:r>
-        <w:r>
-          <w:rPr>
-            <w:rFonts w:asciiTheme="minorHAnsi" w:eastAsiaTheme="minorEastAsia" w:hAnsiTheme="minorHAnsi" w:cstheme="minorBidi"/>
-            <w:noProof/>
-            <w:kern w:val="2"/>
-            <w:szCs w:val="24"/>
-            <w:lang w:val="en-CA" w:eastAsia="en-CA"/>
-            <w14:ligatures w14:val="standardContextual"/>
-          </w:rPr>
-          <w:tab/>
-        </w:r>
-        <w:r>
-          <w:rPr>
-            <w:rStyle w:val="Hyperlink"/>
-            <w:smallCaps/>
-            <w:noProof/>
-          </w:rPr>
-          <w:t>Executive Summary</w:t>
-        </w:r>
-        <w:r>
-          <w:rPr>
-            <w:noProof/>
-            <w:webHidden/>
-          </w:rPr>
-          <w:tab/>
-        </w:r>
-        <w:r>
-          <w:rPr>
-            <w:noProof/>
-            <w:webHidden/>
-          </w:rPr>
-          <w:fldChar w:fldCharType="begin"/>
-        </w:r>
-        <w:r>
-          <w:rPr>
-            <w:noProof/>
-            <w:webHidden/>
-          </w:rPr>
-          <w:instrText xml:space="preserve"> PAGEREF _Toc224909757 \h </w:instrText>
-        </w:r>
-        <w:r>
-          <w:rPr>
-            <w:noProof/>
-            <w:webHidden/>
-          </w:rPr>
-        </w:r>
-        <w:r>
-          <w:rPr>
-            <w:noProof/>
-            <w:webHidden/>
-          </w:rPr>
-          <w:fldChar w:fldCharType="separate"/>
-        </w:r>
-        <w:r>
-          <w:rPr>
-            <w:noProof/>
-            <w:webHidden/>
-          </w:rPr>
-          <w:t>3</w:t>
-        </w:r>
-        <w:r>
-          <w:rPr>
-            <w:noProof/>
-            <w:webHidden/>
-          </w:rPr>
-          <w:fldChar w:fldCharType="end"/>
-        </w:r>
-      </w:hyperlink>
-    </w:p>
-    <w:p>
-      <w:pPr>
-        <w:pStyle w:val="TOC2"/>
-        <w:tabs>
-          <w:tab w:val="left" w:pos="960"/>
-          <w:tab w:val="right" w:leader="dot" w:pos="9350"/>
-        </w:tabs>
-        <w:rPr>
-          <w:rFonts w:asciiTheme="minorHAnsi" w:eastAsiaTheme="minorEastAsia" w:hAnsiTheme="minorHAnsi" w:cstheme="minorBidi"/>
-          <w:noProof/>
-          <w:kern w:val="2"/>
+          <w:color w:val="auto"/>
           <w:sz w:val="24"/>
           <w:szCs w:val="24"/>
-          <w:lang w:val="en-CA" w:eastAsia="en-CA"/>
-          <w14:ligatures w14:val="standardContextual"/>
-        </w:rPr>
-      </w:pPr>
-      <w:hyperlink w:anchor="_Toc224909758" w:history="1">
-        <w:r>
-          <w:rPr>
-            <w:rStyle w:val="Hyperlink"/>
-            <w:noProof/>
-          </w:rPr>
-          <w:t>1.1.</w:t>
-        </w:r>
-        <w:r>
-          <w:rPr>
-            <w:rFonts w:asciiTheme="minorHAnsi" w:eastAsiaTheme="minorEastAsia" w:hAnsiTheme="minorHAnsi" w:cstheme="minorBidi"/>
-            <w:noProof/>
-            <w:kern w:val="2"/>
-            <w:sz w:val="24"/>
-            <w:szCs w:val="24"/>
-            <w:lang w:val="en-CA" w:eastAsia="en-CA"/>
-            <w14:ligatures w14:val="standardContextual"/>
-          </w:rPr>
-          <w:tab/>
-        </w:r>
-        <w:r>
-          <w:rPr>
-            <w:rStyle w:val="Hyperlink"/>
-            <w:noProof/>
-          </w:rPr>
-          <w:t>Issue</w:t>
-        </w:r>
-        <w:r>
-          <w:rPr>
-            <w:noProof/>
-            <w:webHidden/>
-          </w:rPr>
-          <w:tab/>
-        </w:r>
-        <w:r>
-          <w:rPr>
-            <w:noProof/>
-            <w:webHidden/>
-          </w:rPr>
-          <w:fldChar w:fldCharType="begin"/>
-        </w:r>
-        <w:r>
-          <w:rPr>
-            <w:noProof/>
-            <w:webHidden/>
-          </w:rPr>
-          <w:instrText xml:space="preserve"> PAGEREF _Toc224909758 \h </w:instrText>
-        </w:r>
-        <w:r>
-          <w:rPr>
-            <w:noProof/>
-            <w:webHidden/>
-          </w:rPr>
-        </w:r>
-        <w:r>
-          <w:rPr>
-            <w:noProof/>
-            <w:webHidden/>
-          </w:rPr>
-          <w:fldChar w:fldCharType="separate"/>
-        </w:r>
-        <w:r>
-          <w:rPr>
-            <w:noProof/>
-            <w:webHidden/>
-          </w:rPr>
-          <w:t>3</w:t>
-        </w:r>
-        <w:r>
-          <w:rPr>
-            <w:noProof/>
-            <w:webHidden/>
-          </w:rPr>
-          <w:fldChar w:fldCharType="end"/>
-        </w:r>
-      </w:hyperlink>
-    </w:p>
-    <w:p>
-      <w:pPr>
-        <w:pStyle w:val="TOC2"/>
-        <w:tabs>
-          <w:tab w:val="left" w:pos="960"/>
-          <w:tab w:val="right" w:leader="dot" w:pos="9350"/>
-        </w:tabs>
-        <w:rPr>
-          <w:rFonts w:asciiTheme="minorHAnsi" w:eastAsiaTheme="minorEastAsia" w:hAnsiTheme="minorHAnsi" w:cstheme="minorBidi"/>
-          <w:noProof/>
-          <w:kern w:val="2"/>
-          <w:sz w:val="24"/>
-          <w:szCs w:val="24"/>
-          <w:lang w:val="en-CA" w:eastAsia="en-CA"/>
-          <w14:ligatures w14:val="standardContextual"/>
-        </w:rPr>
-      </w:pPr>
-      <w:hyperlink w:anchor="_Toc224909759" w:history="1">
-        <w:r>
-          <w:rPr>
-            <w:rStyle w:val="Hyperlink"/>
-            <w:noProof/>
-          </w:rPr>
-          <w:t>1.2.</w:t>
-        </w:r>
-        <w:r>
-          <w:rPr>
-            <w:rFonts w:asciiTheme="minorHAnsi" w:eastAsiaTheme="minorEastAsia" w:hAnsiTheme="minorHAnsi" w:cstheme="minorBidi"/>
-            <w:noProof/>
-            <w:kern w:val="2"/>
-            <w:sz w:val="24"/>
-            <w:szCs w:val="24"/>
-            <w:lang w:val="en-CA" w:eastAsia="en-CA"/>
-            <w14:ligatures w14:val="standardContextual"/>
-          </w:rPr>
-          <w:tab/>
-        </w:r>
-        <w:r>
-          <w:rPr>
-            <w:rStyle w:val="Hyperlink"/>
-            <w:noProof/>
-          </w:rPr>
-          <w:t>Anticipated Outcomes</w:t>
-        </w:r>
-        <w:r>
-          <w:rPr>
-            <w:noProof/>
-            <w:webHidden/>
-          </w:rPr>
-          <w:tab/>
-        </w:r>
-        <w:r>
-          <w:rPr>
-            <w:noProof/>
-            <w:webHidden/>
-          </w:rPr>
-          <w:fldChar w:fldCharType="begin"/>
-        </w:r>
-        <w:r>
-          <w:rPr>
-            <w:noProof/>
-            <w:webHidden/>
-          </w:rPr>
-          <w:instrText xml:space="preserve"> PAGEREF _Toc224909759 \h </w:instrText>
-        </w:r>
-        <w:r>
-          <w:rPr>
-            <w:noProof/>
-            <w:webHidden/>
-          </w:rPr>
-        </w:r>
-        <w:r>
-          <w:rPr>
-            <w:noProof/>
-            <w:webHidden/>
-          </w:rPr>
-          <w:fldChar w:fldCharType="separate"/>
-        </w:r>
-        <w:r>
-          <w:rPr>
-            <w:noProof/>
-            <w:webHidden/>
-          </w:rPr>
-          <w:t>3</w:t>
-        </w:r>
-        <w:r>
-          <w:rPr>
-            <w:noProof/>
-            <w:webHidden/>
-          </w:rPr>
-          <w:fldChar w:fldCharType="end"/>
-        </w:r>
-      </w:hyperlink>
-    </w:p>
-    <w:p>
-      <w:pPr>
-        <w:pStyle w:val="TOC2"/>
-        <w:tabs>
-          <w:tab w:val="left" w:pos="960"/>
-          <w:tab w:val="right" w:leader="dot" w:pos="9350"/>
-        </w:tabs>
-        <w:rPr>
-          <w:rFonts w:asciiTheme="minorHAnsi" w:eastAsiaTheme="minorEastAsia" w:hAnsiTheme="minorHAnsi" w:cstheme="minorBidi"/>
-          <w:noProof/>
-          <w:kern w:val="2"/>
-          <w:sz w:val="24"/>
-          <w:szCs w:val="24"/>
-          <w:lang w:val="en-CA" w:eastAsia="en-CA"/>
-          <w14:ligatures w14:val="standardContextual"/>
-        </w:rPr>
-      </w:pPr>
-      <w:hyperlink w:anchor="_Toc224909760" w:history="1">
-        <w:r>
-          <w:rPr>
-            <w:rStyle w:val="Hyperlink"/>
-            <w:noProof/>
-          </w:rPr>
-          <w:t>1.3.</w:t>
-        </w:r>
-        <w:r>
-          <w:rPr>
-            <w:rFonts w:asciiTheme="minorHAnsi" w:eastAsiaTheme="minorEastAsia" w:hAnsiTheme="minorHAnsi" w:cstheme="minorBidi"/>
-            <w:noProof/>
-            <w:kern w:val="2"/>
-            <w:sz w:val="24"/>
-            <w:szCs w:val="24"/>
-            <w:lang w:val="en-CA" w:eastAsia="en-CA"/>
-            <w14:ligatures w14:val="standardContextual"/>
-          </w:rPr>
-          <w:tab/>
-        </w:r>
-        <w:r>
-          <w:rPr>
-            <w:rStyle w:val="Hyperlink"/>
-            <w:noProof/>
-          </w:rPr>
-          <w:t>Justification</w:t>
-        </w:r>
-        <w:r>
-          <w:rPr>
-            <w:noProof/>
-            <w:webHidden/>
-          </w:rPr>
-          <w:tab/>
-        </w:r>
-        <w:r>
-          <w:rPr>
-            <w:noProof/>
-            <w:webHidden/>
-          </w:rPr>
-          <w:fldChar w:fldCharType="begin"/>
-        </w:r>
-        <w:r>
-          <w:rPr>
-            <w:noProof/>
-            <w:webHidden/>
-          </w:rPr>
-          <w:instrText xml:space="preserve"> PAGEREF _Toc224909760 \h </w:instrText>
-        </w:r>
-        <w:r>
-          <w:rPr>
-            <w:noProof/>
-            <w:webHidden/>
-          </w:rPr>
-        </w:r>
-        <w:r>
-          <w:rPr>
-            <w:noProof/>
-            <w:webHidden/>
-          </w:rPr>
-          <w:fldChar w:fldCharType="separate"/>
-        </w:r>
-        <w:r>
-          <w:rPr>
-            <w:noProof/>
-            <w:webHidden/>
-          </w:rPr>
-          <w:t>3</w:t>
-        </w:r>
-        <w:r>
-          <w:rPr>
-            <w:noProof/>
-            <w:webHidden/>
-          </w:rPr>
-          <w:fldChar w:fldCharType="end"/>
-        </w:r>
-      </w:hyperlink>
-    </w:p>
-    <w:p>
-      <w:pPr>
-        <w:pStyle w:val="TOC1"/>
-        <w:tabs>
-          <w:tab w:val="left" w:pos="480"/>
-          <w:tab w:val="right" w:leader="dot" w:pos="9350"/>
-        </w:tabs>
-        <w:rPr>
-          <w:rFonts w:asciiTheme="minorHAnsi" w:eastAsiaTheme="minorEastAsia" w:hAnsiTheme="minorHAnsi" w:cstheme="minorBidi"/>
-          <w:noProof/>
-          <w:kern w:val="2"/>
-          <w:szCs w:val="24"/>
-          <w:lang w:val="en-CA" w:eastAsia="en-CA"/>
-          <w14:ligatures w14:val="standardContextual"/>
-        </w:rPr>
-      </w:pPr>
-      <w:hyperlink w:anchor="_Toc224909761" w:history="1">
-        <w:r>
-          <w:rPr>
-            <w:rStyle w:val="Hyperlink"/>
-            <w:smallCaps/>
-            <w:noProof/>
-          </w:rPr>
-          <w:t>2.</w:t>
-        </w:r>
-        <w:r>
-          <w:rPr>
-            <w:rFonts w:asciiTheme="minorHAnsi" w:eastAsiaTheme="minorEastAsia" w:hAnsiTheme="minorHAnsi" w:cstheme="minorBidi"/>
-            <w:noProof/>
-            <w:kern w:val="2"/>
-            <w:szCs w:val="24"/>
-            <w:lang w:val="en-CA" w:eastAsia="en-CA"/>
-            <w14:ligatures w14:val="standardContextual"/>
-          </w:rPr>
-          <w:tab/>
-        </w:r>
-        <w:r>
-          <w:rPr>
-            <w:rStyle w:val="Hyperlink"/>
-            <w:smallCaps/>
-            <w:noProof/>
-          </w:rPr>
-          <w:t>Business Case Analysis Team</w:t>
-        </w:r>
-        <w:r>
-          <w:rPr>
-            <w:noProof/>
-            <w:webHidden/>
-          </w:rPr>
-          <w:tab/>
-        </w:r>
-        <w:r>
-          <w:rPr>
-            <w:noProof/>
-            <w:webHidden/>
-          </w:rPr>
-          <w:fldChar w:fldCharType="begin"/>
-        </w:r>
-        <w:r>
-          <w:rPr>
-            <w:noProof/>
-            <w:webHidden/>
-          </w:rPr>
-          <w:instrText xml:space="preserve"> PAGEREF _Toc224909761 \h </w:instrText>
-        </w:r>
-        <w:r>
-          <w:rPr>
-            <w:noProof/>
-            <w:webHidden/>
-          </w:rPr>
-        </w:r>
-        <w:r>
-          <w:rPr>
-            <w:noProof/>
-            <w:webHidden/>
-          </w:rPr>
-          <w:fldChar w:fldCharType="separate"/>
-        </w:r>
-        <w:r>
-          <w:rPr>
-            <w:noProof/>
-            <w:webHidden/>
-          </w:rPr>
-          <w:t>3</w:t>
-        </w:r>
-        <w:r>
-          <w:rPr>
-            <w:noProof/>
-            <w:webHidden/>
-          </w:rPr>
-          <w:fldChar w:fldCharType="end"/>
-        </w:r>
-      </w:hyperlink>
-    </w:p>
-    <w:p>
-      <w:pPr>
-        <w:pStyle w:val="TOC1"/>
-        <w:tabs>
-          <w:tab w:val="left" w:pos="480"/>
-          <w:tab w:val="right" w:leader="dot" w:pos="9350"/>
-        </w:tabs>
-        <w:rPr>
-          <w:rFonts w:asciiTheme="minorHAnsi" w:eastAsiaTheme="minorEastAsia" w:hAnsiTheme="minorHAnsi" w:cstheme="minorBidi"/>
-          <w:noProof/>
-          <w:kern w:val="2"/>
-          <w:szCs w:val="24"/>
-          <w:lang w:val="en-CA" w:eastAsia="en-CA"/>
-          <w14:ligatures w14:val="standardContextual"/>
-        </w:rPr>
-      </w:pPr>
-      <w:hyperlink w:anchor="_Toc224909762" w:history="1">
-        <w:r>
-          <w:rPr>
-            <w:rStyle w:val="Hyperlink"/>
-            <w:smallCaps/>
-            <w:noProof/>
-          </w:rPr>
-          <w:t>3.</w:t>
-        </w:r>
-        <w:r>
-          <w:rPr>
-            <w:rFonts w:asciiTheme="minorHAnsi" w:eastAsiaTheme="minorEastAsia" w:hAnsiTheme="minorHAnsi" w:cstheme="minorBidi"/>
-            <w:noProof/>
-            <w:kern w:val="2"/>
-            <w:szCs w:val="24"/>
-            <w:lang w:val="en-CA" w:eastAsia="en-CA"/>
-            <w14:ligatures w14:val="standardContextual"/>
-          </w:rPr>
-          <w:tab/>
-        </w:r>
-        <w:r>
-          <w:rPr>
-            <w:rStyle w:val="Hyperlink"/>
-            <w:smallCaps/>
-            <w:noProof/>
-          </w:rPr>
-          <w:t>Project Overview</w:t>
-        </w:r>
-        <w:r>
-          <w:rPr>
-            <w:noProof/>
-            <w:webHidden/>
-          </w:rPr>
-          <w:tab/>
-        </w:r>
-        <w:r>
-          <w:rPr>
-            <w:noProof/>
-            <w:webHidden/>
-          </w:rPr>
-          <w:fldChar w:fldCharType="begin"/>
-        </w:r>
-        <w:r>
-          <w:rPr>
-            <w:noProof/>
-            <w:webHidden/>
-          </w:rPr>
-          <w:instrText xml:space="preserve"> PAGEREF _Toc224909762 \h </w:instrText>
-        </w:r>
-        <w:r>
-          <w:rPr>
-            <w:noProof/>
-            <w:webHidden/>
-          </w:rPr>
-        </w:r>
-        <w:r>
-          <w:rPr>
-            <w:noProof/>
-            <w:webHidden/>
-          </w:rPr>
-          <w:fldChar w:fldCharType="separate"/>
-        </w:r>
-        <w:r>
-          <w:rPr>
-            <w:noProof/>
-            <w:webHidden/>
-          </w:rPr>
-          <w:t>4</w:t>
-        </w:r>
-        <w:r>
-          <w:rPr>
-            <w:noProof/>
-            <w:webHidden/>
-          </w:rPr>
-          <w:fldChar w:fldCharType="end"/>
-        </w:r>
-      </w:hyperlink>
-    </w:p>
-    <w:p>
-      <w:pPr>
-        <w:pStyle w:val="TOC2"/>
-        <w:tabs>
-          <w:tab w:val="left" w:pos="960"/>
-          <w:tab w:val="right" w:leader="dot" w:pos="9350"/>
-        </w:tabs>
-        <w:rPr>
-          <w:rFonts w:asciiTheme="minorHAnsi" w:eastAsiaTheme="minorEastAsia" w:hAnsiTheme="minorHAnsi" w:cstheme="minorBidi"/>
-          <w:noProof/>
-          <w:kern w:val="2"/>
-          <w:sz w:val="24"/>
-          <w:szCs w:val="24"/>
-          <w:lang w:val="en-CA" w:eastAsia="en-CA"/>
-          <w14:ligatures w14:val="standardContextual"/>
-        </w:rPr>
-      </w:pPr>
-      <w:hyperlink w:anchor="_Toc224909763" w:history="1">
-        <w:r>
-          <w:rPr>
-            <w:rStyle w:val="Hyperlink"/>
-            <w:noProof/>
-          </w:rPr>
-          <w:t>3.1.</w:t>
-        </w:r>
-        <w:r>
-          <w:rPr>
-            <w:rFonts w:asciiTheme="minorHAnsi" w:eastAsiaTheme="minorEastAsia" w:hAnsiTheme="minorHAnsi" w:cstheme="minorBidi"/>
-            <w:noProof/>
-            <w:kern w:val="2"/>
-            <w:sz w:val="24"/>
-            <w:szCs w:val="24"/>
-            <w:lang w:val="en-CA" w:eastAsia="en-CA"/>
-            <w14:ligatures w14:val="standardContextual"/>
-          </w:rPr>
-          <w:tab/>
-        </w:r>
-        <w:r>
-          <w:rPr>
-            <w:rStyle w:val="Hyperlink"/>
-            <w:noProof/>
-          </w:rPr>
-          <w:t>Project Description</w:t>
-        </w:r>
-        <w:r>
-          <w:rPr>
-            <w:noProof/>
-            <w:webHidden/>
-          </w:rPr>
-          <w:tab/>
-        </w:r>
-        <w:r>
-          <w:rPr>
-            <w:noProof/>
-            <w:webHidden/>
-          </w:rPr>
-          <w:fldChar w:fldCharType="begin"/>
-        </w:r>
-        <w:r>
-          <w:rPr>
-            <w:noProof/>
-            <w:webHidden/>
-          </w:rPr>
-          <w:instrText xml:space="preserve"> PAGEREF _Toc224909763 \h </w:instrText>
-        </w:r>
-        <w:r>
-          <w:rPr>
-            <w:noProof/>
-            <w:webHidden/>
-          </w:rPr>
-        </w:r>
-        <w:r>
-          <w:rPr>
-            <w:noProof/>
-            <w:webHidden/>
-          </w:rPr>
-          <w:fldChar w:fldCharType="separate"/>
-        </w:r>
-        <w:r>
-          <w:rPr>
-            <w:noProof/>
-            <w:webHidden/>
-          </w:rPr>
-          <w:t>4</w:t>
-        </w:r>
-        <w:r>
-          <w:rPr>
-            <w:noProof/>
-            <w:webHidden/>
-          </w:rPr>
-          <w:fldChar w:fldCharType="end"/>
-        </w:r>
-      </w:hyperlink>
-    </w:p>
-    <w:p>
-      <w:pPr>
-        <w:pStyle w:val="TOC2"/>
-        <w:tabs>
-          <w:tab w:val="left" w:pos="960"/>
-          <w:tab w:val="right" w:leader="dot" w:pos="9350"/>
-        </w:tabs>
-        <w:rPr>
-          <w:rFonts w:asciiTheme="minorHAnsi" w:eastAsiaTheme="minorEastAsia" w:hAnsiTheme="minorHAnsi" w:cstheme="minorBidi"/>
-          <w:noProof/>
-          <w:kern w:val="2"/>
-          <w:sz w:val="24"/>
-          <w:szCs w:val="24"/>
-          <w:lang w:val="en-CA" w:eastAsia="en-CA"/>
-          <w14:ligatures w14:val="standardContextual"/>
-        </w:rPr>
-      </w:pPr>
-      <w:hyperlink w:anchor="_Toc224909764" w:history="1">
-        <w:r>
-          <w:rPr>
-            <w:rStyle w:val="Hyperlink"/>
-            <w:noProof/>
-          </w:rPr>
-          <w:t>3.2.</w:t>
-        </w:r>
-        <w:r>
-          <w:rPr>
-            <w:rFonts w:asciiTheme="minorHAnsi" w:eastAsiaTheme="minorEastAsia" w:hAnsiTheme="minorHAnsi" w:cstheme="minorBidi"/>
-            <w:noProof/>
-            <w:kern w:val="2"/>
-            <w:sz w:val="24"/>
-            <w:szCs w:val="24"/>
-            <w:lang w:val="en-CA" w:eastAsia="en-CA"/>
-            <w14:ligatures w14:val="standardContextual"/>
-          </w:rPr>
-          <w:tab/>
-        </w:r>
-        <w:r>
-          <w:rPr>
-            <w:rStyle w:val="Hyperlink"/>
-            <w:noProof/>
-          </w:rPr>
-          <w:t>Goals and Objectives</w:t>
-        </w:r>
-        <w:r>
-          <w:rPr>
-            <w:noProof/>
-            <w:webHidden/>
-          </w:rPr>
-          <w:tab/>
-        </w:r>
-        <w:r>
-          <w:rPr>
-            <w:noProof/>
-            <w:webHidden/>
-          </w:rPr>
-          <w:fldChar w:fldCharType="begin"/>
-        </w:r>
-        <w:r>
-          <w:rPr>
-            <w:noProof/>
-            <w:webHidden/>
-          </w:rPr>
-          <w:instrText xml:space="preserve"> PAGEREF _Toc224909764 \h </w:instrText>
-        </w:r>
-        <w:r>
-          <w:rPr>
-            <w:noProof/>
-            <w:webHidden/>
-          </w:rPr>
-        </w:r>
-        <w:r>
-          <w:rPr>
-            <w:noProof/>
-            <w:webHidden/>
-          </w:rPr>
-          <w:fldChar w:fldCharType="separate"/>
-        </w:r>
-        <w:r>
-          <w:rPr>
-            <w:noProof/>
-            <w:webHidden/>
-          </w:rPr>
-          <w:t>4</w:t>
-        </w:r>
-        <w:r>
-          <w:rPr>
-            <w:noProof/>
-            <w:webHidden/>
-          </w:rPr>
-          <w:fldChar w:fldCharType="end"/>
-        </w:r>
-      </w:hyperlink>
-    </w:p>
-    <w:p>
-      <w:pPr>
-        <w:pStyle w:val="TOC2"/>
-        <w:tabs>
-          <w:tab w:val="left" w:pos="960"/>
-          <w:tab w:val="right" w:leader="dot" w:pos="9350"/>
-        </w:tabs>
-        <w:rPr>
-          <w:rFonts w:asciiTheme="minorHAnsi" w:eastAsiaTheme="minorEastAsia" w:hAnsiTheme="minorHAnsi" w:cstheme="minorBidi"/>
-          <w:noProof/>
-          <w:kern w:val="2"/>
-          <w:sz w:val="24"/>
-          <w:szCs w:val="24"/>
-          <w:lang w:val="en-CA" w:eastAsia="en-CA"/>
-          <w14:ligatures w14:val="standardContextual"/>
-        </w:rPr>
-      </w:pPr>
-      <w:hyperlink w:anchor="_Toc224909765" w:history="1">
-        <w:r>
-          <w:rPr>
-            <w:rStyle w:val="Hyperlink"/>
-            <w:noProof/>
-          </w:rPr>
-          <w:t>3.3.</w:t>
-        </w:r>
-        <w:r>
-          <w:rPr>
-            <w:rFonts w:asciiTheme="minorHAnsi" w:eastAsiaTheme="minorEastAsia" w:hAnsiTheme="minorHAnsi" w:cstheme="minorBidi"/>
-            <w:noProof/>
-            <w:kern w:val="2"/>
-            <w:sz w:val="24"/>
-            <w:szCs w:val="24"/>
-            <w:lang w:val="en-CA" w:eastAsia="en-CA"/>
-            <w14:ligatures w14:val="standardContextual"/>
-          </w:rPr>
-          <w:tab/>
-        </w:r>
-        <w:r>
-          <w:rPr>
-            <w:rStyle w:val="Hyperlink"/>
-            <w:noProof/>
-          </w:rPr>
-          <w:t>Project Assumptions</w:t>
-        </w:r>
-        <w:r>
-          <w:rPr>
-            <w:noProof/>
-            <w:webHidden/>
-          </w:rPr>
-          <w:tab/>
-        </w:r>
-        <w:r>
-          <w:rPr>
-            <w:noProof/>
-            <w:webHidden/>
-          </w:rPr>
-          <w:fldChar w:fldCharType="begin"/>
-        </w:r>
-        <w:r>
-          <w:rPr>
-            <w:noProof/>
-            <w:webHidden/>
-          </w:rPr>
-          <w:instrText xml:space="preserve"> PAGEREF _Toc224909765 \h </w:instrText>
-        </w:r>
-        <w:r>
-          <w:rPr>
-            <w:noProof/>
-            <w:webHidden/>
-          </w:rPr>
-        </w:r>
-        <w:r>
-          <w:rPr>
-            <w:noProof/>
-            <w:webHidden/>
-          </w:rPr>
-          <w:fldChar w:fldCharType="separate"/>
-        </w:r>
-        <w:r>
-          <w:rPr>
-            <w:noProof/>
-            <w:webHidden/>
-          </w:rPr>
-          <w:t>4</w:t>
-        </w:r>
-        <w:r>
-          <w:rPr>
-            <w:noProof/>
-            <w:webHidden/>
-          </w:rPr>
-          <w:fldChar w:fldCharType="end"/>
-        </w:r>
-      </w:hyperlink>
-    </w:p>
-    <w:p>
-      <w:pPr>
-        <w:pStyle w:val="TOC1"/>
-        <w:tabs>
-          <w:tab w:val="left" w:pos="480"/>
-          <w:tab w:val="right" w:leader="dot" w:pos="9350"/>
-        </w:tabs>
-        <w:rPr>
-          <w:rFonts w:asciiTheme="minorHAnsi" w:eastAsiaTheme="minorEastAsia" w:hAnsiTheme="minorHAnsi" w:cstheme="minorBidi"/>
-          <w:noProof/>
-          <w:kern w:val="2"/>
-          <w:szCs w:val="24"/>
-          <w:lang w:val="en-CA" w:eastAsia="en-CA"/>
-          <w14:ligatures w14:val="standardContextual"/>
-        </w:rPr>
-      </w:pPr>
-      <w:hyperlink w:anchor="_Toc224909766" w:history="1">
-        <w:r>
-          <w:rPr>
-            <w:rStyle w:val="Hyperlink"/>
-            <w:smallCaps/>
-            <w:noProof/>
-          </w:rPr>
-          <w:t>4.</w:t>
-        </w:r>
-        <w:r>
-          <w:rPr>
-            <w:rFonts w:asciiTheme="minorHAnsi" w:eastAsiaTheme="minorEastAsia" w:hAnsiTheme="minorHAnsi" w:cstheme="minorBidi"/>
-            <w:noProof/>
-            <w:kern w:val="2"/>
-            <w:szCs w:val="24"/>
-            <w:lang w:val="en-CA" w:eastAsia="en-CA"/>
-            <w14:ligatures w14:val="standardContextual"/>
-          </w:rPr>
-          <w:tab/>
-        </w:r>
-        <w:r>
-          <w:rPr>
-            <w:rStyle w:val="Hyperlink"/>
-            <w:smallCaps/>
-            <w:noProof/>
-          </w:rPr>
-          <w:t>Strategic Alignment</w:t>
-        </w:r>
-        <w:r>
-          <w:rPr>
-            <w:noProof/>
-            <w:webHidden/>
-          </w:rPr>
-          <w:tab/>
-        </w:r>
-        <w:r>
-          <w:rPr>
-            <w:noProof/>
-            <w:webHidden/>
-          </w:rPr>
-          <w:fldChar w:fldCharType="begin"/>
-        </w:r>
-        <w:r>
-          <w:rPr>
-            <w:noProof/>
-            <w:webHidden/>
-          </w:rPr>
-          <w:instrText xml:space="preserve"> PAGEREF _Toc224909766 \h </w:instrText>
-        </w:r>
-        <w:r>
-          <w:rPr>
-            <w:noProof/>
-            <w:webHidden/>
-          </w:rPr>
-        </w:r>
-        <w:r>
-          <w:rPr>
-            <w:noProof/>
-            <w:webHidden/>
-          </w:rPr>
-          <w:fldChar w:fldCharType="separate"/>
-        </w:r>
-        <w:r>
-          <w:rPr>
-            <w:noProof/>
-            <w:webHidden/>
-          </w:rPr>
-          <w:t>5</w:t>
-        </w:r>
-        <w:r>
-          <w:rPr>
-            <w:noProof/>
-            <w:webHidden/>
-          </w:rPr>
-          <w:fldChar w:fldCharType="end"/>
-        </w:r>
-      </w:hyperlink>
-    </w:p>
-    <w:p>
-      <w:pPr>
-        <w:pStyle w:val="TOC1"/>
-        <w:tabs>
-          <w:tab w:val="left" w:pos="480"/>
-          <w:tab w:val="right" w:leader="dot" w:pos="9350"/>
-        </w:tabs>
-        <w:rPr>
-          <w:rFonts w:asciiTheme="minorHAnsi" w:eastAsiaTheme="minorEastAsia" w:hAnsiTheme="minorHAnsi" w:cstheme="minorBidi"/>
-          <w:noProof/>
-          <w:kern w:val="2"/>
-          <w:szCs w:val="24"/>
-          <w:lang w:val="en-CA" w:eastAsia="en-CA"/>
-          <w14:ligatures w14:val="standardContextual"/>
-        </w:rPr>
-      </w:pPr>
-      <w:hyperlink w:anchor="_Toc224909767" w:history="1">
-        <w:r>
-          <w:rPr>
-            <w:rStyle w:val="Hyperlink"/>
-            <w:smallCaps/>
-            <w:noProof/>
-          </w:rPr>
-          <w:t>5.</w:t>
-        </w:r>
-        <w:r>
-          <w:rPr>
-            <w:rFonts w:asciiTheme="minorHAnsi" w:eastAsiaTheme="minorEastAsia" w:hAnsiTheme="minorHAnsi" w:cstheme="minorBidi"/>
-            <w:noProof/>
-            <w:kern w:val="2"/>
-            <w:szCs w:val="24"/>
-            <w:lang w:val="en-CA" w:eastAsia="en-CA"/>
-            <w14:ligatures w14:val="standardContextual"/>
-          </w:rPr>
-          <w:tab/>
-        </w:r>
-        <w:r>
-          <w:rPr>
-            <w:rStyle w:val="Hyperlink"/>
-            <w:smallCaps/>
-            <w:noProof/>
-          </w:rPr>
-          <w:t>Cost Benefit Analysis / Alternatives Analysis</w:t>
-        </w:r>
-        <w:r>
-          <w:rPr>
-            <w:noProof/>
-            <w:webHidden/>
-          </w:rPr>
-          <w:tab/>
-        </w:r>
-        <w:r>
-          <w:rPr>
-            <w:noProof/>
-            <w:webHidden/>
-          </w:rPr>
-          <w:fldChar w:fldCharType="begin"/>
-        </w:r>
-        <w:r>
-          <w:rPr>
-            <w:noProof/>
-            <w:webHidden/>
-          </w:rPr>
-          <w:instrText xml:space="preserve"> PAGEREF _Toc224909767 \h </w:instrText>
-        </w:r>
-        <w:r>
-          <w:rPr>
-            <w:noProof/>
-            <w:webHidden/>
-          </w:rPr>
-        </w:r>
-        <w:r>
-          <w:rPr>
-            <w:noProof/>
-            <w:webHidden/>
-          </w:rPr>
-          <w:fldChar w:fldCharType="separate"/>
-        </w:r>
-        <w:r>
-          <w:rPr>
-            <w:noProof/>
-            <w:webHidden/>
-          </w:rPr>
-          <w:t>5</w:t>
-        </w:r>
-        <w:r>
-          <w:rPr>
-            <w:noProof/>
-            <w:webHidden/>
-          </w:rPr>
-          <w:fldChar w:fldCharType="end"/>
-        </w:r>
-      </w:hyperlink>
-    </w:p>
-    <w:p>
-      <w:pPr>
-        <w:ind w:left="720"/>
-      </w:pPr>
-      <w:r>
-        <w:fldChar w:fldCharType="end"/>
-      </w:r>
-    </w:p>
-    <w:p/>
+        </w:rPr>
+      </w:sdtEndPr>
+      <w:sdtContent>
+        <w:p>
+          <w:pPr>
+            <w:pStyle w:val="TOCHeading"/>
+          </w:pPr>
+          <w:r>
+            <w:t>Contents</w:t>
+          </w:r>
+        </w:p>
+        <w:p>
+          <w:pPr>
+            <w:pStyle w:val="TOC1"/>
+            <w:tabs>
+              <w:tab w:val="left" w:pos="480"/>
+              <w:tab w:val="right" w:leader="dot" w:pos="9350"/>
+            </w:tabs>
+            <w:rPr>
+              <w:rFonts w:asciiTheme="minorHAnsi" w:eastAsiaTheme="minorEastAsia" w:hAnsiTheme="minorHAnsi" w:cstheme="minorBidi"/>
+              <w:noProof/>
+              <w:kern w:val="2"/>
+              <w:szCs w:val="24"/>
+              <w:lang w:val="en-CA" w:eastAsia="en-CA"/>
+              <w14:ligatures w14:val="standardContextual"/>
+            </w:rPr>
+          </w:pPr>
+          <w:r>
+            <w:fldChar w:fldCharType="begin"/>
+          </w:r>
+          <w:r>
+            <w:instrText xml:space="preserve"> TOC \o "1-3" \h \z \u </w:instrText>
+          </w:r>
+          <w:r>
+            <w:fldChar w:fldCharType="separate"/>
+          </w:r>
+          <w:hyperlink w:anchor="_Toc226371956" w:history="1">
+            <w:r>
+              <w:rPr>
+                <w:rStyle w:val="Hyperlink"/>
+                <w:smallCaps/>
+                <w:noProof/>
+              </w:rPr>
+              <w:t>1.</w:t>
+            </w:r>
+            <w:r>
+              <w:rPr>
+                <w:rFonts w:asciiTheme="minorHAnsi" w:eastAsiaTheme="minorEastAsia" w:hAnsiTheme="minorHAnsi" w:cstheme="minorBidi"/>
+                <w:noProof/>
+                <w:kern w:val="2"/>
+                <w:szCs w:val="24"/>
+                <w:lang w:val="en-CA" w:eastAsia="en-CA"/>
+                <w14:ligatures w14:val="standardContextual"/>
+              </w:rPr>
+              <w:tab/>
+            </w:r>
+            <w:r>
+              <w:rPr>
+                <w:rStyle w:val="Hyperlink"/>
+                <w:smallCaps/>
+                <w:noProof/>
+              </w:rPr>
+              <w:t>Executive Summary</w:t>
+            </w:r>
+            <w:r>
+              <w:rPr>
+                <w:noProof/>
+                <w:webHidden/>
+              </w:rPr>
+              <w:tab/>
+            </w:r>
+            <w:r>
+              <w:rPr>
+                <w:noProof/>
+                <w:webHidden/>
+              </w:rPr>
+              <w:fldChar w:fldCharType="begin"/>
+            </w:r>
+            <w:r>
+              <w:rPr>
+                <w:noProof/>
+                <w:webHidden/>
+              </w:rPr>
+              <w:instrText xml:space="preserve"> PAGEREF _Toc226371956 \h </w:instrText>
+            </w:r>
+            <w:r>
+              <w:rPr>
+                <w:noProof/>
+                <w:webHidden/>
+              </w:rPr>
+            </w:r>
+            <w:r>
+              <w:rPr>
+                <w:noProof/>
+                <w:webHidden/>
+              </w:rPr>
+              <w:fldChar w:fldCharType="separate"/>
+            </w:r>
+            <w:r>
+              <w:rPr>
+                <w:noProof/>
+                <w:webHidden/>
+              </w:rPr>
+              <w:t>3</w:t>
+            </w:r>
+            <w:r>
+              <w:rPr>
+                <w:noProof/>
+                <w:webHidden/>
+              </w:rPr>
+              <w:fldChar w:fldCharType="end"/>
+            </w:r>
+          </w:hyperlink>
+        </w:p>
+        <w:p>
+          <w:pPr>
+            <w:pStyle w:val="TOC2"/>
+            <w:tabs>
+              <w:tab w:val="left" w:pos="960"/>
+              <w:tab w:val="right" w:leader="dot" w:pos="9350"/>
+            </w:tabs>
+            <w:rPr>
+              <w:rFonts w:asciiTheme="minorHAnsi" w:eastAsiaTheme="minorEastAsia" w:hAnsiTheme="minorHAnsi" w:cstheme="minorBidi"/>
+              <w:noProof/>
+              <w:kern w:val="2"/>
+              <w:sz w:val="24"/>
+              <w:szCs w:val="24"/>
+              <w:lang w:val="en-CA" w:eastAsia="en-CA"/>
+              <w14:ligatures w14:val="standardContextual"/>
+            </w:rPr>
+          </w:pPr>
+          <w:hyperlink w:anchor="_Toc226371957" w:history="1">
+            <w:r>
+              <w:rPr>
+                <w:rStyle w:val="Hyperlink"/>
+                <w:noProof/>
+              </w:rPr>
+              <w:t>1.1.</w:t>
+            </w:r>
+            <w:r>
+              <w:rPr>
+                <w:rFonts w:asciiTheme="minorHAnsi" w:eastAsiaTheme="minorEastAsia" w:hAnsiTheme="minorHAnsi" w:cstheme="minorBidi"/>
+                <w:noProof/>
+                <w:kern w:val="2"/>
+                <w:sz w:val="24"/>
+                <w:szCs w:val="24"/>
+                <w:lang w:val="en-CA" w:eastAsia="en-CA"/>
+                <w14:ligatures w14:val="standardContextual"/>
+              </w:rPr>
+              <w:tab/>
+            </w:r>
+            <w:r>
+              <w:rPr>
+                <w:rStyle w:val="Hyperlink"/>
+                <w:noProof/>
+              </w:rPr>
+              <w:t>Issue</w:t>
+            </w:r>
+            <w:r>
+              <w:rPr>
+                <w:noProof/>
+                <w:webHidden/>
+              </w:rPr>
+              <w:tab/>
+            </w:r>
+            <w:r>
+              <w:rPr>
+                <w:noProof/>
+                <w:webHidden/>
+              </w:rPr>
+              <w:fldChar w:fldCharType="begin"/>
+            </w:r>
+            <w:r>
+              <w:rPr>
+                <w:noProof/>
+                <w:webHidden/>
+              </w:rPr>
+              <w:instrText xml:space="preserve"> PAGEREF _Toc226371957 \h </w:instrText>
+            </w:r>
+            <w:r>
+              <w:rPr>
+                <w:noProof/>
+                <w:webHidden/>
+              </w:rPr>
+            </w:r>
+            <w:r>
+              <w:rPr>
+                <w:noProof/>
+                <w:webHidden/>
+              </w:rPr>
+              <w:fldChar w:fldCharType="separate"/>
+            </w:r>
+            <w:r>
+              <w:rPr>
+                <w:noProof/>
+                <w:webHidden/>
+              </w:rPr>
+              <w:t>3</w:t>
+            </w:r>
+            <w:r>
+              <w:rPr>
+                <w:noProof/>
+                <w:webHidden/>
+              </w:rPr>
+              <w:fldChar w:fldCharType="end"/>
+            </w:r>
+          </w:hyperlink>
+        </w:p>
+        <w:p>
+          <w:pPr>
+            <w:pStyle w:val="TOC2"/>
+            <w:tabs>
+              <w:tab w:val="left" w:pos="960"/>
+              <w:tab w:val="right" w:leader="dot" w:pos="9350"/>
+            </w:tabs>
+            <w:rPr>
+              <w:rFonts w:asciiTheme="minorHAnsi" w:eastAsiaTheme="minorEastAsia" w:hAnsiTheme="minorHAnsi" w:cstheme="minorBidi"/>
+              <w:noProof/>
+              <w:kern w:val="2"/>
+              <w:sz w:val="24"/>
+              <w:szCs w:val="24"/>
+              <w:lang w:val="en-CA" w:eastAsia="en-CA"/>
+              <w14:ligatures w14:val="standardContextual"/>
+            </w:rPr>
+          </w:pPr>
+          <w:hyperlink w:anchor="_Toc226371958" w:history="1">
+            <w:r>
+              <w:rPr>
+                <w:rStyle w:val="Hyperlink"/>
+                <w:noProof/>
+              </w:rPr>
+              <w:t>1.2.</w:t>
+            </w:r>
+            <w:r>
+              <w:rPr>
+                <w:rFonts w:asciiTheme="minorHAnsi" w:eastAsiaTheme="minorEastAsia" w:hAnsiTheme="minorHAnsi" w:cstheme="minorBidi"/>
+                <w:noProof/>
+                <w:kern w:val="2"/>
+                <w:sz w:val="24"/>
+                <w:szCs w:val="24"/>
+                <w:lang w:val="en-CA" w:eastAsia="en-CA"/>
+                <w14:ligatures w14:val="standardContextual"/>
+              </w:rPr>
+              <w:tab/>
+            </w:r>
+            <w:r>
+              <w:rPr>
+                <w:rStyle w:val="Hyperlink"/>
+                <w:noProof/>
+              </w:rPr>
+              <w:t>Anticipated Outcomes</w:t>
+            </w:r>
+            <w:r>
+              <w:rPr>
+                <w:noProof/>
+                <w:webHidden/>
+              </w:rPr>
+              <w:tab/>
+            </w:r>
+            <w:r>
+              <w:rPr>
+                <w:noProof/>
+                <w:webHidden/>
+              </w:rPr>
+              <w:fldChar w:fldCharType="begin"/>
+            </w:r>
+            <w:r>
+              <w:rPr>
+                <w:noProof/>
+                <w:webHidden/>
+              </w:rPr>
+              <w:instrText xml:space="preserve"> PAGEREF _Toc226371958 \h </w:instrText>
+            </w:r>
+            <w:r>
+              <w:rPr>
+                <w:noProof/>
+                <w:webHidden/>
+              </w:rPr>
+            </w:r>
+            <w:r>
+              <w:rPr>
+                <w:noProof/>
+                <w:webHidden/>
+              </w:rPr>
+              <w:fldChar w:fldCharType="separate"/>
+            </w:r>
+            <w:r>
+              <w:rPr>
+                <w:noProof/>
+                <w:webHidden/>
+              </w:rPr>
+              <w:t>3</w:t>
+            </w:r>
+            <w:r>
+              <w:rPr>
+                <w:noProof/>
+                <w:webHidden/>
+              </w:rPr>
+              <w:fldChar w:fldCharType="end"/>
+            </w:r>
+          </w:hyperlink>
+        </w:p>
+        <w:p>
+          <w:pPr>
+            <w:pStyle w:val="TOC2"/>
+            <w:tabs>
+              <w:tab w:val="left" w:pos="960"/>
+              <w:tab w:val="right" w:leader="dot" w:pos="9350"/>
+            </w:tabs>
+            <w:rPr>
+              <w:rFonts w:asciiTheme="minorHAnsi" w:eastAsiaTheme="minorEastAsia" w:hAnsiTheme="minorHAnsi" w:cstheme="minorBidi"/>
+              <w:noProof/>
+              <w:kern w:val="2"/>
+              <w:sz w:val="24"/>
+              <w:szCs w:val="24"/>
+              <w:lang w:val="en-CA" w:eastAsia="en-CA"/>
+              <w14:ligatures w14:val="standardContextual"/>
+            </w:rPr>
+          </w:pPr>
+          <w:hyperlink w:anchor="_Toc226371959" w:history="1">
+            <w:r>
+              <w:rPr>
+                <w:rStyle w:val="Hyperlink"/>
+                <w:noProof/>
+              </w:rPr>
+              <w:t>1.3.</w:t>
+            </w:r>
+            <w:r>
+              <w:rPr>
+                <w:rFonts w:asciiTheme="minorHAnsi" w:eastAsiaTheme="minorEastAsia" w:hAnsiTheme="minorHAnsi" w:cstheme="minorBidi"/>
+                <w:noProof/>
+                <w:kern w:val="2"/>
+                <w:sz w:val="24"/>
+                <w:szCs w:val="24"/>
+                <w:lang w:val="en-CA" w:eastAsia="en-CA"/>
+                <w14:ligatures w14:val="standardContextual"/>
+              </w:rPr>
+              <w:tab/>
+            </w:r>
+            <w:r>
+              <w:rPr>
+                <w:rStyle w:val="Hyperlink"/>
+                <w:noProof/>
+              </w:rPr>
+              <w:t>Justification</w:t>
+            </w:r>
+            <w:r>
+              <w:rPr>
+                <w:noProof/>
+                <w:webHidden/>
+              </w:rPr>
+              <w:tab/>
+            </w:r>
+            <w:r>
+              <w:rPr>
+                <w:noProof/>
+                <w:webHidden/>
+              </w:rPr>
+              <w:fldChar w:fldCharType="begin"/>
+            </w:r>
+            <w:r>
+              <w:rPr>
+                <w:noProof/>
+                <w:webHidden/>
+              </w:rPr>
+              <w:instrText xml:space="preserve"> PAGEREF _Toc226371959 \h </w:instrText>
+            </w:r>
+            <w:r>
+              <w:rPr>
+                <w:noProof/>
+                <w:webHidden/>
+              </w:rPr>
+            </w:r>
+            <w:r>
+              <w:rPr>
+                <w:noProof/>
+                <w:webHidden/>
+              </w:rPr>
+              <w:fldChar w:fldCharType="separate"/>
+            </w:r>
+            <w:r>
+              <w:rPr>
+                <w:noProof/>
+                <w:webHidden/>
+              </w:rPr>
+              <w:t>3</w:t>
+            </w:r>
+            <w:r>
+              <w:rPr>
+                <w:noProof/>
+                <w:webHidden/>
+              </w:rPr>
+              <w:fldChar w:fldCharType="end"/>
+            </w:r>
+          </w:hyperlink>
+        </w:p>
+        <w:p>
+          <w:pPr>
+            <w:pStyle w:val="TOC1"/>
+            <w:tabs>
+              <w:tab w:val="left" w:pos="480"/>
+              <w:tab w:val="right" w:leader="dot" w:pos="9350"/>
+            </w:tabs>
+            <w:rPr>
+              <w:rFonts w:asciiTheme="minorHAnsi" w:eastAsiaTheme="minorEastAsia" w:hAnsiTheme="minorHAnsi" w:cstheme="minorBidi"/>
+              <w:noProof/>
+              <w:kern w:val="2"/>
+              <w:szCs w:val="24"/>
+              <w:lang w:val="en-CA" w:eastAsia="en-CA"/>
+              <w14:ligatures w14:val="standardContextual"/>
+            </w:rPr>
+          </w:pPr>
+          <w:hyperlink w:anchor="_Toc226371960" w:history="1">
+            <w:r>
+              <w:rPr>
+                <w:rStyle w:val="Hyperlink"/>
+                <w:smallCaps/>
+                <w:noProof/>
+              </w:rPr>
+              <w:t>2.</w:t>
+            </w:r>
+            <w:r>
+              <w:rPr>
+                <w:rFonts w:asciiTheme="minorHAnsi" w:eastAsiaTheme="minorEastAsia" w:hAnsiTheme="minorHAnsi" w:cstheme="minorBidi"/>
+                <w:noProof/>
+                <w:kern w:val="2"/>
+                <w:szCs w:val="24"/>
+                <w:lang w:val="en-CA" w:eastAsia="en-CA"/>
+                <w14:ligatures w14:val="standardContextual"/>
+              </w:rPr>
+              <w:tab/>
+            </w:r>
+            <w:r>
+              <w:rPr>
+                <w:rStyle w:val="Hyperlink"/>
+                <w:smallCaps/>
+                <w:noProof/>
+              </w:rPr>
+              <w:t>Business Case Analysis Team</w:t>
+            </w:r>
+            <w:r>
+              <w:rPr>
+                <w:noProof/>
+                <w:webHidden/>
+              </w:rPr>
+              <w:tab/>
+            </w:r>
+            <w:r>
+              <w:rPr>
+                <w:noProof/>
+                <w:webHidden/>
+              </w:rPr>
+              <w:fldChar w:fldCharType="begin"/>
+            </w:r>
+            <w:r>
+              <w:rPr>
+                <w:noProof/>
+                <w:webHidden/>
+              </w:rPr>
+              <w:instrText xml:space="preserve"> PAGEREF _Toc226371960 \h </w:instrText>
+            </w:r>
+            <w:r>
+              <w:rPr>
+                <w:noProof/>
+                <w:webHidden/>
+              </w:rPr>
+            </w:r>
+            <w:r>
+              <w:rPr>
+                <w:noProof/>
+                <w:webHidden/>
+              </w:rPr>
+              <w:fldChar w:fldCharType="separate"/>
+            </w:r>
+            <w:r>
+              <w:rPr>
+                <w:noProof/>
+                <w:webHidden/>
+              </w:rPr>
+              <w:t>4</w:t>
+            </w:r>
+            <w:r>
+              <w:rPr>
+                <w:noProof/>
+                <w:webHidden/>
+              </w:rPr>
+              <w:fldChar w:fldCharType="end"/>
+            </w:r>
+          </w:hyperlink>
+        </w:p>
+        <w:p>
+          <w:pPr>
+            <w:pStyle w:val="TOC1"/>
+            <w:tabs>
+              <w:tab w:val="left" w:pos="480"/>
+              <w:tab w:val="right" w:leader="dot" w:pos="9350"/>
+            </w:tabs>
+            <w:rPr>
+              <w:rFonts w:asciiTheme="minorHAnsi" w:eastAsiaTheme="minorEastAsia" w:hAnsiTheme="minorHAnsi" w:cstheme="minorBidi"/>
+              <w:noProof/>
+              <w:kern w:val="2"/>
+              <w:szCs w:val="24"/>
+              <w:lang w:val="en-CA" w:eastAsia="en-CA"/>
+              <w14:ligatures w14:val="standardContextual"/>
+            </w:rPr>
+          </w:pPr>
+          <w:hyperlink w:anchor="_Toc226371961" w:history="1">
+            <w:r>
+              <w:rPr>
+                <w:rStyle w:val="Hyperlink"/>
+                <w:smallCaps/>
+                <w:noProof/>
+              </w:rPr>
+              <w:t>3.</w:t>
+            </w:r>
+            <w:r>
+              <w:rPr>
+                <w:rFonts w:asciiTheme="minorHAnsi" w:eastAsiaTheme="minorEastAsia" w:hAnsiTheme="minorHAnsi" w:cstheme="minorBidi"/>
+                <w:noProof/>
+                <w:kern w:val="2"/>
+                <w:szCs w:val="24"/>
+                <w:lang w:val="en-CA" w:eastAsia="en-CA"/>
+                <w14:ligatures w14:val="standardContextual"/>
+              </w:rPr>
+              <w:tab/>
+            </w:r>
+            <w:r>
+              <w:rPr>
+                <w:rStyle w:val="Hyperlink"/>
+                <w:smallCaps/>
+                <w:noProof/>
+              </w:rPr>
+              <w:t>Project Overview</w:t>
+            </w:r>
+            <w:r>
+              <w:rPr>
+                <w:noProof/>
+                <w:webHidden/>
+              </w:rPr>
+              <w:tab/>
+            </w:r>
+            <w:r>
+              <w:rPr>
+                <w:noProof/>
+                <w:webHidden/>
+              </w:rPr>
+              <w:fldChar w:fldCharType="begin"/>
+            </w:r>
+            <w:r>
+              <w:rPr>
+                <w:noProof/>
+                <w:webHidden/>
+              </w:rPr>
+              <w:instrText xml:space="preserve"> PAGEREF _Toc226371961 \h </w:instrText>
+            </w:r>
+            <w:r>
+              <w:rPr>
+                <w:noProof/>
+                <w:webHidden/>
+              </w:rPr>
+            </w:r>
+            <w:r>
+              <w:rPr>
+                <w:noProof/>
+                <w:webHidden/>
+              </w:rPr>
+              <w:fldChar w:fldCharType="separate"/>
+            </w:r>
+            <w:r>
+              <w:rPr>
+                <w:noProof/>
+                <w:webHidden/>
+              </w:rPr>
+              <w:t>4</w:t>
+            </w:r>
+            <w:r>
+              <w:rPr>
+                <w:noProof/>
+                <w:webHidden/>
+              </w:rPr>
+              <w:fldChar w:fldCharType="end"/>
+            </w:r>
+          </w:hyperlink>
+        </w:p>
+        <w:p>
+          <w:pPr>
+            <w:pStyle w:val="TOC2"/>
+            <w:tabs>
+              <w:tab w:val="left" w:pos="960"/>
+              <w:tab w:val="right" w:leader="dot" w:pos="9350"/>
+            </w:tabs>
+            <w:rPr>
+              <w:rFonts w:asciiTheme="minorHAnsi" w:eastAsiaTheme="minorEastAsia" w:hAnsiTheme="minorHAnsi" w:cstheme="minorBidi"/>
+              <w:noProof/>
+              <w:kern w:val="2"/>
+              <w:sz w:val="24"/>
+              <w:szCs w:val="24"/>
+              <w:lang w:val="en-CA" w:eastAsia="en-CA"/>
+              <w14:ligatures w14:val="standardContextual"/>
+            </w:rPr>
+          </w:pPr>
+          <w:hyperlink w:anchor="_Toc226371962" w:history="1">
+            <w:r>
+              <w:rPr>
+                <w:rStyle w:val="Hyperlink"/>
+                <w:noProof/>
+              </w:rPr>
+              <w:t>3.1.</w:t>
+            </w:r>
+            <w:r>
+              <w:rPr>
+                <w:rFonts w:asciiTheme="minorHAnsi" w:eastAsiaTheme="minorEastAsia" w:hAnsiTheme="minorHAnsi" w:cstheme="minorBidi"/>
+                <w:noProof/>
+                <w:kern w:val="2"/>
+                <w:sz w:val="24"/>
+                <w:szCs w:val="24"/>
+                <w:lang w:val="en-CA" w:eastAsia="en-CA"/>
+                <w14:ligatures w14:val="standardContextual"/>
+              </w:rPr>
+              <w:tab/>
+            </w:r>
+            <w:r>
+              <w:rPr>
+                <w:rStyle w:val="Hyperlink"/>
+                <w:noProof/>
+              </w:rPr>
+              <w:t>Project Description</w:t>
+            </w:r>
+            <w:r>
+              <w:rPr>
+                <w:noProof/>
+                <w:webHidden/>
+              </w:rPr>
+              <w:tab/>
+            </w:r>
+            <w:r>
+              <w:rPr>
+                <w:noProof/>
+                <w:webHidden/>
+              </w:rPr>
+              <w:fldChar w:fldCharType="begin"/>
+            </w:r>
+            <w:r>
+              <w:rPr>
+                <w:noProof/>
+                <w:webHidden/>
+              </w:rPr>
+              <w:instrText xml:space="preserve"> PAGEREF _Toc226371962 \h </w:instrText>
+            </w:r>
+            <w:r>
+              <w:rPr>
+                <w:noProof/>
+                <w:webHidden/>
+              </w:rPr>
+            </w:r>
+            <w:r>
+              <w:rPr>
+                <w:noProof/>
+                <w:webHidden/>
+              </w:rPr>
+              <w:fldChar w:fldCharType="separate"/>
+            </w:r>
+            <w:r>
+              <w:rPr>
+                <w:noProof/>
+                <w:webHidden/>
+              </w:rPr>
+              <w:t>4</w:t>
+            </w:r>
+            <w:r>
+              <w:rPr>
+                <w:noProof/>
+                <w:webHidden/>
+              </w:rPr>
+              <w:fldChar w:fldCharType="end"/>
+            </w:r>
+          </w:hyperlink>
+        </w:p>
+        <w:p>
+          <w:pPr>
+            <w:pStyle w:val="TOC2"/>
+            <w:tabs>
+              <w:tab w:val="left" w:pos="960"/>
+              <w:tab w:val="right" w:leader="dot" w:pos="9350"/>
+            </w:tabs>
+            <w:rPr>
+              <w:rFonts w:asciiTheme="minorHAnsi" w:eastAsiaTheme="minorEastAsia" w:hAnsiTheme="minorHAnsi" w:cstheme="minorBidi"/>
+              <w:noProof/>
+              <w:kern w:val="2"/>
+              <w:sz w:val="24"/>
+              <w:szCs w:val="24"/>
+              <w:lang w:val="en-CA" w:eastAsia="en-CA"/>
+              <w14:ligatures w14:val="standardContextual"/>
+            </w:rPr>
+          </w:pPr>
+          <w:hyperlink w:anchor="_Toc226371963" w:history="1">
+            <w:r>
+              <w:rPr>
+                <w:rStyle w:val="Hyperlink"/>
+                <w:noProof/>
+              </w:rPr>
+              <w:t>3.2.</w:t>
+            </w:r>
+            <w:r>
+              <w:rPr>
+                <w:rFonts w:asciiTheme="minorHAnsi" w:eastAsiaTheme="minorEastAsia" w:hAnsiTheme="minorHAnsi" w:cstheme="minorBidi"/>
+                <w:noProof/>
+                <w:kern w:val="2"/>
+                <w:sz w:val="24"/>
+                <w:szCs w:val="24"/>
+                <w:lang w:val="en-CA" w:eastAsia="en-CA"/>
+                <w14:ligatures w14:val="standardContextual"/>
+              </w:rPr>
+              <w:tab/>
+            </w:r>
+            <w:r>
+              <w:rPr>
+                <w:rStyle w:val="Hyperlink"/>
+                <w:noProof/>
+              </w:rPr>
+              <w:t>Goals and Objectives</w:t>
+            </w:r>
+            <w:r>
+              <w:rPr>
+                <w:noProof/>
+                <w:webHidden/>
+              </w:rPr>
+              <w:tab/>
+            </w:r>
+            <w:r>
+              <w:rPr>
+                <w:noProof/>
+                <w:webHidden/>
+              </w:rPr>
+              <w:fldChar w:fldCharType="begin"/>
+            </w:r>
+            <w:r>
+              <w:rPr>
+                <w:noProof/>
+                <w:webHidden/>
+              </w:rPr>
+              <w:instrText xml:space="preserve"> PAGEREF _Toc226371963 \h </w:instrText>
+            </w:r>
+            <w:r>
+              <w:rPr>
+                <w:noProof/>
+                <w:webHidden/>
+              </w:rPr>
+            </w:r>
+            <w:r>
+              <w:rPr>
+                <w:noProof/>
+                <w:webHidden/>
+              </w:rPr>
+              <w:fldChar w:fldCharType="separate"/>
+            </w:r>
+            <w:r>
+              <w:rPr>
+                <w:noProof/>
+                <w:webHidden/>
+              </w:rPr>
+              <w:t>4</w:t>
+            </w:r>
+            <w:r>
+              <w:rPr>
+                <w:noProof/>
+                <w:webHidden/>
+              </w:rPr>
+              <w:fldChar w:fldCharType="end"/>
+            </w:r>
+          </w:hyperlink>
+        </w:p>
+        <w:p>
+          <w:pPr>
+            <w:pStyle w:val="TOC2"/>
+            <w:tabs>
+              <w:tab w:val="left" w:pos="960"/>
+              <w:tab w:val="right" w:leader="dot" w:pos="9350"/>
+            </w:tabs>
+            <w:rPr>
+              <w:rFonts w:asciiTheme="minorHAnsi" w:eastAsiaTheme="minorEastAsia" w:hAnsiTheme="minorHAnsi" w:cstheme="minorBidi"/>
+              <w:noProof/>
+              <w:kern w:val="2"/>
+              <w:sz w:val="24"/>
+              <w:szCs w:val="24"/>
+              <w:lang w:val="en-CA" w:eastAsia="en-CA"/>
+              <w14:ligatures w14:val="standardContextual"/>
+            </w:rPr>
+          </w:pPr>
+          <w:hyperlink w:anchor="_Toc226371964" w:history="1">
+            <w:r>
+              <w:rPr>
+                <w:rStyle w:val="Hyperlink"/>
+                <w:noProof/>
+              </w:rPr>
+              <w:t>3.3.</w:t>
+            </w:r>
+            <w:r>
+              <w:rPr>
+                <w:rFonts w:asciiTheme="minorHAnsi" w:eastAsiaTheme="minorEastAsia" w:hAnsiTheme="minorHAnsi" w:cstheme="minorBidi"/>
+                <w:noProof/>
+                <w:kern w:val="2"/>
+                <w:sz w:val="24"/>
+                <w:szCs w:val="24"/>
+                <w:lang w:val="en-CA" w:eastAsia="en-CA"/>
+                <w14:ligatures w14:val="standardContextual"/>
+              </w:rPr>
+              <w:tab/>
+            </w:r>
+            <w:r>
+              <w:rPr>
+                <w:rStyle w:val="Hyperlink"/>
+                <w:noProof/>
+              </w:rPr>
+              <w:t>Project Assumptions</w:t>
+            </w:r>
+            <w:r>
+              <w:rPr>
+                <w:noProof/>
+                <w:webHidden/>
+              </w:rPr>
+              <w:tab/>
+            </w:r>
+            <w:r>
+              <w:rPr>
+                <w:noProof/>
+                <w:webHidden/>
+              </w:rPr>
+              <w:fldChar w:fldCharType="begin"/>
+            </w:r>
+            <w:r>
+              <w:rPr>
+                <w:noProof/>
+                <w:webHidden/>
+              </w:rPr>
+              <w:instrText xml:space="preserve"> PAGEREF _Toc226371964 \h </w:instrText>
+            </w:r>
+            <w:r>
+              <w:rPr>
+                <w:noProof/>
+                <w:webHidden/>
+              </w:rPr>
+            </w:r>
+            <w:r>
+              <w:rPr>
+                <w:noProof/>
+                <w:webHidden/>
+              </w:rPr>
+              <w:fldChar w:fldCharType="separate"/>
+            </w:r>
+            <w:r>
+              <w:rPr>
+                <w:noProof/>
+                <w:webHidden/>
+              </w:rPr>
+              <w:t>4</w:t>
+            </w:r>
+            <w:r>
+              <w:rPr>
+                <w:noProof/>
+                <w:webHidden/>
+              </w:rPr>
+              <w:fldChar w:fldCharType="end"/>
+            </w:r>
+          </w:hyperlink>
+        </w:p>
+        <w:p>
+          <w:pPr>
+            <w:pStyle w:val="TOC1"/>
+            <w:tabs>
+              <w:tab w:val="left" w:pos="480"/>
+              <w:tab w:val="right" w:leader="dot" w:pos="9350"/>
+            </w:tabs>
+            <w:rPr>
+              <w:rFonts w:asciiTheme="minorHAnsi" w:eastAsiaTheme="minorEastAsia" w:hAnsiTheme="minorHAnsi" w:cstheme="minorBidi"/>
+              <w:noProof/>
+              <w:kern w:val="2"/>
+              <w:szCs w:val="24"/>
+              <w:lang w:val="en-CA" w:eastAsia="en-CA"/>
+              <w14:ligatures w14:val="standardContextual"/>
+            </w:rPr>
+          </w:pPr>
+          <w:hyperlink w:anchor="_Toc226371965" w:history="1">
+            <w:r>
+              <w:rPr>
+                <w:rStyle w:val="Hyperlink"/>
+                <w:smallCaps/>
+                <w:noProof/>
+              </w:rPr>
+              <w:t>4.</w:t>
+            </w:r>
+            <w:r>
+              <w:rPr>
+                <w:rFonts w:asciiTheme="minorHAnsi" w:eastAsiaTheme="minorEastAsia" w:hAnsiTheme="minorHAnsi" w:cstheme="minorBidi"/>
+                <w:noProof/>
+                <w:kern w:val="2"/>
+                <w:szCs w:val="24"/>
+                <w:lang w:val="en-CA" w:eastAsia="en-CA"/>
+                <w14:ligatures w14:val="standardContextual"/>
+              </w:rPr>
+              <w:tab/>
+            </w:r>
+            <w:r>
+              <w:rPr>
+                <w:rStyle w:val="Hyperlink"/>
+                <w:smallCaps/>
+                <w:noProof/>
+              </w:rPr>
+              <w:t>Strategic Alignment</w:t>
+            </w:r>
+            <w:r>
+              <w:rPr>
+                <w:noProof/>
+                <w:webHidden/>
+              </w:rPr>
+              <w:tab/>
+            </w:r>
+            <w:r>
+              <w:rPr>
+                <w:noProof/>
+                <w:webHidden/>
+              </w:rPr>
+              <w:fldChar w:fldCharType="begin"/>
+            </w:r>
+            <w:r>
+              <w:rPr>
+                <w:noProof/>
+                <w:webHidden/>
+              </w:rPr>
+              <w:instrText xml:space="preserve"> PAGEREF _Toc226371965 \h </w:instrText>
+            </w:r>
+            <w:r>
+              <w:rPr>
+                <w:noProof/>
+                <w:webHidden/>
+              </w:rPr>
+            </w:r>
+            <w:r>
+              <w:rPr>
+                <w:noProof/>
+                <w:webHidden/>
+              </w:rPr>
+              <w:fldChar w:fldCharType="separate"/>
+            </w:r>
+            <w:r>
+              <w:rPr>
+                <w:noProof/>
+                <w:webHidden/>
+              </w:rPr>
+              <w:t>5</w:t>
+            </w:r>
+            <w:r>
+              <w:rPr>
+                <w:noProof/>
+                <w:webHidden/>
+              </w:rPr>
+              <w:fldChar w:fldCharType="end"/>
+            </w:r>
+          </w:hyperlink>
+        </w:p>
+        <w:p>
+          <w:pPr>
+            <w:pStyle w:val="TOC1"/>
+            <w:tabs>
+              <w:tab w:val="left" w:pos="480"/>
+              <w:tab w:val="right" w:leader="dot" w:pos="9350"/>
+            </w:tabs>
+            <w:rPr>
+              <w:rFonts w:asciiTheme="minorHAnsi" w:eastAsiaTheme="minorEastAsia" w:hAnsiTheme="minorHAnsi" w:cstheme="minorBidi"/>
+              <w:noProof/>
+              <w:kern w:val="2"/>
+              <w:szCs w:val="24"/>
+              <w:lang w:val="en-CA" w:eastAsia="en-CA"/>
+              <w14:ligatures w14:val="standardContextual"/>
+            </w:rPr>
+          </w:pPr>
+          <w:hyperlink w:anchor="_Toc226371966" w:history="1">
+            <w:r>
+              <w:rPr>
+                <w:rStyle w:val="Hyperlink"/>
+                <w:smallCaps/>
+                <w:noProof/>
+              </w:rPr>
+              <w:t>5.</w:t>
+            </w:r>
+            <w:r>
+              <w:rPr>
+                <w:rFonts w:asciiTheme="minorHAnsi" w:eastAsiaTheme="minorEastAsia" w:hAnsiTheme="minorHAnsi" w:cstheme="minorBidi"/>
+                <w:noProof/>
+                <w:kern w:val="2"/>
+                <w:szCs w:val="24"/>
+                <w:lang w:val="en-CA" w:eastAsia="en-CA"/>
+                <w14:ligatures w14:val="standardContextual"/>
+              </w:rPr>
+              <w:tab/>
+            </w:r>
+            <w:r>
+              <w:rPr>
+                <w:rStyle w:val="Hyperlink"/>
+                <w:smallCaps/>
+                <w:noProof/>
+              </w:rPr>
+              <w:t>Cost Benefit Analysis / Alternatives Analysis</w:t>
+            </w:r>
+            <w:r>
+              <w:rPr>
+                <w:noProof/>
+                <w:webHidden/>
+              </w:rPr>
+              <w:tab/>
+            </w:r>
+            <w:r>
+              <w:rPr>
+                <w:noProof/>
+                <w:webHidden/>
+              </w:rPr>
+              <w:fldChar w:fldCharType="begin"/>
+            </w:r>
+            <w:r>
+              <w:rPr>
+                <w:noProof/>
+                <w:webHidden/>
+              </w:rPr>
+              <w:instrText xml:space="preserve"> PAGEREF _Toc226371966 \h </w:instrText>
+            </w:r>
+            <w:r>
+              <w:rPr>
+                <w:noProof/>
+                <w:webHidden/>
+              </w:rPr>
+            </w:r>
+            <w:r>
+              <w:rPr>
+                <w:noProof/>
+                <w:webHidden/>
+              </w:rPr>
+              <w:fldChar w:fldCharType="separate"/>
+            </w:r>
+            <w:r>
+              <w:rPr>
+                <w:noProof/>
+                <w:webHidden/>
+              </w:rPr>
+              <w:t>5</w:t>
+            </w:r>
+            <w:r>
+              <w:rPr>
+                <w:noProof/>
+                <w:webHidden/>
+              </w:rPr>
+              <w:fldChar w:fldCharType="end"/>
+            </w:r>
+          </w:hyperlink>
+        </w:p>
+        <w:p>
+          <w:r>
+            <w:rPr>
+              <w:b/>
+              <w:bCs/>
+              <w:noProof/>
+            </w:rPr>
+            <w:fldChar w:fldCharType="end"/>
+          </w:r>
+        </w:p>
+      </w:sdtContent>
+    </w:sdt>
     <w:p/>
     <w:p>
       <w:pPr>
@@ -1386,6 +1388,7 @@
         <w:br w:type="page"/>
       </w:r>
       <w:bookmarkStart w:id="0" w:name="_Toc224909757"/>
+      <w:bookmarkStart w:id="1" w:name="_Toc226371956"/>
       <w:r>
         <w:rPr>
           <w:rFonts w:asciiTheme="minorHAnsi" w:hAnsiTheme="minorHAnsi"/>
@@ -1397,18 +1400,18 @@
         <w:t>Executive Summary</w:t>
       </w:r>
       <w:bookmarkEnd w:id="0"/>
-    </w:p>
+      <w:bookmarkEnd w:id="1"/>
+    </w:p>
+    <w:p/>
     <w:p>
       <w:pPr>
         <w:ind w:left="360"/>
       </w:pPr>
-    </w:p>
-    <w:p>
-      <w:pPr>
-        <w:ind w:left="360"/>
-      </w:pPr>
-      <w:r>
-        <w:t xml:space="preserve">This business case outlines how the Data Warehouse (DW) project will transfer real-time stock information from a Data Collection team to an </w:t>
+      <w:r>
+        <w:t xml:space="preserve">This business case outlines the deployment of </w:t>
+      </w:r>
+      <w:r>
+        <w:t xml:space="preserve">Data Warehouse (DW) architecture designed to transfer real-time stock information from a Data Collection team to an </w:t>
       </w:r>
       <w:proofErr w:type="spellStart"/>
       <w:r>
@@ -1416,7 +1419,22 @@
       </w:r>
       <w:proofErr w:type="spellEnd"/>
       <w:r>
-        <w:t xml:space="preserve"> system, designed to predict future stock values. The business case also discusses project goals, performance statistics, assumptions, constraints, and alternative options.</w:t>
+        <w:t xml:space="preserve"> system</w:t>
+      </w:r>
+      <w:r>
+        <w:t xml:space="preserve">, designed to predict future stock values. The project delivers a fully automated, high-performance pipeline that ingests, validates, and </w:t>
+      </w:r>
+      <w:r>
+        <w:t xml:space="preserve">engineers financial features, replacing legacy hardware with scalable </w:t>
+      </w:r>
+      <w:r>
+        <w:t xml:space="preserve">supercomputing infrastructure available on the Digital Research Alliance of Canada </w:t>
+      </w:r>
+      <w:r>
+        <w:t xml:space="preserve">(DRAC) </w:t>
+      </w:r>
+      <w:r>
+        <w:t>cluster.</w:t>
       </w:r>
     </w:p>
     <w:p>
@@ -1438,7 +1456,8 @@
           <w:szCs w:val="24"/>
         </w:rPr>
       </w:pPr>
-      <w:bookmarkStart w:id="1" w:name="_Toc224909758"/>
+      <w:bookmarkStart w:id="2" w:name="_Toc224909758"/>
+      <w:bookmarkStart w:id="3" w:name="_Toc226371957"/>
       <w:r>
         <w:rPr>
           <w:rFonts w:asciiTheme="minorHAnsi" w:hAnsiTheme="minorHAnsi"/>
@@ -1447,7 +1466,8 @@
         </w:rPr>
         <w:t>Issue</w:t>
       </w:r>
-      <w:bookmarkEnd w:id="1"/>
+      <w:bookmarkEnd w:id="2"/>
+      <w:bookmarkEnd w:id="3"/>
     </w:p>
     <w:p>
       <w:pPr>
@@ -1462,7 +1482,19 @@
       </w:r>
       <w:proofErr w:type="spellEnd"/>
       <w:r>
-        <w:t xml:space="preserve"> project requires a remotely accessible data warehouse service, that ingests real-time market data from the Data Collection team’s system and creates features and formats the data to be used for training in a </w:t>
+        <w:t xml:space="preserve"> project requires a remotely accessible data warehouse service, that ingests real-time market data from the Data Collection team’s </w:t>
+      </w:r>
+      <w:r>
+        <w:t xml:space="preserve">database, </w:t>
+      </w:r>
+      <w:r>
+        <w:t>creates features</w:t>
+      </w:r>
+      <w:r>
+        <w:t>,</w:t>
+      </w:r>
+      <w:r>
+        <w:t xml:space="preserve"> and formats the data to be used for training in a </w:t>
       </w:r>
       <w:proofErr w:type="spellStart"/>
       <w:r>
@@ -1471,6 +1503,12 @@
       <w:proofErr w:type="spellEnd"/>
       <w:r>
         <w:t xml:space="preserve"> machine learning model. The data warehouse system must be hosted on a remote server, with high system security, to prevent historical data loss.</w:t>
+      </w:r>
+      <w:r>
+        <w:t xml:space="preserve"> Previous iterations relying on local college (Okanagan College, Kelowna) </w:t>
+      </w:r>
+      <w:r>
+        <w:t>lab environments presented severe bottlenecks regarding network reliability, storage limitations, and hardware-level risks.</w:t>
       </w:r>
     </w:p>
     <w:p>
@@ -1492,7 +1530,8 @@
           <w:szCs w:val="24"/>
         </w:rPr>
       </w:pPr>
-      <w:bookmarkStart w:id="2" w:name="_Toc224909759"/>
+      <w:bookmarkStart w:id="4" w:name="_Toc224909759"/>
+      <w:bookmarkStart w:id="5" w:name="_Toc226371958"/>
       <w:r>
         <w:rPr>
           <w:rFonts w:asciiTheme="minorHAnsi" w:hAnsiTheme="minorHAnsi"/>
@@ -1501,14 +1540,24 @@
         </w:rPr>
         <w:t>Anticipated Outcomes</w:t>
       </w:r>
-      <w:bookmarkEnd w:id="2"/>
+      <w:bookmarkEnd w:id="4"/>
+      <w:bookmarkEnd w:id="5"/>
     </w:p>
     <w:p>
       <w:pPr>
         <w:ind w:left="810"/>
       </w:pPr>
       <w:r>
-        <w:t xml:space="preserve">The project will deliver a centralized ingestion pipeline on an Oracle Linux 8 VM. The end state is a fully automated system that validates OHLCV (Open, High, Low, Close, Volume) data and stores it in a PostgreSQL 16 database. This provides the </w:t>
+        <w:t xml:space="preserve">The project will deliver a centralized, </w:t>
+      </w:r>
+      <w:r>
+        <w:t>timing-based ingestion pipeline natively hosted on the DRAC High-Performance Computing (HPC)</w:t>
+      </w:r>
+      <w:r>
+        <w:t xml:space="preserve"> cluster. The end state is a fully automated system that validates OHLCV (Open, High, Low, Close, Volume) data and stores it in a PostgreSQL 16 database. By executing transformations directly in user-space via </w:t>
+      </w:r>
+      <w:r>
+        <w:t xml:space="preserve">optimized SQL procedures, this architecture provides the </w:t>
       </w:r>
       <w:proofErr w:type="spellStart"/>
       <w:r>
@@ -1516,7 +1565,7 @@
       </w:r>
       <w:proofErr w:type="spellEnd"/>
       <w:r>
-        <w:t xml:space="preserve"> system with a "source of truth" for training models to predict future stock values.</w:t>
+        <w:t xml:space="preserve"> system with a “source of truth” for training models to predict future stock values.</w:t>
       </w:r>
     </w:p>
     <w:p/>
@@ -1534,7 +1583,8 @@
           <w:szCs w:val="24"/>
         </w:rPr>
       </w:pPr>
-      <w:bookmarkStart w:id="3" w:name="_Toc224909760"/>
+      <w:bookmarkStart w:id="6" w:name="_Toc224909760"/>
+      <w:bookmarkStart w:id="7" w:name="_Toc226371959"/>
       <w:r>
         <w:rPr>
           <w:rFonts w:asciiTheme="minorHAnsi" w:hAnsiTheme="minorHAnsi"/>
@@ -1543,7 +1593,8 @@
         </w:rPr>
         <w:t>Justification</w:t>
       </w:r>
-      <w:bookmarkEnd w:id="3"/>
+      <w:bookmarkEnd w:id="6"/>
+      <w:bookmarkEnd w:id="7"/>
     </w:p>
     <w:p>
       <w:pPr>
@@ -1558,21 +1609,57 @@
       </w:r>
       <w:proofErr w:type="gramEnd"/>
       <w:r>
-        <w:t xml:space="preserve"> isolation (Development, Test, and Production) and data integrity. By implementing </w:t>
-      </w:r>
-      <w:proofErr w:type="spellStart"/>
-      <w:r>
-        <w:t>pgBackRest</w:t>
-      </w:r>
-      <w:proofErr w:type="spellEnd"/>
-      <w:r>
-        <w:t xml:space="preserve"> and a Raspberry Pi off-site backup, the team mitigates the risk of total data loss in the school lab environment.</w:t>
+        <w:t xml:space="preserve"> isolation (Development, Test, and Production) and data integrity.</w:t>
+      </w:r>
+      <w:r>
+        <w:t xml:space="preserve"> By pivoting from local school hardware to the DRAC supercomputing infrastructure, the project </w:t>
+      </w:r>
+      <w:r>
+        <w:t xml:space="preserve">mitigates the risk of total data loss in the school lab environment. </w:t>
+      </w:r>
+      <w:r>
+        <w:t xml:space="preserve">Additionally, </w:t>
+      </w:r>
+      <w:r>
+        <w:t xml:space="preserve">the implementation of </w:t>
+      </w:r>
+      <w:r>
+        <w:t xml:space="preserve">a three-tier Data Engineering Quality Assurance (QA) testing suite mathematically guarantees the integrity of the data before it reaches the </w:t>
+      </w:r>
+      <w:r>
+        <w:t xml:space="preserve">downstream </w:t>
+      </w:r>
+      <w:r>
+        <w:t>predictive models</w:t>
+      </w:r>
+      <w:r>
+        <w:t>.</w:t>
       </w:r>
     </w:p>
     <w:p>
       <w:pPr>
         <w:ind w:left="720"/>
       </w:pPr>
+    </w:p>
+    <w:p>
+      <w:pPr>
+        <w:rPr>
+          <w:rFonts w:eastAsia="Times New Roman" w:cs="Times New Roman"/>
+          <w:b/>
+          <w:smallCaps/>
+          <w:sz w:val="28"/>
+          <w:szCs w:val="28"/>
+        </w:rPr>
+      </w:pPr>
+      <w:bookmarkStart w:id="8" w:name="_Toc224909761"/>
+      <w:r>
+        <w:rPr>
+          <w:smallCaps/>
+          <w:sz w:val="28"/>
+          <w:szCs w:val="28"/>
+        </w:rPr>
+        <w:br w:type="page"/>
+      </w:r>
     </w:p>
     <w:p>
       <w:pPr>
@@ -1589,7 +1676,7 @@
           <w:szCs w:val="28"/>
         </w:rPr>
       </w:pPr>
-      <w:bookmarkStart w:id="4" w:name="_Toc224909761"/>
+      <w:bookmarkStart w:id="9" w:name="_Toc226371960"/>
       <w:r>
         <w:rPr>
           <w:rFonts w:asciiTheme="minorHAnsi" w:hAnsiTheme="minorHAnsi"/>
@@ -1597,15 +1684,17 @@
           <w:sz w:val="28"/>
           <w:szCs w:val="28"/>
         </w:rPr>
+        <w:lastRenderedPageBreak/>
         <w:t>Business Case Analysis Team</w:t>
       </w:r>
-      <w:bookmarkEnd w:id="4"/>
+      <w:bookmarkEnd w:id="8"/>
+      <w:bookmarkEnd w:id="9"/>
     </w:p>
     <w:p>
       <w:pPr>
         <w:ind w:left="360"/>
       </w:pPr>
-      <w:bookmarkStart w:id="5" w:name="_Toc261333351"/>
+      <w:bookmarkStart w:id="10" w:name="_Toc261333351"/>
     </w:p>
     <w:p>
       <w:pPr>
@@ -2019,7 +2108,6 @@
               <w:rPr>
                 <w:rFonts w:asciiTheme="minorHAnsi" w:hAnsiTheme="minorHAnsi"/>
               </w:rPr>
-              <w:lastRenderedPageBreak/>
               <w:t>Programmer</w:t>
             </w:r>
           </w:p>
@@ -2065,7 +2153,7 @@
           </w:p>
         </w:tc>
       </w:tr>
-      <w:bookmarkEnd w:id="5"/>
+      <w:bookmarkEnd w:id="10"/>
     </w:tbl>
     <w:p/>
     <w:p>
@@ -2083,7 +2171,8 @@
           <w:szCs w:val="28"/>
         </w:rPr>
       </w:pPr>
-      <w:bookmarkStart w:id="6" w:name="_Toc224909762"/>
+      <w:bookmarkStart w:id="11" w:name="_Toc224909762"/>
+      <w:bookmarkStart w:id="12" w:name="_Toc226371961"/>
       <w:r>
         <w:rPr>
           <w:rFonts w:asciiTheme="minorHAnsi" w:hAnsiTheme="minorHAnsi"/>
@@ -2093,7 +2182,8 @@
         </w:rPr>
         <w:t>Project Overview</w:t>
       </w:r>
-      <w:bookmarkEnd w:id="6"/>
+      <w:bookmarkEnd w:id="11"/>
+      <w:bookmarkEnd w:id="12"/>
     </w:p>
     <w:p>
       <w:pPr>
@@ -2116,8 +2206,9 @@
           <w:szCs w:val="24"/>
         </w:rPr>
       </w:pPr>
-      <w:bookmarkStart w:id="7" w:name="_Toc261333355"/>
-      <w:bookmarkStart w:id="8" w:name="_Toc224909763"/>
+      <w:bookmarkStart w:id="13" w:name="_Toc261333355"/>
+      <w:bookmarkStart w:id="14" w:name="_Toc224909763"/>
+      <w:bookmarkStart w:id="15" w:name="_Toc226371962"/>
       <w:r>
         <w:rPr>
           <w:rFonts w:asciiTheme="minorHAnsi" w:hAnsiTheme="minorHAnsi"/>
@@ -2126,7 +2217,7 @@
         </w:rPr>
         <w:t xml:space="preserve">Project </w:t>
       </w:r>
-      <w:bookmarkEnd w:id="7"/>
+      <w:bookmarkEnd w:id="13"/>
       <w:r>
         <w:rPr>
           <w:rFonts w:asciiTheme="minorHAnsi" w:hAnsiTheme="minorHAnsi"/>
@@ -2135,7 +2226,8 @@
         </w:rPr>
         <w:t>Description</w:t>
       </w:r>
-      <w:bookmarkEnd w:id="8"/>
+      <w:bookmarkEnd w:id="14"/>
+      <w:bookmarkEnd w:id="15"/>
     </w:p>
     <w:p>
       <w:pPr>
@@ -2144,13 +2236,11 @@
       <w:r>
         <w:t xml:space="preserve">The project involves a </w:t>
       </w:r>
-      <w:proofErr w:type="spellStart"/>
-      <w:r>
-        <w:t>FastAPI</w:t>
-      </w:r>
-      <w:proofErr w:type="spellEnd"/>
-      <w:r>
-        <w:t>-based ingestion service that processes POST requests from the Data Collection team. It utilizes a PostgreSQL 16 backend with a Star Schema (Fact/Dimension tables) to organize financial data and economic proxies.</w:t>
+      <w:r>
+        <w:t xml:space="preserve">database-centric pipeline utilizing Bash scripting and native PostgreSQL 16 stored procedures. Operating directly within the user-space of the DRAC HPC cluster, the system executes high-performance SQL transformations to ingest, validate, and engineer market data. It organizes this data into a Star Schema (Fact/Dimension tables), providing an optimized, query-ready foundation of financial data </w:t>
+      </w:r>
+      <w:r>
+        <w:t>without the latency of intermediate API layers.</w:t>
       </w:r>
     </w:p>
     <w:p>
@@ -2172,7 +2262,8 @@
           <w:szCs w:val="24"/>
         </w:rPr>
       </w:pPr>
-      <w:bookmarkStart w:id="9" w:name="_Toc224909764"/>
+      <w:bookmarkStart w:id="16" w:name="_Toc224909764"/>
+      <w:bookmarkStart w:id="17" w:name="_Toc226371963"/>
       <w:r>
         <w:rPr>
           <w:rFonts w:asciiTheme="minorHAnsi" w:hAnsiTheme="minorHAnsi"/>
@@ -2181,7 +2272,8 @@
         </w:rPr>
         <w:t>Goals and Objectives</w:t>
       </w:r>
-      <w:bookmarkEnd w:id="9"/>
+      <w:bookmarkEnd w:id="16"/>
+      <w:bookmarkEnd w:id="17"/>
     </w:p>
     <w:p>
       <w:pPr>
@@ -2204,19 +2296,7 @@
         </w:numPr>
       </w:pPr>
       <w:r>
-        <w:t>Data Transformation: Transform raw data into pre-calculated features for ML queries.</w:t>
-      </w:r>
-    </w:p>
-    <w:p>
-      <w:pPr>
-        <w:pStyle w:val="ListParagraph"/>
-        <w:numPr>
-          <w:ilvl w:val="0"/>
-          <w:numId w:val="10"/>
-        </w:numPr>
-      </w:pPr>
-      <w:r>
-        <w:t>Resilience: Automate local and off-site backups with Point-In-Time Recovery (PITR).</w:t>
+        <w:t>Data Transformation: Transform raw data into calculated features for ML queries.</w:t>
       </w:r>
     </w:p>
     <w:p>
@@ -2256,7 +2336,8 @@
           <w:szCs w:val="24"/>
         </w:rPr>
       </w:pPr>
-      <w:bookmarkStart w:id="10" w:name="_Toc224909765"/>
+      <w:bookmarkStart w:id="18" w:name="_Toc224909765"/>
+      <w:bookmarkStart w:id="19" w:name="_Toc226371964"/>
       <w:r>
         <w:rPr>
           <w:rFonts w:asciiTheme="minorHAnsi" w:hAnsiTheme="minorHAnsi"/>
@@ -2265,7 +2346,8 @@
         </w:rPr>
         <w:t>Project Assumptions</w:t>
       </w:r>
-      <w:bookmarkEnd w:id="10"/>
+      <w:bookmarkEnd w:id="18"/>
+      <w:bookmarkEnd w:id="19"/>
     </w:p>
     <w:p>
       <w:pPr>
@@ -2298,15 +2380,17 @@
         </w:tabs>
       </w:pPr>
       <w:r>
-        <w:t xml:space="preserve">Training and Competency: All project staff and maintainers are assumed to be trained in their respective tasks, including data entry, </w:t>
-      </w:r>
-      <w:proofErr w:type="spellStart"/>
-      <w:r>
-        <w:t>FastAPI</w:t>
-      </w:r>
-      <w:proofErr w:type="spellEnd"/>
-      <w:r>
-        <w:t xml:space="preserve"> management, and PostgreSQL reporting.</w:t>
+        <w:rPr>
+          <w:b/>
+          <w:bCs/>
+        </w:rPr>
+        <w:t>Computer Availability:</w:t>
+      </w:r>
+      <w:r>
+        <w:t xml:space="preserve"> The project assumes consistent uptime and </w:t>
+      </w:r>
+      <w:r>
+        <w:t>job-scheduling availability within the DRAC HPC environment.</w:t>
       </w:r>
     </w:p>
     <w:p>
@@ -2321,7 +2405,15 @@
         </w:tabs>
       </w:pPr>
       <w:r>
-        <w:t>Funding Availability: It is assumed that necessary funding is secured for the procurement of required hardware (such as the Raspberry Pi 5 and 2TB storage) and any software licensing.</w:t>
+        <w:rPr>
+          <w:b/>
+          <w:bCs/>
+        </w:rPr>
+        <w:lastRenderedPageBreak/>
+        <w:t>Storage Quotas:</w:t>
+      </w:r>
+      <w:r>
+        <w:t xml:space="preserve"> It is assumed that the data warehouse will remain within the allocated user-space storage limits provided by the cluster, and that these academic quotas will not be unexpectedly reduced.</w:t>
       </w:r>
     </w:p>
     <w:p>
@@ -2336,7 +2428,17 @@
         </w:tabs>
       </w:pPr>
       <w:r>
-        <w:t>Infrastructure Support: Department heads and lab technicians will provide the necessary network and infrastructure support, particularly regarding VPN configurations and subnet adjustments.</w:t>
+        <w:rPr>
+          <w:b/>
+          <w:bCs/>
+        </w:rPr>
+        <w:t>Data Consistency:</w:t>
+      </w:r>
+      <w:r>
+        <w:t xml:space="preserve"> It is assumed</w:t>
+      </w:r>
+      <w:r>
+        <w:t xml:space="preserve"> that the Data Collection team will provide a consistent “source of truth” for OHLCV data that conforms to the expected schemas processed by the staging environment.</w:t>
       </w:r>
     </w:p>
     <w:p>
@@ -2351,7 +2453,17 @@
         </w:tabs>
       </w:pPr>
       <w:r>
-        <w:t>Executive Backing: The project operates under the assumption of continued executive-level support and approval from the project sponsors.</w:t>
+        <w:rPr>
+          <w:b/>
+          <w:bCs/>
+        </w:rPr>
+        <w:t>Training and Competency:</w:t>
+      </w:r>
+      <w:r>
+        <w:t xml:space="preserve"> All project staff and maintainers are assumed to be trained in their respective tasks, </w:t>
+      </w:r>
+      <w:r>
+        <w:t>particularly regarding PostgreSQL database administration, SQL optimization, and Bash scripting within an HPC environment.</w:t>
       </w:r>
     </w:p>
     <w:p>
@@ -2366,15 +2478,14 @@
         </w:tabs>
       </w:pPr>
       <w:r>
-        <w:t xml:space="preserve">Data Consistency: It is assumed that the Data Collection team will provide a consistent "source of truth" for OHLCV data that matches the validation logic within the </w:t>
-      </w:r>
-      <w:proofErr w:type="spellStart"/>
-      <w:r>
-        <w:t>FastAPI</w:t>
-      </w:r>
-      <w:proofErr w:type="spellEnd"/>
-      <w:r>
-        <w:t xml:space="preserve"> ingestion services.</w:t>
+        <w:rPr>
+          <w:b/>
+          <w:bCs/>
+        </w:rPr>
+        <w:t>Funding Availability:</w:t>
+      </w:r>
+      <w:r>
+        <w:t xml:space="preserve"> It is assumed that necessary funding is secured for the procurement of required hardware (such as the Raspberry Pi 5 and 2TB storage) and any software licensing.</w:t>
       </w:r>
     </w:p>
     <w:p>
@@ -2389,18 +2500,55 @@
         </w:tabs>
       </w:pPr>
       <w:r>
-        <w:t>Connectivity: The off-site backup strategy assumes a persistent and reliable OpenVPN connection between the Oracle Linux VM and the Raspberry Pi.</w:t>
-      </w:r>
-    </w:p>
-    <w:p>
-      <w:pPr>
-        <w:ind w:left="810"/>
-      </w:pPr>
-    </w:p>
-    <w:p>
-      <w:pPr>
-        <w:ind w:left="810"/>
-      </w:pPr>
+        <w:rPr>
+          <w:b/>
+          <w:bCs/>
+        </w:rPr>
+        <w:t>Infrastructure Support:</w:t>
+      </w:r>
+      <w:r>
+        <w:t xml:space="preserve"> </w:t>
+      </w:r>
+      <w:r>
+        <w:t>It is assumed that d</w:t>
+      </w:r>
+      <w:r>
+        <w:t>epartment heads and lab technicians will provide the necessary network and infrastructure support</w:t>
+      </w:r>
+      <w:r>
+        <w:t xml:space="preserve"> during development</w:t>
+      </w:r>
+      <w:r>
+        <w:t>.</w:t>
+      </w:r>
+    </w:p>
+    <w:p>
+      <w:pPr>
+        <w:pStyle w:val="ListParagraph"/>
+        <w:numPr>
+          <w:ilvl w:val="0"/>
+          <w:numId w:val="10"/>
+        </w:numPr>
+        <w:tabs>
+          <w:tab w:val="left" w:pos="90"/>
+        </w:tabs>
+      </w:pPr>
+      <w:r>
+        <w:rPr>
+          <w:b/>
+          <w:bCs/>
+        </w:rPr>
+        <w:t>Executive Backing:</w:t>
+      </w:r>
+      <w:r>
+        <w:t xml:space="preserve"> The project operates under the assumption of continued executive-level support and approval from the project sponsors</w:t>
+      </w:r>
+      <w:r>
+        <w:t xml:space="preserve"> and college faculty</w:t>
+      </w:r>
+      <w:r>
+        <w:t>.</w:t>
+      </w:r>
     </w:p>
     <w:p>
       <w:pPr>
@@ -2432,7 +2580,8 @@
           <w:szCs w:val="28"/>
         </w:rPr>
       </w:pPr>
-      <w:bookmarkStart w:id="11" w:name="_Toc224909766"/>
+      <w:bookmarkStart w:id="20" w:name="_Toc224909766"/>
+      <w:bookmarkStart w:id="21" w:name="_Toc226371965"/>
       <w:r>
         <w:rPr>
           <w:rFonts w:asciiTheme="minorHAnsi" w:hAnsiTheme="minorHAnsi"/>
@@ -2442,7 +2591,8 @@
         </w:rPr>
         <w:t>Strategic Alignment</w:t>
       </w:r>
-      <w:bookmarkEnd w:id="11"/>
+      <w:bookmarkEnd w:id="20"/>
+      <w:bookmarkEnd w:id="21"/>
     </w:p>
     <w:p>
       <w:pPr>
@@ -2574,7 +2724,39 @@
               <w:rPr>
                 <w:lang w:val="en-CA"/>
               </w:rPr>
-              <w:t>Separate prod, dev, and test databases ensure stability during updates.</w:t>
+              <w:t xml:space="preserve">Schema separation (staging, </w:t>
+            </w:r>
+            <w:proofErr w:type="spellStart"/>
+            <w:r>
+              <w:rPr>
+                <w:lang w:val="en-CA"/>
+              </w:rPr>
+              <w:t>dw</w:t>
+            </w:r>
+            <w:proofErr w:type="spellEnd"/>
+            <w:r>
+              <w:rPr>
+                <w:lang w:val="en-CA"/>
+              </w:rPr>
+              <w:t>, star, ml) and transactional</w:t>
+            </w:r>
+            <w:r>
+              <w:rPr>
+                <w:lang w:val="en-CA"/>
+              </w:rPr>
+              <w:t xml:space="preserve"> black-box</w:t>
+            </w:r>
+            <w:r>
+              <w:rPr>
+                <w:lang w:val="en-CA"/>
+              </w:rPr>
+              <w:t xml:space="preserve"> </w:t>
+            </w:r>
+            <w:r>
+              <w:rPr>
+                <w:lang w:val="en-CA"/>
+              </w:rPr>
+              <w:t>testing ensure that pipeline logic can be developed and tested without ever threatening the stability of the production database.</w:t>
             </w:r>
           </w:p>
         </w:tc>
@@ -2599,7 +2781,7 @@
               <w:rPr>
                 <w:rFonts w:asciiTheme="minorHAnsi" w:hAnsiTheme="minorHAnsi"/>
               </w:rPr>
-              <w:t>Automated Recovery</w:t>
+              <w:t>Enterprise Reliability &amp; Data Integrity</w:t>
             </w:r>
           </w:p>
         </w:tc>
@@ -2615,19 +2797,17 @@
                 <w:lang w:val="en-CA"/>
               </w:rPr>
             </w:pPr>
-            <w:proofErr w:type="spellStart"/>
             <w:r>
               <w:rPr>
                 <w:lang w:val="en-CA"/>
               </w:rPr>
-              <w:t>pgBackRest</w:t>
-            </w:r>
-            <w:proofErr w:type="spellEnd"/>
+              <w:t xml:space="preserve">By leveraging DRAC’s infrastructure, hardware failure risks are </w:t>
+            </w:r>
             <w:r>
               <w:rPr>
                 <w:lang w:val="en-CA"/>
               </w:rPr>
-              <w:t xml:space="preserve"> manages WAL archiving and daily incremental backups.</w:t>
+              <w:t>drastically reduced. Additionally, the automated QA test suite physically blocks mathematically impossible or orphaned data from ever entering the warehouse.</w:t>
             </w:r>
           </w:p>
         </w:tc>
@@ -2672,27 +2852,82 @@
               <w:rPr>
                 <w:lang w:val="en-CA"/>
               </w:rPr>
-              <w:t xml:space="preserve">The </w:t>
+              <w:t xml:space="preserve">Time-series features (rolling SMAs, price lags, overnight gaps) are engineered natively within PostgreSQL. The pipeline enforces </w:t>
+            </w:r>
+            <w:r>
+              <w:rPr>
+                <w:lang w:val="en-CA"/>
+              </w:rPr>
+              <w:t xml:space="preserve">strict data “warmup” rules, providing the </w:t>
             </w:r>
             <w:proofErr w:type="spellStart"/>
             <w:r>
               <w:rPr>
                 <w:lang w:val="en-CA"/>
               </w:rPr>
-              <w:t>fact_model_features</w:t>
+              <w:t>downstread</w:t>
             </w:r>
             <w:proofErr w:type="spellEnd"/>
             <w:r>
               <w:rPr>
                 <w:lang w:val="en-CA"/>
               </w:rPr>
-              <w:t xml:space="preserve"> table stores one-hot encoded temporal and sector data for immediate ML use</w:t>
+              <w:t xml:space="preserve"> </w:t>
+            </w:r>
+            <w:proofErr w:type="spellStart"/>
+            <w:r>
+              <w:rPr>
+                <w:lang w:val="en-CA"/>
+              </w:rPr>
+              <w:t>XGBoost</w:t>
+            </w:r>
+            <w:proofErr w:type="spellEnd"/>
+            <w:r>
+              <w:rPr>
+                <w:lang w:val="en-CA"/>
+              </w:rPr>
+              <w:t xml:space="preserve"> models with a formatted feature matrix without </w:t>
+            </w:r>
+            <w:proofErr w:type="gramStart"/>
+            <w:r>
+              <w:rPr>
+                <w:lang w:val="en-CA"/>
+              </w:rPr>
+              <w:t>null-poisoning</w:t>
+            </w:r>
+            <w:proofErr w:type="gramEnd"/>
+            <w:r>
+              <w:rPr>
+                <w:lang w:val="en-CA"/>
+              </w:rPr>
+              <w:t>.</w:t>
             </w:r>
           </w:p>
         </w:tc>
       </w:tr>
     </w:tbl>
     <w:p/>
+    <w:p>
+      <w:pPr>
+        <w:rPr>
+          <w:rFonts w:eastAsia="Times New Roman" w:cs="Times New Roman"/>
+          <w:b/>
+          <w:smallCaps/>
+          <w:sz w:val="28"/>
+          <w:szCs w:val="28"/>
+        </w:rPr>
+      </w:pPr>
+      <w:bookmarkStart w:id="22" w:name="_Toc224909767"/>
+      <w:bookmarkStart w:id="23" w:name="_Toc226371966"/>
+      <w:r>
+        <w:rPr>
+          <w:smallCaps/>
+          <w:sz w:val="28"/>
+          <w:szCs w:val="28"/>
+        </w:rPr>
+        <w:br w:type="page"/>
+      </w:r>
+    </w:p>
     <w:p>
       <w:pPr>
         <w:pStyle w:val="Heading1"/>
@@ -2708,7 +2943,6 @@
           <w:szCs w:val="28"/>
         </w:rPr>
       </w:pPr>
-      <w:bookmarkStart w:id="12" w:name="_Toc224909767"/>
       <w:r>
         <w:rPr>
           <w:rFonts w:asciiTheme="minorHAnsi" w:hAnsiTheme="minorHAnsi"/>
@@ -2716,6 +2950,7 @@
           <w:sz w:val="28"/>
           <w:szCs w:val="28"/>
         </w:rPr>
+        <w:lastRenderedPageBreak/>
         <w:t>Cost Benefit Analysis</w:t>
       </w:r>
       <w:r>
@@ -2727,7 +2962,8 @@
         </w:rPr>
         <w:t xml:space="preserve"> / Alternatives Analysis</w:t>
       </w:r>
-      <w:bookmarkEnd w:id="12"/>
+      <w:bookmarkEnd w:id="22"/>
+      <w:bookmarkEnd w:id="23"/>
     </w:p>
     <w:p>
       <w:pPr>
@@ -2738,7 +2974,16 @@
         </w:numPr>
       </w:pPr>
       <w:r>
-        <w:t xml:space="preserve">Status Quo: Doing nothing results in a high risk of data loss and lacks the structured formatting required for </w:t>
+        <w:t>Status Quo: Doing nothing results in a high risk of data loss</w:t>
+      </w:r>
+      <w:r>
+        <w:t xml:space="preserve">, relies on </w:t>
+      </w:r>
+      <w:r>
+        <w:t>local college lab networks,</w:t>
+      </w:r>
+      <w:r>
+        <w:t xml:space="preserve"> and lacks the structured formatting required for </w:t>
       </w:r>
       <w:proofErr w:type="spellStart"/>
       <w:r>
@@ -2748,11 +2993,6 @@
       <w:r>
         <w:t xml:space="preserve"> training.</w:t>
       </w:r>
-    </w:p>
-    <w:p>
-      <w:pPr>
-        <w:ind w:left="360"/>
-      </w:pPr>
     </w:p>
     <w:p>
       <w:pPr>
@@ -2763,12 +3003,63 @@
         </w:numPr>
       </w:pPr>
       <w:r>
-        <w:t>Internal Development: Selected because expertise exists in-house and allows for custom integration with the Raspberry Pi off-site storage solution.</w:t>
+        <w:t xml:space="preserve">Bare-Metal HPC Migration (Selected): </w:t>
+      </w:r>
+      <w:r>
+        <w:t xml:space="preserve">By migrating to the DRAC cluster, the project secured enterprise-grade compute power and storage. This eliminates physical hardware procurement and maintenance while providing </w:t>
+      </w:r>
+      <w:r>
+        <w:t>exceptional processing speed and industrial-grade data security.</w:t>
+      </w:r>
+    </w:p>
+    <w:p>
+      <w:pPr>
+        <w:pStyle w:val="ListParagraph"/>
+        <w:numPr>
+          <w:ilvl w:val="0"/>
+          <w:numId w:val="10"/>
+        </w:numPr>
+      </w:pPr>
+      <w:r>
+        <w:t>Commercial Cloud Deployment (Alternative</w:t>
+      </w:r>
+      <w:r>
+        <w:t>): Hosting the data warehouse on cloud computing was considered but ultimately rejected due to the prohibitive recurring monthly costs for resources.</w:t>
+      </w:r>
+    </w:p>
+    <w:p>
+      <w:pPr>
+        <w:pStyle w:val="ListParagraph"/>
+        <w:numPr>
+          <w:ilvl w:val="0"/>
+          <w:numId w:val="10"/>
+        </w:numPr>
+      </w:pPr>
+      <w:r>
+        <w:t>Loca</w:t>
+      </w:r>
+      <w:r>
+        <w:t>l</w:t>
+      </w:r>
+      <w:r>
+        <w:t xml:space="preserve"> Hardware Development (Alternative): </w:t>
+      </w:r>
+      <w:r>
+        <w:t>The original plan to build a custom off-site backup network utilizing Raspberry Pi hardware and OpenVPN tunnels was rejected due to the high single-points-of-failure</w:t>
+      </w:r>
+      <w:r>
+        <w:t xml:space="preserve"> and</w:t>
+      </w:r>
+      <w:r>
+        <w:t xml:space="preserve"> lab network latency</w:t>
+      </w:r>
+      <w:r>
+        <w:t>.</w:t>
       </w:r>
     </w:p>
     <w:sectPr>
-      <w:headerReference w:type="default" r:id="rId7"/>
-      <w:footerReference w:type="default" r:id="rId8"/>
+      <w:headerReference w:type="default" r:id="rId8"/>
+      <w:footerReference w:type="default" r:id="rId9"/>
       <w:pgSz w:w="12240" w:h="15840"/>
       <w:pgMar w:top="2601" w:right="1440" w:bottom="1440" w:left="1440" w:header="720" w:footer="720" w:gutter="0"/>
       <w:cols w:space="720"/>
@@ -2817,73 +3108,6 @@
         <w:pPr>
           <w:pStyle w:val="Footer"/>
         </w:pPr>
-        <w:r>
-          <w:rPr>
-            <w:noProof/>
-          </w:rPr>
-          <w:drawing>
-            <wp:anchor distT="0" distB="0" distL="114300" distR="114300" simplePos="0" relativeHeight="251660288" behindDoc="1" locked="0" layoutInCell="1" allowOverlap="1" wp14:anchorId="54C5CD0E" wp14:editId="01BED793">
-              <wp:simplePos x="0" y="0"/>
-              <wp:positionH relativeFrom="column">
-                <wp:posOffset>4218305</wp:posOffset>
-              </wp:positionH>
-              <wp:positionV relativeFrom="paragraph">
-                <wp:posOffset>-3000375</wp:posOffset>
-              </wp:positionV>
-              <wp:extent cx="2640194" cy="3829633"/>
-              <wp:effectExtent l="0" t="0" r="8255" b="0"/>
-              <wp:wrapNone/>
-              <wp:docPr id="2" name="Picture 2" descr="../Desktop/WorkFiles/Project%20Management%20Docs/Branding/PMD-Branding-1217-Logo-Icon-SingleColor-WaterMark.png"/>
-              <wp:cNvGraphicFramePr>
-                <a:graphicFrameLocks xmlns:a="http://schemas.openxmlformats.org/drawingml/2006/main" noChangeAspect="1"/>
-              </wp:cNvGraphicFramePr>
-              <a:graphic xmlns:a="http://schemas.openxmlformats.org/drawingml/2006/main">
-                <a:graphicData uri="http://schemas.openxmlformats.org/drawingml/2006/picture">
-                  <pic:pic xmlns:pic="http://schemas.openxmlformats.org/drawingml/2006/picture">
-                    <pic:nvPicPr>
-                      <pic:cNvPr id="0" name="Picture 1" descr="../Desktop/WorkFiles/Project%20Management%20Docs/Branding/PMD-Branding-1217-Logo-Icon-SingleColor-WaterMark.png"/>
-                      <pic:cNvPicPr>
-                        <a:picLocks noChangeAspect="1" noChangeArrowheads="1"/>
-                      </pic:cNvPicPr>
-                    </pic:nvPicPr>
-                    <pic:blipFill>
-                      <a:blip r:embed="rId1">
-                        <a:extLst>
-                          <a:ext uri="{28A0092B-C50C-407E-A947-70E740481C1C}">
-                            <a14:useLocalDpi xmlns:a14="http://schemas.microsoft.com/office/drawing/2010/main" val="0"/>
-                          </a:ext>
-                        </a:extLst>
-                      </a:blip>
-                      <a:srcRect/>
-                      <a:stretch>
-                        <a:fillRect/>
-                      </a:stretch>
-                    </pic:blipFill>
-                    <pic:spPr bwMode="auto">
-                      <a:xfrm>
-                        <a:off x="0" y="0"/>
-                        <a:ext cx="2640194" cy="3829633"/>
-                      </a:xfrm>
-                      <a:prstGeom prst="rect">
-                        <a:avLst/>
-                      </a:prstGeom>
-                      <a:noFill/>
-                      <a:ln>
-                        <a:noFill/>
-                      </a:ln>
-                    </pic:spPr>
-                  </pic:pic>
-                </a:graphicData>
-              </a:graphic>
-              <wp14:sizeRelH relativeFrom="page">
-                <wp14:pctWidth>0</wp14:pctWidth>
-              </wp14:sizeRelH>
-              <wp14:sizeRelV relativeFrom="page">
-                <wp14:pctHeight>0</wp14:pctHeight>
-              </wp14:sizeRelV>
-            </wp:anchor>
-          </w:drawing>
-        </w:r>
         <w:r>
           <w:fldChar w:fldCharType="begin"/>
         </w:r>
@@ -4860,6 +5084,7 @@
   <w:style w:type="character" w:default="1" w:styleId="DefaultParagraphFont">
     <w:name w:val="Default Paragraph Font"/>
     <w:uiPriority w:val="1"/>
+    <w:semiHidden/>
     <w:unhideWhenUsed/>
   </w:style>
   <w:style w:type="table" w:default="1" w:styleId="TableNormal">
@@ -5086,6 +5311,28 @@
       <w:szCs w:val="28"/>
       <w:lang w:val="en-CA"/>
       <w14:ligatures w14:val="standardContextual"/>
+    </w:rPr>
+  </w:style>
+  <w:style w:type="paragraph" w:styleId="TOCHeading">
+    <w:name w:val="TOC Heading"/>
+    <w:basedOn w:val="Heading1"/>
+    <w:next w:val="Normal"/>
+    <w:uiPriority w:val="39"/>
+    <w:unhideWhenUsed/>
+    <w:qFormat/>
+    <w:rsid w:val="004A1B37"/>
+    <w:pPr>
+      <w:keepLines/>
+      <w:spacing w:before="240" w:line="259" w:lineRule="auto"/>
+      <w:jc w:val="left"/>
+      <w:outlineLvl w:val="9"/>
+    </w:pPr>
+    <w:rPr>
+      <w:rFonts w:asciiTheme="majorHAnsi" w:eastAsiaTheme="majorEastAsia" w:hAnsiTheme="majorHAnsi" w:cstheme="majorBidi"/>
+      <w:b w:val="0"/>
+      <w:color w:val="2F5496" w:themeColor="accent1" w:themeShade="BF"/>
+      <w:sz w:val="32"/>
+      <w:szCs w:val="32"/>
     </w:rPr>
   </w:style>
 </w:styles>
@@ -5350,4 +5597,16 @@
     </a:ext>
   </a:extLst>
 </a:theme>
+</file>
+
+<file path=customXml/item1.xml><?xml version="1.0" encoding="utf-8"?>
+<b:Sources xmlns:b="http://schemas.openxmlformats.org/officeDocument/2006/bibliography" xmlns="http://schemas.openxmlformats.org/officeDocument/2006/bibliography" SelectedStyle="\APASixthEditionOfficeOnline.xsl" StyleName="APA" Version="6"/>
+</file>
+
+<file path=customXml/itemProps1.xml><?xml version="1.0" encoding="utf-8"?>
+<ds:datastoreItem xmlns:ds="http://schemas.openxmlformats.org/officeDocument/2006/customXml" ds:itemID="{000D37A2-F167-4355-9996-1F045E7C8CCF}">
+  <ds:schemaRefs>
+    <ds:schemaRef ds:uri="http://schemas.openxmlformats.org/officeDocument/2006/bibliography"/>
+  </ds:schemaRefs>
+</ds:datastoreItem>
 </file>
</xml_diff>